<commit_message>
Record GitHub repository status in report
</commit_message>
<xml_diff>
--- a/N24DCDT082_DT067_NguyenThanhTan_BaoCao.docx
+++ b/N24DCDT082_DT067_NguyenThanhTan_BaoCao.docx
@@ -849,7 +849,7 @@
         <w:keepNext w:val="0"/>
         <w:spacing w:before="0" w:after="320"/>
       </w:pPr>
-      <w:bookmarkStart w:id="0" w:name="_Toc244272833"/>
+      <w:bookmarkStart w:id="0" w:name="_Toc244290204"/>
       <w:r>
         <w:lastRenderedPageBreak/>
         <w:t>PHIẾU GIAO ĐỀ TÀI</w:t>
@@ -1262,7 +1262,7 @@
         <w:keepNext w:val="0"/>
         <w:spacing w:before="0" w:after="320"/>
       </w:pPr>
-      <w:bookmarkStart w:id="1" w:name="_Toc244272834"/>
+      <w:bookmarkStart w:id="1" w:name="_Toc244290205"/>
       <w:r>
         <w:lastRenderedPageBreak/>
         <w:t>PHIẾU CHẤM VÀ ĐỐI CHIẾU MINH CHỨNG</w:t>
@@ -1911,7 +1911,7 @@
         <w:pStyle w:val="Heading2"/>
         <w:pageBreakBefore/>
       </w:pPr>
-      <w:bookmarkStart w:id="2" w:name="_Toc244272835"/>
+      <w:bookmarkStart w:id="2" w:name="_Toc244290206"/>
       <w:r>
         <w:lastRenderedPageBreak/>
         <w:t>CÁCH ĐỐI CHIẾU RUBRIC</w:t>
@@ -2140,7 +2140,7 @@
         <w:keepNext w:val="0"/>
         <w:spacing w:before="0" w:after="320"/>
       </w:pPr>
-      <w:bookmarkStart w:id="3" w:name="_Toc244272836"/>
+      <w:bookmarkStart w:id="3" w:name="_Toc244290207"/>
       <w:r>
         <w:lastRenderedPageBreak/>
         <w:t>LỜI CAM ĐOAN</w:t>
@@ -2194,7 +2194,7 @@
         <w:keepNext w:val="0"/>
         <w:spacing w:before="0" w:after="320"/>
       </w:pPr>
-      <w:bookmarkStart w:id="4" w:name="_Toc244272837"/>
+      <w:bookmarkStart w:id="4" w:name="_Toc244290208"/>
       <w:r>
         <w:lastRenderedPageBreak/>
         <w:t>TÓM TẮT</w:t>
@@ -2282,7 +2282,7 @@
         </w:rPr>
         <w:fldChar w:fldCharType="separate"/>
       </w:r>
-      <w:hyperlink w:anchor="_Toc244272833" w:history="1">
+      <w:hyperlink w:anchor="_Toc244290204" w:history="1">
         <w:r>
           <w:rPr>
             <w:rStyle w:val="Hyperlink"/>
@@ -2309,7 +2309,7 @@
             <w:noProof/>
             <w:webHidden/>
           </w:rPr>
-          <w:instrText xml:space="preserve"> PAGEREF _Toc244272833 \h </w:instrText>
+          <w:instrText xml:space="preserve"> PAGEREF _Toc244290204 \h </w:instrText>
         </w:r>
         <w:r>
           <w:rPr>
@@ -2357,7 +2357,7 @@
           <w14:ligatures w14:val="standardContextual"/>
         </w:rPr>
       </w:pPr>
-      <w:hyperlink w:anchor="_Toc244272834" w:history="1">
+      <w:hyperlink w:anchor="_Toc244290205" w:history="1">
         <w:r>
           <w:rPr>
             <w:rStyle w:val="Hyperlink"/>
@@ -2384,7 +2384,7 @@
             <w:noProof/>
             <w:webHidden/>
           </w:rPr>
-          <w:instrText xml:space="preserve"> PAGEREF _Toc244272834 \h </w:instrText>
+          <w:instrText xml:space="preserve"> PAGEREF _Toc244290205 \h </w:instrText>
         </w:r>
         <w:r>
           <w:rPr>
@@ -2432,7 +2432,7 @@
           <w14:ligatures w14:val="standardContextual"/>
         </w:rPr>
       </w:pPr>
-      <w:hyperlink w:anchor="_Toc244272835" w:history="1">
+      <w:hyperlink w:anchor="_Toc244290206" w:history="1">
         <w:r>
           <w:rPr>
             <w:rStyle w:val="Hyperlink"/>
@@ -2459,7 +2459,7 @@
             <w:noProof/>
             <w:webHidden/>
           </w:rPr>
-          <w:instrText xml:space="preserve"> PAGEREF _Toc244272835 \h </w:instrText>
+          <w:instrText xml:space="preserve"> PAGEREF _Toc244290206 \h </w:instrText>
         </w:r>
         <w:r>
           <w:rPr>
@@ -2507,7 +2507,7 @@
           <w14:ligatures w14:val="standardContextual"/>
         </w:rPr>
       </w:pPr>
-      <w:hyperlink w:anchor="_Toc244272836" w:history="1">
+      <w:hyperlink w:anchor="_Toc244290207" w:history="1">
         <w:r>
           <w:rPr>
             <w:rStyle w:val="Hyperlink"/>
@@ -2534,7 +2534,7 @@
             <w:noProof/>
             <w:webHidden/>
           </w:rPr>
-          <w:instrText xml:space="preserve"> PAGEREF _Toc244272836 \h </w:instrText>
+          <w:instrText xml:space="preserve"> PAGEREF _Toc244290207 \h </w:instrText>
         </w:r>
         <w:r>
           <w:rPr>
@@ -2582,7 +2582,7 @@
           <w14:ligatures w14:val="standardContextual"/>
         </w:rPr>
       </w:pPr>
-      <w:hyperlink w:anchor="_Toc244272837" w:history="1">
+      <w:hyperlink w:anchor="_Toc244290208" w:history="1">
         <w:r>
           <w:rPr>
             <w:rStyle w:val="Hyperlink"/>
@@ -2609,7 +2609,7 @@
             <w:noProof/>
             <w:webHidden/>
           </w:rPr>
-          <w:instrText xml:space="preserve"> PAGEREF _Toc244272837 \h </w:instrText>
+          <w:instrText xml:space="preserve"> PAGEREF _Toc244290208 \h </w:instrText>
         </w:r>
         <w:r>
           <w:rPr>
@@ -2657,7 +2657,7 @@
           <w14:ligatures w14:val="standardContextual"/>
         </w:rPr>
       </w:pPr>
-      <w:hyperlink w:anchor="_Toc244272838" w:history="1">
+      <w:hyperlink w:anchor="_Toc244290209" w:history="1">
         <w:r>
           <w:rPr>
             <w:rStyle w:val="Hyperlink"/>
@@ -2684,7 +2684,7 @@
             <w:noProof/>
             <w:webHidden/>
           </w:rPr>
-          <w:instrText xml:space="preserve"> PAGEREF _Toc244272838 \h </w:instrText>
+          <w:instrText xml:space="preserve"> PAGEREF _Toc244290209 \h </w:instrText>
         </w:r>
         <w:r>
           <w:rPr>
@@ -2732,7 +2732,7 @@
           <w14:ligatures w14:val="standardContextual"/>
         </w:rPr>
       </w:pPr>
-      <w:hyperlink w:anchor="_Toc244272839" w:history="1">
+      <w:hyperlink w:anchor="_Toc244290210" w:history="1">
         <w:r>
           <w:rPr>
             <w:rStyle w:val="Hyperlink"/>
@@ -2759,7 +2759,7 @@
             <w:noProof/>
             <w:webHidden/>
           </w:rPr>
-          <w:instrText xml:space="preserve"> PAGEREF _Toc244272839 \h </w:instrText>
+          <w:instrText xml:space="preserve"> PAGEREF _Toc244290210 \h </w:instrText>
         </w:r>
         <w:r>
           <w:rPr>
@@ -2807,7 +2807,7 @@
           <w14:ligatures w14:val="standardContextual"/>
         </w:rPr>
       </w:pPr>
-      <w:hyperlink w:anchor="_Toc244272840" w:history="1">
+      <w:hyperlink w:anchor="_Toc244290211" w:history="1">
         <w:r>
           <w:rPr>
             <w:rStyle w:val="Hyperlink"/>
@@ -2834,7 +2834,7 @@
             <w:noProof/>
             <w:webHidden/>
           </w:rPr>
-          <w:instrText xml:space="preserve"> PAGEREF _Toc244272840 \h </w:instrText>
+          <w:instrText xml:space="preserve"> PAGEREF _Toc244290211 \h </w:instrText>
         </w:r>
         <w:r>
           <w:rPr>
@@ -2882,7 +2882,7 @@
           <w14:ligatures w14:val="standardContextual"/>
         </w:rPr>
       </w:pPr>
-      <w:hyperlink w:anchor="_Toc244272841" w:history="1">
+      <w:hyperlink w:anchor="_Toc244290212" w:history="1">
         <w:r>
           <w:rPr>
             <w:rStyle w:val="Hyperlink"/>
@@ -2909,7 +2909,7 @@
             <w:noProof/>
             <w:webHidden/>
           </w:rPr>
-          <w:instrText xml:space="preserve"> PAGEREF _Toc244272841 \h </w:instrText>
+          <w:instrText xml:space="preserve"> PAGEREF _Toc244290212 \h </w:instrText>
         </w:r>
         <w:r>
           <w:rPr>
@@ -2957,7 +2957,7 @@
           <w14:ligatures w14:val="standardContextual"/>
         </w:rPr>
       </w:pPr>
-      <w:hyperlink w:anchor="_Toc244272842" w:history="1">
+      <w:hyperlink w:anchor="_Toc244290213" w:history="1">
         <w:r>
           <w:rPr>
             <w:rStyle w:val="Hyperlink"/>
@@ -2984,7 +2984,7 @@
             <w:noProof/>
             <w:webHidden/>
           </w:rPr>
-          <w:instrText xml:space="preserve"> PAGEREF _Toc244272842 \h </w:instrText>
+          <w:instrText xml:space="preserve"> PAGEREF _Toc244290213 \h </w:instrText>
         </w:r>
         <w:r>
           <w:rPr>
@@ -3032,7 +3032,7 @@
           <w14:ligatures w14:val="standardContextual"/>
         </w:rPr>
       </w:pPr>
-      <w:hyperlink w:anchor="_Toc244272843" w:history="1">
+      <w:hyperlink w:anchor="_Toc244290214" w:history="1">
         <w:r>
           <w:rPr>
             <w:rStyle w:val="Hyperlink"/>
@@ -3059,7 +3059,7 @@
             <w:noProof/>
             <w:webHidden/>
           </w:rPr>
-          <w:instrText xml:space="preserve"> PAGEREF _Toc244272843 \h </w:instrText>
+          <w:instrText xml:space="preserve"> PAGEREF _Toc244290214 \h </w:instrText>
         </w:r>
         <w:r>
           <w:rPr>
@@ -3107,7 +3107,7 @@
           <w14:ligatures w14:val="standardContextual"/>
         </w:rPr>
       </w:pPr>
-      <w:hyperlink w:anchor="_Toc244272844" w:history="1">
+      <w:hyperlink w:anchor="_Toc244290215" w:history="1">
         <w:r>
           <w:rPr>
             <w:rStyle w:val="Hyperlink"/>
@@ -3134,7 +3134,7 @@
             <w:noProof/>
             <w:webHidden/>
           </w:rPr>
-          <w:instrText xml:space="preserve"> PAGEREF _Toc244272844 \h </w:instrText>
+          <w:instrText xml:space="preserve"> PAGEREF _Toc244290215 \h </w:instrText>
         </w:r>
         <w:r>
           <w:rPr>
@@ -3182,7 +3182,7 @@
           <w14:ligatures w14:val="standardContextual"/>
         </w:rPr>
       </w:pPr>
-      <w:hyperlink w:anchor="_Toc244272845" w:history="1">
+      <w:hyperlink w:anchor="_Toc244290216" w:history="1">
         <w:r>
           <w:rPr>
             <w:rStyle w:val="Hyperlink"/>
@@ -3209,7 +3209,7 @@
             <w:noProof/>
             <w:webHidden/>
           </w:rPr>
-          <w:instrText xml:space="preserve"> PAGEREF _Toc244272845 \h </w:instrText>
+          <w:instrText xml:space="preserve"> PAGEREF _Toc244290216 \h </w:instrText>
         </w:r>
         <w:r>
           <w:rPr>
@@ -3257,7 +3257,7 @@
           <w14:ligatures w14:val="standardContextual"/>
         </w:rPr>
       </w:pPr>
-      <w:hyperlink w:anchor="_Toc244272846" w:history="1">
+      <w:hyperlink w:anchor="_Toc244290217" w:history="1">
         <w:r>
           <w:rPr>
             <w:rStyle w:val="Hyperlink"/>
@@ -3284,7 +3284,7 @@
             <w:noProof/>
             <w:webHidden/>
           </w:rPr>
-          <w:instrText xml:space="preserve"> PAGEREF _Toc244272846 \h </w:instrText>
+          <w:instrText xml:space="preserve"> PAGEREF _Toc244290217 \h </w:instrText>
         </w:r>
         <w:r>
           <w:rPr>
@@ -3332,7 +3332,7 @@
           <w14:ligatures w14:val="standardContextual"/>
         </w:rPr>
       </w:pPr>
-      <w:hyperlink w:anchor="_Toc244272847" w:history="1">
+      <w:hyperlink w:anchor="_Toc244290218" w:history="1">
         <w:r>
           <w:rPr>
             <w:rStyle w:val="Hyperlink"/>
@@ -3359,7 +3359,7 @@
             <w:noProof/>
             <w:webHidden/>
           </w:rPr>
-          <w:instrText xml:space="preserve"> PAGEREF _Toc244272847 \h </w:instrText>
+          <w:instrText xml:space="preserve"> PAGEREF _Toc244290218 \h </w:instrText>
         </w:r>
         <w:r>
           <w:rPr>
@@ -3407,7 +3407,7 @@
           <w14:ligatures w14:val="standardContextual"/>
         </w:rPr>
       </w:pPr>
-      <w:hyperlink w:anchor="_Toc244272848" w:history="1">
+      <w:hyperlink w:anchor="_Toc244290219" w:history="1">
         <w:r>
           <w:rPr>
             <w:rStyle w:val="Hyperlink"/>
@@ -3434,7 +3434,7 @@
             <w:noProof/>
             <w:webHidden/>
           </w:rPr>
-          <w:instrText xml:space="preserve"> PAGEREF _Toc244272848 \h </w:instrText>
+          <w:instrText xml:space="preserve"> PAGEREF _Toc244290219 \h </w:instrText>
         </w:r>
         <w:r>
           <w:rPr>
@@ -3482,7 +3482,7 @@
           <w14:ligatures w14:val="standardContextual"/>
         </w:rPr>
       </w:pPr>
-      <w:hyperlink w:anchor="_Toc244272849" w:history="1">
+      <w:hyperlink w:anchor="_Toc244290220" w:history="1">
         <w:r>
           <w:rPr>
             <w:rStyle w:val="Hyperlink"/>
@@ -3509,7 +3509,7 @@
             <w:noProof/>
             <w:webHidden/>
           </w:rPr>
-          <w:instrText xml:space="preserve"> PAGEREF _Toc244272849 \h </w:instrText>
+          <w:instrText xml:space="preserve"> PAGEREF _Toc244290220 \h </w:instrText>
         </w:r>
         <w:r>
           <w:rPr>
@@ -3557,7 +3557,7 @@
           <w14:ligatures w14:val="standardContextual"/>
         </w:rPr>
       </w:pPr>
-      <w:hyperlink w:anchor="_Toc244272850" w:history="1">
+      <w:hyperlink w:anchor="_Toc244290221" w:history="1">
         <w:r>
           <w:rPr>
             <w:rStyle w:val="Hyperlink"/>
@@ -3584,7 +3584,7 @@
             <w:noProof/>
             <w:webHidden/>
           </w:rPr>
-          <w:instrText xml:space="preserve"> PAGEREF _Toc244272850 \h </w:instrText>
+          <w:instrText xml:space="preserve"> PAGEREF _Toc244290221 \h </w:instrText>
         </w:r>
         <w:r>
           <w:rPr>
@@ -3632,7 +3632,7 @@
           <w14:ligatures w14:val="standardContextual"/>
         </w:rPr>
       </w:pPr>
-      <w:hyperlink w:anchor="_Toc244272851" w:history="1">
+      <w:hyperlink w:anchor="_Toc244290222" w:history="1">
         <w:r>
           <w:rPr>
             <w:rStyle w:val="Hyperlink"/>
@@ -3659,7 +3659,7 @@
             <w:noProof/>
             <w:webHidden/>
           </w:rPr>
-          <w:instrText xml:space="preserve"> PAGEREF _Toc244272851 \h </w:instrText>
+          <w:instrText xml:space="preserve"> PAGEREF _Toc244290222 \h </w:instrText>
         </w:r>
         <w:r>
           <w:rPr>
@@ -3707,7 +3707,7 @@
           <w14:ligatures w14:val="standardContextual"/>
         </w:rPr>
       </w:pPr>
-      <w:hyperlink w:anchor="_Toc244272852" w:history="1">
+      <w:hyperlink w:anchor="_Toc244290223" w:history="1">
         <w:r>
           <w:rPr>
             <w:rStyle w:val="Hyperlink"/>
@@ -3734,7 +3734,7 @@
             <w:noProof/>
             <w:webHidden/>
           </w:rPr>
-          <w:instrText xml:space="preserve"> PAGEREF _Toc244272852 \h </w:instrText>
+          <w:instrText xml:space="preserve"> PAGEREF _Toc244290223 \h </w:instrText>
         </w:r>
         <w:r>
           <w:rPr>
@@ -3782,7 +3782,7 @@
           <w14:ligatures w14:val="standardContextual"/>
         </w:rPr>
       </w:pPr>
-      <w:hyperlink w:anchor="_Toc244272853" w:history="1">
+      <w:hyperlink w:anchor="_Toc244290224" w:history="1">
         <w:r>
           <w:rPr>
             <w:rStyle w:val="Hyperlink"/>
@@ -3809,7 +3809,7 @@
             <w:noProof/>
             <w:webHidden/>
           </w:rPr>
-          <w:instrText xml:space="preserve"> PAGEREF _Toc244272853 \h </w:instrText>
+          <w:instrText xml:space="preserve"> PAGEREF _Toc244290224 \h </w:instrText>
         </w:r>
         <w:r>
           <w:rPr>
@@ -3857,7 +3857,7 @@
           <w14:ligatures w14:val="standardContextual"/>
         </w:rPr>
       </w:pPr>
-      <w:hyperlink w:anchor="_Toc244272854" w:history="1">
+      <w:hyperlink w:anchor="_Toc244290225" w:history="1">
         <w:r>
           <w:rPr>
             <w:rStyle w:val="Hyperlink"/>
@@ -3884,7 +3884,7 @@
             <w:noProof/>
             <w:webHidden/>
           </w:rPr>
-          <w:instrText xml:space="preserve"> PAGEREF _Toc244272854 \h </w:instrText>
+          <w:instrText xml:space="preserve"> PAGEREF _Toc244290225 \h </w:instrText>
         </w:r>
         <w:r>
           <w:rPr>
@@ -3932,7 +3932,7 @@
           <w14:ligatures w14:val="standardContextual"/>
         </w:rPr>
       </w:pPr>
-      <w:hyperlink w:anchor="_Toc244272855" w:history="1">
+      <w:hyperlink w:anchor="_Toc244290226" w:history="1">
         <w:r>
           <w:rPr>
             <w:rStyle w:val="Hyperlink"/>
@@ -3959,7 +3959,7 @@
             <w:noProof/>
             <w:webHidden/>
           </w:rPr>
-          <w:instrText xml:space="preserve"> PAGEREF _Toc244272855 \h </w:instrText>
+          <w:instrText xml:space="preserve"> PAGEREF _Toc244290226 \h </w:instrText>
         </w:r>
         <w:r>
           <w:rPr>
@@ -4007,7 +4007,7 @@
           <w14:ligatures w14:val="standardContextual"/>
         </w:rPr>
       </w:pPr>
-      <w:hyperlink w:anchor="_Toc244272856" w:history="1">
+      <w:hyperlink w:anchor="_Toc244290227" w:history="1">
         <w:r>
           <w:rPr>
             <w:rStyle w:val="Hyperlink"/>
@@ -4034,7 +4034,7 @@
             <w:noProof/>
             <w:webHidden/>
           </w:rPr>
-          <w:instrText xml:space="preserve"> PAGEREF _Toc244272856 \h </w:instrText>
+          <w:instrText xml:space="preserve"> PAGEREF _Toc244290227 \h </w:instrText>
         </w:r>
         <w:r>
           <w:rPr>
@@ -4082,7 +4082,7 @@
           <w14:ligatures w14:val="standardContextual"/>
         </w:rPr>
       </w:pPr>
-      <w:hyperlink w:anchor="_Toc244272857" w:history="1">
+      <w:hyperlink w:anchor="_Toc244290228" w:history="1">
         <w:r>
           <w:rPr>
             <w:rStyle w:val="Hyperlink"/>
@@ -4109,7 +4109,7 @@
             <w:noProof/>
             <w:webHidden/>
           </w:rPr>
-          <w:instrText xml:space="preserve"> PAGEREF _Toc244272857 \h </w:instrText>
+          <w:instrText xml:space="preserve"> PAGEREF _Toc244290228 \h </w:instrText>
         </w:r>
         <w:r>
           <w:rPr>
@@ -4157,7 +4157,7 @@
           <w14:ligatures w14:val="standardContextual"/>
         </w:rPr>
       </w:pPr>
-      <w:hyperlink w:anchor="_Toc244272858" w:history="1">
+      <w:hyperlink w:anchor="_Toc244290229" w:history="1">
         <w:r>
           <w:rPr>
             <w:rStyle w:val="Hyperlink"/>
@@ -4184,7 +4184,7 @@
             <w:noProof/>
             <w:webHidden/>
           </w:rPr>
-          <w:instrText xml:space="preserve"> PAGEREF _Toc244272858 \h </w:instrText>
+          <w:instrText xml:space="preserve"> PAGEREF _Toc244290229 \h </w:instrText>
         </w:r>
         <w:r>
           <w:rPr>
@@ -4232,7 +4232,7 @@
           <w14:ligatures w14:val="standardContextual"/>
         </w:rPr>
       </w:pPr>
-      <w:hyperlink w:anchor="_Toc244272859" w:history="1">
+      <w:hyperlink w:anchor="_Toc244290230" w:history="1">
         <w:r>
           <w:rPr>
             <w:rStyle w:val="Hyperlink"/>
@@ -4259,7 +4259,7 @@
             <w:noProof/>
             <w:webHidden/>
           </w:rPr>
-          <w:instrText xml:space="preserve"> PAGEREF _Toc244272859 \h </w:instrText>
+          <w:instrText xml:space="preserve"> PAGEREF _Toc244290230 \h </w:instrText>
         </w:r>
         <w:r>
           <w:rPr>
@@ -4307,7 +4307,7 @@
           <w14:ligatures w14:val="standardContextual"/>
         </w:rPr>
       </w:pPr>
-      <w:hyperlink w:anchor="_Toc244272860" w:history="1">
+      <w:hyperlink w:anchor="_Toc244290231" w:history="1">
         <w:r>
           <w:rPr>
             <w:rStyle w:val="Hyperlink"/>
@@ -4334,7 +4334,7 @@
             <w:noProof/>
             <w:webHidden/>
           </w:rPr>
-          <w:instrText xml:space="preserve"> PAGEREF _Toc244272860 \h </w:instrText>
+          <w:instrText xml:space="preserve"> PAGEREF _Toc244290231 \h </w:instrText>
         </w:r>
         <w:r>
           <w:rPr>
@@ -4382,7 +4382,7 @@
           <w14:ligatures w14:val="standardContextual"/>
         </w:rPr>
       </w:pPr>
-      <w:hyperlink w:anchor="_Toc244272861" w:history="1">
+      <w:hyperlink w:anchor="_Toc244290232" w:history="1">
         <w:r>
           <w:rPr>
             <w:rStyle w:val="Hyperlink"/>
@@ -4409,7 +4409,7 @@
             <w:noProof/>
             <w:webHidden/>
           </w:rPr>
-          <w:instrText xml:space="preserve"> PAGEREF _Toc244272861 \h </w:instrText>
+          <w:instrText xml:space="preserve"> PAGEREF _Toc244290232 \h </w:instrText>
         </w:r>
         <w:r>
           <w:rPr>
@@ -4457,7 +4457,7 @@
           <w14:ligatures w14:val="standardContextual"/>
         </w:rPr>
       </w:pPr>
-      <w:hyperlink w:anchor="_Toc244272862" w:history="1">
+      <w:hyperlink w:anchor="_Toc244290233" w:history="1">
         <w:r>
           <w:rPr>
             <w:rStyle w:val="Hyperlink"/>
@@ -4484,7 +4484,7 @@
             <w:noProof/>
             <w:webHidden/>
           </w:rPr>
-          <w:instrText xml:space="preserve"> PAGEREF _Toc244272862 \h </w:instrText>
+          <w:instrText xml:space="preserve"> PAGEREF _Toc244290233 \h </w:instrText>
         </w:r>
         <w:r>
           <w:rPr>
@@ -4532,7 +4532,7 @@
           <w14:ligatures w14:val="standardContextual"/>
         </w:rPr>
       </w:pPr>
-      <w:hyperlink w:anchor="_Toc244272863" w:history="1">
+      <w:hyperlink w:anchor="_Toc244290234" w:history="1">
         <w:r>
           <w:rPr>
             <w:rStyle w:val="Hyperlink"/>
@@ -4559,7 +4559,7 @@
             <w:noProof/>
             <w:webHidden/>
           </w:rPr>
-          <w:instrText xml:space="preserve"> PAGEREF _Toc244272863 \h </w:instrText>
+          <w:instrText xml:space="preserve"> PAGEREF _Toc244290234 \h </w:instrText>
         </w:r>
         <w:r>
           <w:rPr>
@@ -4607,7 +4607,7 @@
           <w14:ligatures w14:val="standardContextual"/>
         </w:rPr>
       </w:pPr>
-      <w:hyperlink w:anchor="_Toc244272864" w:history="1">
+      <w:hyperlink w:anchor="_Toc244290235" w:history="1">
         <w:r>
           <w:rPr>
             <w:rStyle w:val="Hyperlink"/>
@@ -4634,7 +4634,7 @@
             <w:noProof/>
             <w:webHidden/>
           </w:rPr>
-          <w:instrText xml:space="preserve"> PAGEREF _Toc244272864 \h </w:instrText>
+          <w:instrText xml:space="preserve"> PAGEREF _Toc244290235 \h </w:instrText>
         </w:r>
         <w:r>
           <w:rPr>
@@ -4682,7 +4682,7 @@
           <w14:ligatures w14:val="standardContextual"/>
         </w:rPr>
       </w:pPr>
-      <w:hyperlink w:anchor="_Toc244272865" w:history="1">
+      <w:hyperlink w:anchor="_Toc244290236" w:history="1">
         <w:r>
           <w:rPr>
             <w:rStyle w:val="Hyperlink"/>
@@ -4709,7 +4709,7 @@
             <w:noProof/>
             <w:webHidden/>
           </w:rPr>
-          <w:instrText xml:space="preserve"> PAGEREF _Toc244272865 \h </w:instrText>
+          <w:instrText xml:space="preserve"> PAGEREF _Toc244290236 \h </w:instrText>
         </w:r>
         <w:r>
           <w:rPr>
@@ -4729,7 +4729,7 @@
             <w:noProof/>
             <w:webHidden/>
           </w:rPr>
-          <w:t>25</w:t>
+          <w:t>26</w:t>
         </w:r>
         <w:r>
           <w:rPr>
@@ -4757,7 +4757,7 @@
           <w14:ligatures w14:val="standardContextual"/>
         </w:rPr>
       </w:pPr>
-      <w:hyperlink w:anchor="_Toc244272866" w:history="1">
+      <w:hyperlink w:anchor="_Toc244290237" w:history="1">
         <w:r>
           <w:rPr>
             <w:rStyle w:val="Hyperlink"/>
@@ -4784,7 +4784,7 @@
             <w:noProof/>
             <w:webHidden/>
           </w:rPr>
-          <w:instrText xml:space="preserve"> PAGEREF _Toc244272866 \h </w:instrText>
+          <w:instrText xml:space="preserve"> PAGEREF _Toc244290237 \h </w:instrText>
         </w:r>
         <w:r>
           <w:rPr>
@@ -4804,7 +4804,7 @@
             <w:noProof/>
             <w:webHidden/>
           </w:rPr>
-          <w:t>25</w:t>
+          <w:t>26</w:t>
         </w:r>
         <w:r>
           <w:rPr>
@@ -4832,7 +4832,7 @@
           <w14:ligatures w14:val="standardContextual"/>
         </w:rPr>
       </w:pPr>
-      <w:hyperlink w:anchor="_Toc244272867" w:history="1">
+      <w:hyperlink w:anchor="_Toc244290238" w:history="1">
         <w:r>
           <w:rPr>
             <w:rStyle w:val="Hyperlink"/>
@@ -4859,7 +4859,7 @@
             <w:noProof/>
             <w:webHidden/>
           </w:rPr>
-          <w:instrText xml:space="preserve"> PAGEREF _Toc244272867 \h </w:instrText>
+          <w:instrText xml:space="preserve"> PAGEREF _Toc244290238 \h </w:instrText>
         </w:r>
         <w:r>
           <w:rPr>
@@ -4879,7 +4879,7 @@
             <w:noProof/>
             <w:webHidden/>
           </w:rPr>
-          <w:t>25</w:t>
+          <w:t>26</w:t>
         </w:r>
         <w:r>
           <w:rPr>
@@ -4907,7 +4907,7 @@
           <w14:ligatures w14:val="standardContextual"/>
         </w:rPr>
       </w:pPr>
-      <w:hyperlink w:anchor="_Toc244272868" w:history="1">
+      <w:hyperlink w:anchor="_Toc244290239" w:history="1">
         <w:r>
           <w:rPr>
             <w:rStyle w:val="Hyperlink"/>
@@ -4934,7 +4934,7 @@
             <w:noProof/>
             <w:webHidden/>
           </w:rPr>
-          <w:instrText xml:space="preserve"> PAGEREF _Toc244272868 \h </w:instrText>
+          <w:instrText xml:space="preserve"> PAGEREF _Toc244290239 \h </w:instrText>
         </w:r>
         <w:r>
           <w:rPr>
@@ -4954,7 +4954,7 @@
             <w:noProof/>
             <w:webHidden/>
           </w:rPr>
-          <w:t>25</w:t>
+          <w:t>26</w:t>
         </w:r>
         <w:r>
           <w:rPr>
@@ -4982,7 +4982,7 @@
           <w14:ligatures w14:val="standardContextual"/>
         </w:rPr>
       </w:pPr>
-      <w:hyperlink w:anchor="_Toc244272869" w:history="1">
+      <w:hyperlink w:anchor="_Toc244290240" w:history="1">
         <w:r>
           <w:rPr>
             <w:rStyle w:val="Hyperlink"/>
@@ -5009,7 +5009,7 @@
             <w:noProof/>
             <w:webHidden/>
           </w:rPr>
-          <w:instrText xml:space="preserve"> PAGEREF _Toc244272869 \h </w:instrText>
+          <w:instrText xml:space="preserve"> PAGEREF _Toc244290240 \h </w:instrText>
         </w:r>
         <w:r>
           <w:rPr>
@@ -5029,7 +5029,7 @@
             <w:noProof/>
             <w:webHidden/>
           </w:rPr>
-          <w:t>27</w:t>
+          <w:t>28</w:t>
         </w:r>
         <w:r>
           <w:rPr>
@@ -5057,7 +5057,7 @@
           <w14:ligatures w14:val="standardContextual"/>
         </w:rPr>
       </w:pPr>
-      <w:hyperlink w:anchor="_Toc244272870" w:history="1">
+      <w:hyperlink w:anchor="_Toc244290241" w:history="1">
         <w:r>
           <w:rPr>
             <w:rStyle w:val="Hyperlink"/>
@@ -5084,7 +5084,7 @@
             <w:noProof/>
             <w:webHidden/>
           </w:rPr>
-          <w:instrText xml:space="preserve"> PAGEREF _Toc244272870 \h </w:instrText>
+          <w:instrText xml:space="preserve"> PAGEREF _Toc244290241 \h </w:instrText>
         </w:r>
         <w:r>
           <w:rPr>
@@ -5132,7 +5132,7 @@
           <w14:ligatures w14:val="standardContextual"/>
         </w:rPr>
       </w:pPr>
-      <w:hyperlink w:anchor="_Toc244272871" w:history="1">
+      <w:hyperlink w:anchor="_Toc244290242" w:history="1">
         <w:r>
           <w:rPr>
             <w:rStyle w:val="Hyperlink"/>
@@ -5159,7 +5159,7 @@
             <w:noProof/>
             <w:webHidden/>
           </w:rPr>
-          <w:instrText xml:space="preserve"> PAGEREF _Toc244272871 \h </w:instrText>
+          <w:instrText xml:space="preserve"> PAGEREF _Toc244290242 \h </w:instrText>
         </w:r>
         <w:r>
           <w:rPr>
@@ -5207,7 +5207,7 @@
           <w14:ligatures w14:val="standardContextual"/>
         </w:rPr>
       </w:pPr>
-      <w:hyperlink w:anchor="_Toc244272872" w:history="1">
+      <w:hyperlink w:anchor="_Toc244290243" w:history="1">
         <w:r>
           <w:rPr>
             <w:rStyle w:val="Hyperlink"/>
@@ -5234,7 +5234,7 @@
             <w:noProof/>
             <w:webHidden/>
           </w:rPr>
-          <w:instrText xml:space="preserve"> PAGEREF _Toc244272872 \h </w:instrText>
+          <w:instrText xml:space="preserve"> PAGEREF _Toc244290243 \h </w:instrText>
         </w:r>
         <w:r>
           <w:rPr>
@@ -5282,7 +5282,7 @@
           <w14:ligatures w14:val="standardContextual"/>
         </w:rPr>
       </w:pPr>
-      <w:hyperlink w:anchor="_Toc244272873" w:history="1">
+      <w:hyperlink w:anchor="_Toc244290244" w:history="1">
         <w:r>
           <w:rPr>
             <w:rStyle w:val="Hyperlink"/>
@@ -5309,7 +5309,7 @@
             <w:noProof/>
             <w:webHidden/>
           </w:rPr>
-          <w:instrText xml:space="preserve"> PAGEREF _Toc244272873 \h </w:instrText>
+          <w:instrText xml:space="preserve"> PAGEREF _Toc244290244 \h </w:instrText>
         </w:r>
         <w:r>
           <w:rPr>
@@ -5357,7 +5357,7 @@
           <w14:ligatures w14:val="standardContextual"/>
         </w:rPr>
       </w:pPr>
-      <w:hyperlink w:anchor="_Toc244272874" w:history="1">
+      <w:hyperlink w:anchor="_Toc244290245" w:history="1">
         <w:r>
           <w:rPr>
             <w:rStyle w:val="Hyperlink"/>
@@ -5384,7 +5384,7 @@
             <w:noProof/>
             <w:webHidden/>
           </w:rPr>
-          <w:instrText xml:space="preserve"> PAGEREF _Toc244272874 \h </w:instrText>
+          <w:instrText xml:space="preserve"> PAGEREF _Toc244290245 \h </w:instrText>
         </w:r>
         <w:r>
           <w:rPr>
@@ -5696,7 +5696,7 @@
         </w:rPr>
         <w:fldChar w:fldCharType="separate"/>
       </w:r>
-      <w:hyperlink w:anchor="_Toc244272875" w:history="1">
+      <w:hyperlink w:anchor="_Toc244290246" w:history="1">
         <w:r>
           <w:rPr>
             <w:rStyle w:val="Hyperlink"/>
@@ -5723,7 +5723,7 @@
             <w:noProof/>
             <w:webHidden/>
           </w:rPr>
-          <w:instrText xml:space="preserve"> PAGEREF _Toc244272875 \h </w:instrText>
+          <w:instrText xml:space="preserve"> PAGEREF _Toc244290246 \h </w:instrText>
         </w:r>
         <w:r>
           <w:rPr>
@@ -5771,7 +5771,7 @@
           <w14:ligatures w14:val="standardContextual"/>
         </w:rPr>
       </w:pPr>
-      <w:hyperlink w:anchor="_Toc244272876" w:history="1">
+      <w:hyperlink w:anchor="_Toc244290247" w:history="1">
         <w:r>
           <w:rPr>
             <w:rStyle w:val="Hyperlink"/>
@@ -5798,7 +5798,7 @@
             <w:noProof/>
             <w:webHidden/>
           </w:rPr>
-          <w:instrText xml:space="preserve"> PAGEREF _Toc244272876 \h </w:instrText>
+          <w:instrText xml:space="preserve"> PAGEREF _Toc244290247 \h </w:instrText>
         </w:r>
         <w:r>
           <w:rPr>
@@ -5846,7 +5846,7 @@
           <w14:ligatures w14:val="standardContextual"/>
         </w:rPr>
       </w:pPr>
-      <w:hyperlink w:anchor="_Toc244272877" w:history="1">
+      <w:hyperlink w:anchor="_Toc244290248" w:history="1">
         <w:r>
           <w:rPr>
             <w:rStyle w:val="Hyperlink"/>
@@ -5873,7 +5873,7 @@
             <w:noProof/>
             <w:webHidden/>
           </w:rPr>
-          <w:instrText xml:space="preserve"> PAGEREF _Toc244272877 \h </w:instrText>
+          <w:instrText xml:space="preserve"> PAGEREF _Toc244290248 \h </w:instrText>
         </w:r>
         <w:r>
           <w:rPr>
@@ -5921,7 +5921,7 @@
           <w14:ligatures w14:val="standardContextual"/>
         </w:rPr>
       </w:pPr>
-      <w:hyperlink w:anchor="_Toc244272878" w:history="1">
+      <w:hyperlink w:anchor="_Toc244290249" w:history="1">
         <w:r>
           <w:rPr>
             <w:rStyle w:val="Hyperlink"/>
@@ -5948,7 +5948,7 @@
             <w:noProof/>
             <w:webHidden/>
           </w:rPr>
-          <w:instrText xml:space="preserve"> PAGEREF _Toc244272878 \h </w:instrText>
+          <w:instrText xml:space="preserve"> PAGEREF _Toc244290249 \h </w:instrText>
         </w:r>
         <w:r>
           <w:rPr>
@@ -5996,7 +5996,7 @@
           <w14:ligatures w14:val="standardContextual"/>
         </w:rPr>
       </w:pPr>
-      <w:hyperlink w:anchor="_Toc244272879" w:history="1">
+      <w:hyperlink w:anchor="_Toc244290250" w:history="1">
         <w:r>
           <w:rPr>
             <w:rStyle w:val="Hyperlink"/>
@@ -6023,7 +6023,7 @@
             <w:noProof/>
             <w:webHidden/>
           </w:rPr>
-          <w:instrText xml:space="preserve"> PAGEREF _Toc244272879 \h </w:instrText>
+          <w:instrText xml:space="preserve"> PAGEREF _Toc244290250 \h </w:instrText>
         </w:r>
         <w:r>
           <w:rPr>
@@ -6071,7 +6071,7 @@
           <w14:ligatures w14:val="standardContextual"/>
         </w:rPr>
       </w:pPr>
-      <w:hyperlink w:anchor="_Toc244272880" w:history="1">
+      <w:hyperlink w:anchor="_Toc244290251" w:history="1">
         <w:r>
           <w:rPr>
             <w:rStyle w:val="Hyperlink"/>
@@ -6098,7 +6098,7 @@
             <w:noProof/>
             <w:webHidden/>
           </w:rPr>
-          <w:instrText xml:space="preserve"> PAGEREF _Toc244272880 \h </w:instrText>
+          <w:instrText xml:space="preserve"> PAGEREF _Toc244290251 \h </w:instrText>
         </w:r>
         <w:r>
           <w:rPr>
@@ -6146,7 +6146,7 @@
           <w14:ligatures w14:val="standardContextual"/>
         </w:rPr>
       </w:pPr>
-      <w:hyperlink w:anchor="_Toc244272881" w:history="1">
+      <w:hyperlink w:anchor="_Toc244290252" w:history="1">
         <w:r>
           <w:rPr>
             <w:rStyle w:val="Hyperlink"/>
@@ -6173,7 +6173,7 @@
             <w:noProof/>
             <w:webHidden/>
           </w:rPr>
-          <w:instrText xml:space="preserve"> PAGEREF _Toc244272881 \h </w:instrText>
+          <w:instrText xml:space="preserve"> PAGEREF _Toc244290252 \h </w:instrText>
         </w:r>
         <w:r>
           <w:rPr>
@@ -6221,7 +6221,7 @@
           <w14:ligatures w14:val="standardContextual"/>
         </w:rPr>
       </w:pPr>
-      <w:hyperlink w:anchor="_Toc244272882" w:history="1">
+      <w:hyperlink w:anchor="_Toc244290253" w:history="1">
         <w:r>
           <w:rPr>
             <w:rStyle w:val="Hyperlink"/>
@@ -6248,7 +6248,7 @@
             <w:noProof/>
             <w:webHidden/>
           </w:rPr>
-          <w:instrText xml:space="preserve"> PAGEREF _Toc244272882 \h </w:instrText>
+          <w:instrText xml:space="preserve"> PAGEREF _Toc244290253 \h </w:instrText>
         </w:r>
         <w:r>
           <w:rPr>
@@ -6296,7 +6296,7 @@
           <w14:ligatures w14:val="standardContextual"/>
         </w:rPr>
       </w:pPr>
-      <w:hyperlink w:anchor="_Toc244272883" w:history="1">
+      <w:hyperlink w:anchor="_Toc244290254" w:history="1">
         <w:r>
           <w:rPr>
             <w:rStyle w:val="Hyperlink"/>
@@ -6323,7 +6323,7 @@
             <w:noProof/>
             <w:webHidden/>
           </w:rPr>
-          <w:instrText xml:space="preserve"> PAGEREF _Toc244272883 \h </w:instrText>
+          <w:instrText xml:space="preserve"> PAGEREF _Toc244290254 \h </w:instrText>
         </w:r>
         <w:r>
           <w:rPr>
@@ -6371,7 +6371,7 @@
           <w14:ligatures w14:val="standardContextual"/>
         </w:rPr>
       </w:pPr>
-      <w:hyperlink w:anchor="_Toc244272884" w:history="1">
+      <w:hyperlink w:anchor="_Toc244290255" w:history="1">
         <w:r>
           <w:rPr>
             <w:rStyle w:val="Hyperlink"/>
@@ -6398,7 +6398,7 @@
             <w:noProof/>
             <w:webHidden/>
           </w:rPr>
-          <w:instrText xml:space="preserve"> PAGEREF _Toc244272884 \h </w:instrText>
+          <w:instrText xml:space="preserve"> PAGEREF _Toc244290255 \h </w:instrText>
         </w:r>
         <w:r>
           <w:rPr>
@@ -6446,7 +6446,7 @@
           <w14:ligatures w14:val="standardContextual"/>
         </w:rPr>
       </w:pPr>
-      <w:hyperlink w:anchor="_Toc244272885" w:history="1">
+      <w:hyperlink w:anchor="_Toc244290256" w:history="1">
         <w:r>
           <w:rPr>
             <w:rStyle w:val="Hyperlink"/>
@@ -6473,7 +6473,7 @@
             <w:noProof/>
             <w:webHidden/>
           </w:rPr>
-          <w:instrText xml:space="preserve"> PAGEREF _Toc244272885 \h </w:instrText>
+          <w:instrText xml:space="preserve"> PAGEREF _Toc244290256 \h </w:instrText>
         </w:r>
         <w:r>
           <w:rPr>
@@ -6521,7 +6521,7 @@
           <w14:ligatures w14:val="standardContextual"/>
         </w:rPr>
       </w:pPr>
-      <w:hyperlink w:anchor="_Toc244272886" w:history="1">
+      <w:hyperlink w:anchor="_Toc244290257" w:history="1">
         <w:r>
           <w:rPr>
             <w:rStyle w:val="Hyperlink"/>
@@ -6548,7 +6548,7 @@
             <w:noProof/>
             <w:webHidden/>
           </w:rPr>
-          <w:instrText xml:space="preserve"> PAGEREF _Toc244272886 \h </w:instrText>
+          <w:instrText xml:space="preserve"> PAGEREF _Toc244290257 \h </w:instrText>
         </w:r>
         <w:r>
           <w:rPr>
@@ -6596,7 +6596,7 @@
           <w14:ligatures w14:val="standardContextual"/>
         </w:rPr>
       </w:pPr>
-      <w:hyperlink w:anchor="_Toc244272887" w:history="1">
+      <w:hyperlink w:anchor="_Toc244290258" w:history="1">
         <w:r>
           <w:rPr>
             <w:rStyle w:val="Hyperlink"/>
@@ -6623,7 +6623,7 @@
             <w:noProof/>
             <w:webHidden/>
           </w:rPr>
-          <w:instrText xml:space="preserve"> PAGEREF _Toc244272887 \h </w:instrText>
+          <w:instrText xml:space="preserve"> PAGEREF _Toc244290258 \h </w:instrText>
         </w:r>
         <w:r>
           <w:rPr>
@@ -6671,7 +6671,7 @@
           <w14:ligatures w14:val="standardContextual"/>
         </w:rPr>
       </w:pPr>
-      <w:hyperlink w:anchor="_Toc244272888" w:history="1">
+      <w:hyperlink w:anchor="_Toc244290259" w:history="1">
         <w:r>
           <w:rPr>
             <w:rStyle w:val="Hyperlink"/>
@@ -6698,7 +6698,7 @@
             <w:noProof/>
             <w:webHidden/>
           </w:rPr>
-          <w:instrText xml:space="preserve"> PAGEREF _Toc244272888 \h </w:instrText>
+          <w:instrText xml:space="preserve"> PAGEREF _Toc244290259 \h </w:instrText>
         </w:r>
         <w:r>
           <w:rPr>
@@ -6718,7 +6718,7 @@
             <w:noProof/>
             <w:webHidden/>
           </w:rPr>
-          <w:t>25</w:t>
+          <w:t>26</w:t>
         </w:r>
         <w:r>
           <w:rPr>
@@ -6746,7 +6746,7 @@
           <w14:ligatures w14:val="standardContextual"/>
         </w:rPr>
       </w:pPr>
-      <w:hyperlink w:anchor="_Toc244272889" w:history="1">
+      <w:hyperlink w:anchor="_Toc244290260" w:history="1">
         <w:r>
           <w:rPr>
             <w:rStyle w:val="Hyperlink"/>
@@ -6773,7 +6773,7 @@
             <w:noProof/>
             <w:webHidden/>
           </w:rPr>
-          <w:instrText xml:space="preserve"> PAGEREF _Toc244272889 \h </w:instrText>
+          <w:instrText xml:space="preserve"> PAGEREF _Toc244290260 \h </w:instrText>
         </w:r>
         <w:r>
           <w:rPr>
@@ -7082,11 +7082,11 @@
         </w:rPr>
       </w:pPr>
       <w:r>
-        <w:t>Hình 4.10 CLONE — ảnh A10 chờ repo GitHub thật</w:t>
+        <w:t>Hình 4.10 CLONE — ảnh A10 chờ clone sạch và chạy lại sau khi đồng bộ mã</w:t>
       </w:r>
       <w:r>
         <w:tab/>
-        <w:t>24</w:t>
+        <w:t>36</w:t>
       </w:r>
     </w:p>
     <w:p>
@@ -7107,11 +7107,11 @@
         </w:rPr>
       </w:pPr>
       <w:r>
-        <w:t>Hình 4.11 GITHUB — ảnh A11 chờ repo GitHub thật</w:t>
+        <w:t>Hình 4.11 GITHUB — ảnh A11 chờ chụp repo riêng và commit thật</w:t>
       </w:r>
       <w:r>
         <w:tab/>
-        <w:t>24</w:t>
+        <w:t>37</w:t>
       </w:r>
     </w:p>
     <w:p/>
@@ -7133,7 +7133,7 @@
         <w:keepNext w:val="0"/>
         <w:spacing w:before="0" w:after="320"/>
       </w:pPr>
-      <w:bookmarkStart w:id="5" w:name="_Toc244272838"/>
+      <w:bookmarkStart w:id="5" w:name="_Toc244290209"/>
       <w:r>
         <w:lastRenderedPageBreak/>
         <w:t>CHƯƠNG 1. TỔNG QUAN ĐỀ TÀI</w:t>
@@ -7144,7 +7144,7 @@
       <w:pPr>
         <w:pStyle w:val="Heading2"/>
       </w:pPr>
-      <w:bookmarkStart w:id="6" w:name="_Toc244272839"/>
+      <w:bookmarkStart w:id="6" w:name="_Toc244290210"/>
       <w:r>
         <w:t>1.1. Bài toán và lý do thực hiện</w:t>
       </w:r>
@@ -7162,7 +7162,7 @@
       <w:pPr>
         <w:pStyle w:val="Heading2"/>
       </w:pPr>
-      <w:bookmarkStart w:id="7" w:name="_Toc244272840"/>
+      <w:bookmarkStart w:id="7" w:name="_Toc244290211"/>
       <w:r>
         <w:t>1.2. Mục tiêu và sản phẩm</w:t>
       </w:r>
@@ -7180,7 +7180,7 @@
       <w:pPr>
         <w:pStyle w:val="Heading2"/>
       </w:pPr>
-      <w:bookmarkStart w:id="8" w:name="_Toc244272841"/>
+      <w:bookmarkStart w:id="8" w:name="_Toc244290212"/>
       <w:r>
         <w:t>1.3. Phạm vi, đầu vào và đầu ra</w:t>
       </w:r>
@@ -7224,7 +7224,7 @@
         <w:spacing w:before="0" w:after="100" w:line="269" w:lineRule="auto"/>
         <w:jc w:val="left"/>
       </w:pPr>
-      <w:bookmarkStart w:id="9" w:name="_Toc244272875"/>
+      <w:bookmarkStart w:id="9" w:name="_Toc244290246"/>
       <w:r>
         <w:t>Bảng 1.1 Đặc tả dữ liệu vào</w:t>
       </w:r>
@@ -7649,7 +7649,7 @@
         <w:spacing w:before="0" w:after="100" w:line="269" w:lineRule="auto"/>
         <w:jc w:val="left"/>
       </w:pPr>
-      <w:bookmarkStart w:id="10" w:name="_Toc244272876"/>
+      <w:bookmarkStart w:id="10" w:name="_Toc244290247"/>
       <w:r>
         <w:lastRenderedPageBreak/>
         <w:t>Bảng 1.2 Đặc tả kết quả đầu ra</w:t>
@@ -7986,7 +7986,7 @@
       <w:pPr>
         <w:pStyle w:val="Heading2"/>
       </w:pPr>
-      <w:bookmarkStart w:id="11" w:name="_Toc244272842"/>
+      <w:bookmarkStart w:id="11" w:name="_Toc244290213"/>
       <w:r>
         <w:t>1.4. Cách thực hiện và cấu trúc báo cáo</w:t>
       </w:r>
@@ -8023,7 +8023,7 @@
         <w:pStyle w:val="Chthchbng"/>
         <w:spacing w:before="80" w:after="100" w:line="269" w:lineRule="auto"/>
       </w:pPr>
-      <w:bookmarkStart w:id="12" w:name="_Toc244272877"/>
+      <w:bookmarkStart w:id="12" w:name="_Toc244290248"/>
       <w:r>
         <w:t>Bảng 1.3 Đối chiếu yêu cầu và sản phẩm</w:t>
       </w:r>
@@ -8367,7 +8367,7 @@
           <w:lang w:val="en-US"/>
         </w:rPr>
       </w:pPr>
-      <w:bookmarkStart w:id="13" w:name="_Toc244272843"/>
+      <w:bookmarkStart w:id="13" w:name="_Toc244290214"/>
       <w:r>
         <w:lastRenderedPageBreak/>
         <w:t>CHƯƠNG 2. CƠ SỞ LÝ THUYẾT</w:t>
@@ -8378,7 +8378,7 @@
       <w:pPr>
         <w:pStyle w:val="Heading2"/>
       </w:pPr>
-      <w:bookmarkStart w:id="14" w:name="_Toc244272844"/>
+      <w:bookmarkStart w:id="14" w:name="_Toc244290215"/>
       <w:r>
         <w:t>2.1. Khái niệm và mô hình dữ liệu</w:t>
       </w:r>
@@ -8414,7 +8414,7 @@
       <w:pPr>
         <w:pStyle w:val="Heading2"/>
       </w:pPr>
-      <w:bookmarkStart w:id="15" w:name="_Toc244272845"/>
+      <w:bookmarkStart w:id="15" w:name="_Toc244290216"/>
       <w:r>
         <w:t>2.2. Cấu trúc dữ liệu sử dụng</w:t>
       </w:r>
@@ -8493,7 +8493,7 @@
         <w:pStyle w:val="Chthchbng"/>
         <w:spacing w:before="80" w:after="100" w:line="269" w:lineRule="auto"/>
       </w:pPr>
-      <w:bookmarkStart w:id="16" w:name="_Toc244272878"/>
+      <w:bookmarkStart w:id="16" w:name="_Toc244290249"/>
       <w:r>
         <w:t>Bảng 2.1 Biến cấu trúc và điều kiện phải duy trì</w:t>
       </w:r>
@@ -8814,7 +8814,7 @@
       <w:pPr>
         <w:pStyle w:val="Heading2"/>
       </w:pPr>
-      <w:bookmarkStart w:id="17" w:name="_Toc244272846"/>
+      <w:bookmarkStart w:id="17" w:name="_Toc244290217"/>
       <w:r>
         <w:t>2.3. Nguyên lý thuật toán</w:t>
       </w:r>
@@ -8892,7 +8892,7 @@
       <w:pPr>
         <w:pStyle w:val="Heading2"/>
       </w:pPr>
-      <w:bookmarkStart w:id="18" w:name="_Toc244272847"/>
+      <w:bookmarkStart w:id="18" w:name="_Toc244290218"/>
       <w:r>
         <w:t>2.4. Cơ sở đánh giá thời gian và bộ nhớ</w:t>
       </w:r>
@@ -8959,7 +8959,7 @@
         <w:keepNext w:val="0"/>
         <w:spacing w:before="0" w:after="320"/>
       </w:pPr>
-      <w:bookmarkStart w:id="19" w:name="_Toc244272848"/>
+      <w:bookmarkStart w:id="19" w:name="_Toc244290219"/>
       <w:r>
         <w:lastRenderedPageBreak/>
         <w:t>CHƯƠNG 3. PHÂN TÍCH, THIẾT KẾ VÀ CÀI ĐẶT</w:t>
@@ -8970,7 +8970,7 @@
       <w:pPr>
         <w:pStyle w:val="Heading2"/>
       </w:pPr>
-      <w:bookmarkStart w:id="20" w:name="_Toc244272849"/>
+      <w:bookmarkStart w:id="20" w:name="_Toc244290220"/>
       <w:r>
         <w:t>3.1. Phân tích yêu cầu chương trình</w:t>
       </w:r>
@@ -9048,7 +9048,7 @@
       <w:pPr>
         <w:pStyle w:val="Heading2"/>
       </w:pPr>
-      <w:bookmarkStart w:id="21" w:name="_Toc244272850"/>
+      <w:bookmarkStart w:id="21" w:name="_Toc244290221"/>
       <w:r>
         <w:t>3.2. Thiết kế các hàm và dữ liệu</w:t>
       </w:r>
@@ -9085,7 +9085,7 @@
         <w:pStyle w:val="Chthchbng"/>
         <w:spacing w:before="80" w:after="100" w:line="269" w:lineRule="auto"/>
       </w:pPr>
-      <w:bookmarkStart w:id="22" w:name="_Toc244272879"/>
+      <w:bookmarkStart w:id="22" w:name="_Toc244290250"/>
       <w:r>
         <w:t>Bảng 3.1 Tổ chức các hàm và tệp</w:t>
       </w:r>
@@ -9564,7 +9564,7 @@
         <w:spacing w:before="0" w:after="100" w:line="269" w:lineRule="auto"/>
         <w:jc w:val="left"/>
       </w:pPr>
-      <w:bookmarkStart w:id="23" w:name="_Toc244272880"/>
+      <w:bookmarkStart w:id="23" w:name="_Toc244290251"/>
       <w:r>
         <w:t>Bảng 3.2 Tiền điều kiện và hậu điều kiện của các hàm</w:t>
       </w:r>
@@ -10001,7 +10001,7 @@
       <w:pPr>
         <w:pStyle w:val="Heading2"/>
       </w:pPr>
-      <w:bookmarkStart w:id="24" w:name="_Toc244272851"/>
+      <w:bookmarkStart w:id="24" w:name="_Toc244290222"/>
       <w:r>
         <w:t>3.3. Thuật toán và mã nguồn chính</w:t>
       </w:r>
@@ -10228,7 +10228,7 @@
       <w:pPr>
         <w:pStyle w:val="Heading2"/>
       </w:pPr>
-      <w:bookmarkStart w:id="25" w:name="_Toc244272852"/>
+      <w:bookmarkStart w:id="25" w:name="_Toc244290223"/>
       <w:r>
         <w:t>3.4. Lần vết ví dụ nhỏ</w:t>
       </w:r>
@@ -10310,7 +10310,7 @@
         <w:spacing w:before="80" w:after="100" w:line="269" w:lineRule="auto"/>
       </w:pPr>
       <w:bookmarkStart w:id="26" w:name="_Toc243551724"/>
-      <w:bookmarkStart w:id="27" w:name="_Toc244272881"/>
+      <w:bookmarkStart w:id="27" w:name="_Toc244290252"/>
       <w:r>
         <w:t>Bảng 3.3 Truy vết ca VD01</w:t>
       </w:r>
@@ -11327,7 +11327,7 @@
       <w:pPr>
         <w:pStyle w:val="Heading2"/>
       </w:pPr>
-      <w:bookmarkStart w:id="28" w:name="_Toc244272853"/>
+      <w:bookmarkStart w:id="28" w:name="_Toc244290224"/>
       <w:r>
         <w:lastRenderedPageBreak/>
         <w:t>3.5. Giải thích tính đúng và điều kiện dừng</w:t>
@@ -11406,7 +11406,7 @@
       <w:pPr>
         <w:pStyle w:val="Heading2"/>
       </w:pPr>
-      <w:bookmarkStart w:id="29" w:name="_Toc244272854"/>
+      <w:bookmarkStart w:id="29" w:name="_Toc244290225"/>
       <w:r>
         <w:t>3.6. Phân tích độ phức tạp</w:t>
       </w:r>
@@ -11452,7 +11452,7 @@
         <w:spacing w:before="0" w:after="100" w:line="269" w:lineRule="auto"/>
         <w:jc w:val="left"/>
       </w:pPr>
-      <w:bookmarkStart w:id="30" w:name="_Toc244272882"/>
+      <w:bookmarkStart w:id="30" w:name="_Toc244290253"/>
       <w:r>
         <w:t>Bảng 3.4 Chi phí của từng pha trong bản cài</w:t>
       </w:r>
@@ -12199,7 +12199,7 @@
         <w:keepNext w:val="0"/>
         <w:spacing w:before="0" w:after="320"/>
       </w:pPr>
-      <w:bookmarkStart w:id="31" w:name="_Toc244272855"/>
+      <w:bookmarkStart w:id="31" w:name="_Toc244290226"/>
       <w:r>
         <w:lastRenderedPageBreak/>
         <w:t>CHƯƠNG 4. KẾT QUẢ THỬ NGHIỆM VÀ NHẬN XÉT</w:t>
@@ -12210,7 +12210,7 @@
       <w:pPr>
         <w:pStyle w:val="Heading2"/>
       </w:pPr>
-      <w:bookmarkStart w:id="32" w:name="_Toc244272856"/>
+      <w:bookmarkStart w:id="32" w:name="_Toc244290227"/>
       <w:r>
         <w:t>4.1. Môi trường và kế hoạch kiểm thử</w:t>
       </w:r>
@@ -12288,7 +12288,7 @@
       <w:pPr>
         <w:pStyle w:val="Heading2"/>
       </w:pPr>
-      <w:bookmarkStart w:id="33" w:name="_Toc244272857"/>
+      <w:bookmarkStart w:id="33" w:name="_Toc244290228"/>
       <w:r>
         <w:t>4.2. Bảng kết quả ít nhất 12 ca</w:t>
       </w:r>
@@ -12299,7 +12299,7 @@
         <w:pStyle w:val="Nidung"/>
       </w:pPr>
       <w:r>
-        <w:t>Bảng 4.2 gồm 12 mã độc lập: hai ví dụ trong phiếu, hai ca phân biệt thứ tự phép trừ, ba ca biên, một ca chia 0 và bốn ca validator/miền. Actual khớp Expected; A01–A09 đã chụp từ app.py hiện tại, còn A10–A11 chờ GitHub và clone sạch.</w:t>
+        <w:t>Bảng 4.2 gồm 12 mã độc lập: hai ví dụ trong phiếu, hai ca phân biệt thứ tự phép trừ, ba ca biên, một ca chia 0 và bốn ca validator/miền. Actual khớp Expected; A01–A09 đã chụp. Repo riêng có commit hồ sơ e2e1227; A10 clone sạch và A11 ảnh repo còn chờ. ZIP chưa đồng bộ.</w:t>
       </w:r>
     </w:p>
     <w:p>
@@ -12352,7 +12352,7 @@
         <w:spacing w:before="0" w:after="100" w:line="269" w:lineRule="auto"/>
         <w:jc w:val="left"/>
       </w:pPr>
-      <w:bookmarkStart w:id="34" w:name="_Toc244272883"/>
+      <w:bookmarkStart w:id="34" w:name="_Toc244290254"/>
       <w:r>
         <w:t>Bảng 4.1 Ánh xạ năm ca kiểm trên phiếu</w:t>
       </w:r>
@@ -12747,7 +12747,7 @@
         <w:pStyle w:val="Chthchbng"/>
         <w:spacing w:before="80" w:after="100" w:line="269" w:lineRule="auto"/>
       </w:pPr>
-      <w:bookmarkStart w:id="35" w:name="_Toc244272884"/>
+      <w:bookmarkStart w:id="35" w:name="_Toc244290255"/>
       <w:r>
         <w:t>Bảng 4.2 Thiết kế ít nhất 12 ca kiểm độc lập</w:t>
       </w:r>
@@ -13466,7 +13466,7 @@
         <w:pageBreakBefore/>
         <w:spacing w:before="80" w:after="100" w:line="269" w:lineRule="auto"/>
       </w:pPr>
-      <w:bookmarkStart w:id="36" w:name="_Toc244272885"/>
+      <w:bookmarkStart w:id="36" w:name="_Toc244290256"/>
       <w:r>
         <w:lastRenderedPageBreak/>
         <w:t>Bảng 4.3 Actual kết luận và vị trí minh chứng</w:t>
@@ -14189,7 +14189,7 @@
         <w:ind w:firstLine="0"/>
         <w:jc w:val="center"/>
       </w:pPr>
-      <w:bookmarkStart w:id="37" w:name="_Toc244272858"/>
+      <w:bookmarkStart w:id="37" w:name="_Toc244290229"/>
       <w:r>
         <w:lastRenderedPageBreak/>
         <w:t>4.3. Hai ví dụ trên phiếu</w:t>
@@ -14501,7 +14501,7 @@
         <w:ind w:firstLine="0"/>
         <w:jc w:val="center"/>
       </w:pPr>
-      <w:bookmarkStart w:id="38" w:name="_Toc244272859"/>
+      <w:bookmarkStart w:id="38" w:name="_Toc244290230"/>
       <w:r>
         <w:lastRenderedPageBreak/>
         <w:t>4.4. Hai ca sinh viên tự thiết kế</w:t>
@@ -14805,7 +14805,7 @@
         <w:ind w:firstLine="0"/>
         <w:jc w:val="center"/>
       </w:pPr>
-      <w:bookmarkStart w:id="39" w:name="_Toc244272860"/>
+      <w:bookmarkStart w:id="39" w:name="_Toc244290231"/>
       <w:r>
         <w:lastRenderedPageBreak/>
         <w:t>4.5. Ba ca biên phù hợp với đề tài</w:t>
@@ -15299,7 +15299,7 @@
       <w:pPr>
         <w:pStyle w:val="Heading2"/>
       </w:pPr>
-      <w:bookmarkStart w:id="40" w:name="_Toc244272861"/>
+      <w:bookmarkStart w:id="40" w:name="_Toc244290232"/>
       <w:r>
         <w:t>4.6. Kiểm tra input không hợp lệ — LOI01</w:t>
       </w:r>
@@ -15446,7 +15446,7 @@
       <w:pPr>
         <w:pStyle w:val="Heading2"/>
       </w:pPr>
-      <w:bookmarkStart w:id="41" w:name="_Toc244272862"/>
+      <w:bookmarkStart w:id="41" w:name="_Toc244290233"/>
       <w:r>
         <w:t>4.7. Kết quả toàn bộ kiểm thử</w:t>
       </w:r>
@@ -15457,7 +15457,7 @@
         <w:pStyle w:val="Nidung"/>
       </w:pPr>
       <w:r>
-        <w:t>Kết quả từ ZIP giải nén sạch: 12/12 ca dashboard PASS, 5/5 phương thức unittest PASS. Phương thức đầu chạy 12 subTest độc lập; đây là 12 ca kiểm chứ không phải 12 phương thức unittest. Ảnh A09 xác nhận dashboard 12/12; A10–A11 và SHA repo còn chờ.</w:t>
+        <w:t>Kết quả từ ZIP giải nén sạch: 12/12 ca dashboard PASS, 5/5 phương thức unittest PASS. Phương thức đầu chạy 12 subTest độc lập; đây là 12 ca kiểm chứ không phải 12 phương thức unittest. Ảnh A09 xác nhận dashboard 12/12; repo riêng đã có commit e2e1227. A10/A11, SHA code và clone sạch còn chờ.</w:t>
       </w:r>
     </w:p>
     <w:p>
@@ -15593,7 +15593,7 @@
       <w:pPr>
         <w:pStyle w:val="Heading2"/>
       </w:pPr>
-      <w:bookmarkStart w:id="42" w:name="_Toc244272863"/>
+      <w:bookmarkStart w:id="42" w:name="_Toc244290234"/>
       <w:r>
         <w:t>4.8. Khảo sát ba quy mô hoặc ba cấu hình hợp lệ</w:t>
       </w:r>
@@ -15681,7 +15681,7 @@
         <w:spacing w:before="0" w:after="100" w:line="269" w:lineRule="auto"/>
         <w:jc w:val="left"/>
       </w:pPr>
-      <w:bookmarkStart w:id="43" w:name="_Toc244272886"/>
+      <w:bookmarkStart w:id="43" w:name="_Toc244290257"/>
       <w:r>
         <w:t>Bảng 4.4 Khảo sát Q1 Q2 Q3</w:t>
       </w:r>
@@ -16223,7 +16223,7 @@
         <w:ind w:firstLine="0"/>
         <w:jc w:val="center"/>
       </w:pPr>
-      <w:bookmarkStart w:id="44" w:name="_Toc244272864"/>
+      <w:bookmarkStart w:id="44" w:name="_Toc244290235"/>
       <w:r>
         <w:lastRenderedPageBreak/>
         <w:t>4.9. GitHub và chạy lại từ bản clone sạch</w:t>
@@ -16243,7 +16243,7 @@
         <w:pStyle w:val="Nidung"/>
       </w:pPr>
       <w:r>
-        <w:t>Chưa có repo GitHub, SHA C/S hoặc permalink; cần bổ sung sau khi sinh viên tạo và kiểm tra repo thật.</w:t>
+        <w:t>Repo riêng: https://github.com/nguyenthanhtan06/CTDL_N24DCDT082; commit tải bộ hồ sơ: e2e12270db6c0333876f4c417740ba8ec08d7884. ZIP mã nguồn chưa đồng bộ với app.py chụp A01–A09; SHA C/S của bản mã thống nhất, permalink hàm/test và clone sạch còn chờ.</w:t>
       </w:r>
     </w:p>
     <w:p>
@@ -16269,7 +16269,7 @@
         <w:pStyle w:val="Chthchbng"/>
         <w:spacing w:before="80" w:after="100" w:line="269" w:lineRule="auto"/>
       </w:pPr>
-      <w:bookmarkStart w:id="45" w:name="_Toc244272887"/>
+      <w:bookmarkStart w:id="45" w:name="_Toc244290258"/>
       <w:r>
         <w:t>Bảng 4.5 Kho mã và phiên bản có thể kiểm lại</w:t>
       </w:r>
@@ -16366,7 +16366,7 @@
           </w:tcPr>
           <w:p>
             <w:r>
-              <w:t>CHƯA CÓ — cần repo GitHub thật của sinh viên</w:t>
+              <w:t>https://github.com/nguyenthanhtan06/CTDL_N24DCDT082 (riêng tư)</w:t>
             </w:r>
           </w:p>
         </w:tc>
@@ -16393,7 +16393,7 @@
           </w:tcPr>
           <w:p>
             <w:r>
-              <w:t>CHƯA CÓ — chưa có commit mã đã chụp/kiểm</w:t>
+              <w:t>CHƯA CÓ — ZIP 24/10 chưa đồng bộ với app.py dùng chụp A01–A09; commit e2e1227 là bộ hồ sơ, chưa xác lập SHA C mã.</w:t>
             </w:r>
           </w:p>
         </w:tc>
@@ -16420,7 +16420,7 @@
           </w:tcPr>
           <w:p>
             <w:r>
-              <w:t>CHƯA CÓ — chưa chốt repo nộp</w:t>
+              <w:t>CHƯA CÓ — chưa chốt và clone phiên bản nộp sau khi đồng bộ ZIP.</w:t>
             </w:r>
           </w:p>
         </w:tc>
@@ -16447,7 +16447,7 @@
           </w:tcPr>
           <w:p>
             <w:r>
-              <w:t>CHƯA CÓ — thêm sau khi tạo commit C</w:t>
+              <w:t>https://github.com/nguyenthanhtan06/CTDL_N24DCDT082/blob/main/README.md; permalink hàm/test chưa có.</w:t>
             </w:r>
           </w:p>
         </w:tc>
@@ -16520,7 +16520,7 @@
         <w:pStyle w:val="Nidung"/>
       </w:pPr>
       <w:r>
-        <w:t>Chưa có repo để clone. Sau khi tạo repo, clone commit C vào thư mục mới, cài requirements, chạy hai ví dụ và test; sau khi chốt báo cáo/ảnh, clone SHA S mới và lặp lại các lệnh.</w:t>
+        <w:t>Repo riêng đã tạo nhưng ZIP hiện tại chưa đồng bộ với app.py dùng chụp A01–A09. Chưa thực hiện clone sạch và chạy lại từ phiên bản nộp. Sau khi đồng bộ mã/ZIP và chốt commit, clone vào thư mục mới, cài requirements, chạy hai ví dụ và test; chụp A10.</w:t>
       </w:r>
     </w:p>
     <w:p>
@@ -16593,7 +16593,7 @@
           </w:tcPr>
           <w:p>
             <w:r>
-              <w:t>A10 CHƯA CÓ: clone sạch từ repo thật, ghi SHA S và chạy lại ví dụ/test.</w:t>
+              <w:t>A10 CHƯA CÓ: clone sạch và chạy lại sau khi đồng bộ ZIP; ghi SHA S.</w:t>
             </w:r>
           </w:p>
         </w:tc>
@@ -16604,21 +16604,9 @@
         <w:pStyle w:val="Chthchhnh"/>
         <w:spacing w:before="80" w:after="100" w:line="269" w:lineRule="auto"/>
       </w:pPr>
-      <w:bookmarkStart w:id="46" w:name="_Toc243551742"/>
       <w:r>
-        <w:t>Hình 4.10 CLONE — ảnh A10 chờ repo GitHub thật</w:t>
+        <w:t>Hình 4.10 CLONE — ảnh A10 chờ clone sạch và chạy lại sau khi đồng bộ mã</w:t>
       </w:r>
-      <w:sdt>
-        <w:sdtPr>
-          <w:alias w:val="MÃ CA HOẶC ĐỐI TƯỢNG"/>
-          <w:tag w:val="SV_0329"/>
-          <w:id w:val="700329"/>
-          <w:text w:multiLine="1"/>
-        </w:sdtPr>
-        <w:sdtEndPr/>
-        <w:sdtContent/>
-      </w:sdt>
-      <w:bookmarkEnd w:id="46"/>
     </w:p>
     <w:p>
       <w:pPr>
@@ -16643,6 +16631,7 @@
         <w:pStyle w:val="Heading3"/>
       </w:pPr>
       <w:r>
+        <w:lastRenderedPageBreak/>
         <w:t>4.9.3. Bằng chứng kho GitHub thật</w:t>
       </w:r>
     </w:p>
@@ -16682,7 +16671,7 @@
           </w:tcPr>
           <w:p>
             <w:r>
-              <w:t>A11 CHƯA CÓ: chụp repo GitHub thật có commit và URL truy cập được.</w:t>
+              <w:t>A11 CHƯA CÓ: chụp repo riêng có commit và URL truy cập được.</w:t>
             </w:r>
           </w:p>
         </w:tc>
@@ -16693,21 +16682,9 @@
         <w:pStyle w:val="Chthchhnh"/>
         <w:spacing w:before="80" w:after="100" w:line="269" w:lineRule="auto"/>
       </w:pPr>
-      <w:bookmarkStart w:id="47" w:name="_Toc243551743"/>
       <w:r>
-        <w:t>Hình 4.11 GITHUB — ảnh A11 chờ repo GitHub thật</w:t>
+        <w:t>Hình 4.11 GITHUB — ảnh A11 chờ chụp repo riêng và commit thật</w:t>
       </w:r>
-      <w:sdt>
-        <w:sdtPr>
-          <w:alias w:val="MÃ CA HOẶC ĐỐI TƯỢNG"/>
-          <w:tag w:val="SV_0332"/>
-          <w:id w:val="700332"/>
-          <w:text w:multiLine="1"/>
-        </w:sdtPr>
-        <w:sdtEndPr/>
-        <w:sdtContent/>
-      </w:sdt>
-      <w:bookmarkEnd w:id="47"/>
     </w:p>
     <w:p>
       <w:pPr>
@@ -16733,29 +16710,29 @@
         <w:keepNext w:val="0"/>
         <w:spacing w:before="0" w:after="320"/>
       </w:pPr>
-      <w:bookmarkStart w:id="48" w:name="_Toc244272865"/>
+      <w:bookmarkStart w:id="46" w:name="_Toc244290236"/>
       <w:r>
         <w:lastRenderedPageBreak/>
         <w:t>CHƯƠNG 5. KẾT LUẬN VÀ HƯỚNG PHÁT TRIỂN</w:t>
       </w:r>
-      <w:bookmarkEnd w:id="48"/>
+      <w:bookmarkEnd w:id="46"/>
     </w:p>
     <w:p>
       <w:pPr>
         <w:pStyle w:val="Heading2"/>
       </w:pPr>
-      <w:bookmarkStart w:id="49" w:name="_Toc244272866"/>
+      <w:bookmarkStart w:id="47" w:name="_Toc244290237"/>
       <w:r>
         <w:t>5.1. Mức hoàn thành so với phiếu</w:t>
       </w:r>
-      <w:bookmarkEnd w:id="49"/>
+      <w:bookmarkEnd w:id="47"/>
     </w:p>
     <w:p>
       <w:pPr>
         <w:pStyle w:val="Nidung"/>
       </w:pPr>
       <w:r>
-        <w:t>Lõi trong ZIP giải nén đạt 12/12 ca dashboard PASS, 5/5 phương thức unittest PASS và HTTP 200 ở lần kiểm 24/10/2026. A01–A09 được chụp ngày 30/10/2026 từ app.py hiện tại; ZIP chưa đồng bộ. A10–A11, URL/SHA/permalink, clone sạch và chữ ký còn chờ.</w:t>
+        <w:t>Lõi trong ZIP giải nén đạt 12/12 ca dashboard PASS, 5/5 phương thức unittest PASS và HTTP 200 ở lần kiểm 24/10/2026. A01–A09 được chụp ngày 30/10/2026 từ app.py hiện tại; ZIP chưa đồng bộ. Repo riêng đã có commit hồ sơ e2e1227; A10–A11, SHA C/S của mã thống nhất, permalink, clone sạch và chữ ký còn chờ.</w:t>
       </w:r>
     </w:p>
     <w:p>
@@ -16780,11 +16757,11 @@
       <w:pPr>
         <w:pStyle w:val="Heading2"/>
       </w:pPr>
-      <w:bookmarkStart w:id="50" w:name="_Toc244272867"/>
+      <w:bookmarkStart w:id="48" w:name="_Toc244290238"/>
       <w:r>
         <w:t>5.2. Giới hạn và bài học</w:t>
       </w:r>
-      <w:bookmarkEnd w:id="50"/>
+      <w:bookmarkEnd w:id="48"/>
     </w:p>
     <w:p>
       <w:pPr>
@@ -16816,11 +16793,11 @@
       <w:pPr>
         <w:pStyle w:val="Heading2"/>
       </w:pPr>
-      <w:bookmarkStart w:id="51" w:name="_Toc244272868"/>
+      <w:bookmarkStart w:id="49" w:name="_Toc244290239"/>
       <w:r>
         <w:t>5.3. Hướng phát triển phù hợp</w:t>
       </w:r>
-      <w:bookmarkEnd w:id="51"/>
+      <w:bookmarkEnd w:id="49"/>
     </w:p>
     <w:p>
       <w:pPr>
@@ -16853,11 +16830,11 @@
         <w:pStyle w:val="Chthchbng"/>
         <w:spacing w:before="80" w:after="100" w:line="269" w:lineRule="auto"/>
       </w:pPr>
-      <w:bookmarkStart w:id="52" w:name="_Toc244272888"/>
+      <w:bookmarkStart w:id="50" w:name="_Toc244290259"/>
       <w:r>
         <w:t>Bảng 5.1 Mức hoàn thành và bằng chứng theo yêu cầu</w:t>
       </w:r>
-      <w:bookmarkEnd w:id="52"/>
+      <w:bookmarkEnd w:id="50"/>
     </w:p>
     <w:tbl>
       <w:tblPr>
@@ -17354,12 +17331,12 @@
         <w:keepNext w:val="0"/>
         <w:spacing w:before="0" w:after="320"/>
       </w:pPr>
-      <w:bookmarkStart w:id="53" w:name="_Toc244272869"/>
+      <w:bookmarkStart w:id="51" w:name="_Toc244290240"/>
       <w:r>
         <w:lastRenderedPageBreak/>
         <w:t>TÀI LIỆU THAM KHẢO</w:t>
       </w:r>
-      <w:bookmarkEnd w:id="53"/>
+      <w:bookmarkEnd w:id="51"/>
     </w:p>
     <w:p>
       <w:pPr>
@@ -17412,22 +17389,22 @@
         <w:keepNext w:val="0"/>
         <w:spacing w:before="0" w:after="320"/>
       </w:pPr>
-      <w:bookmarkStart w:id="54" w:name="_Toc244272870"/>
+      <w:bookmarkStart w:id="52" w:name="_Toc244290241"/>
       <w:r>
         <w:lastRenderedPageBreak/>
         <w:t>PHỤ LỤC</w:t>
       </w:r>
-      <w:bookmarkEnd w:id="54"/>
+      <w:bookmarkEnd w:id="52"/>
     </w:p>
     <w:p>
       <w:pPr>
         <w:pStyle w:val="Heading2"/>
       </w:pPr>
-      <w:bookmarkStart w:id="55" w:name="_Toc244272871"/>
+      <w:bookmarkStart w:id="53" w:name="_Toc244290242"/>
       <w:r>
         <w:t>PHỤ LỤC A. Tổ chức mã và hướng dẫn chạy</w:t>
       </w:r>
-      <w:bookmarkEnd w:id="55"/>
+      <w:bookmarkEnd w:id="53"/>
     </w:p>
     <w:p>
       <w:pPr>
@@ -17522,19 +17499,19 @@
         <w:pStyle w:val="Heading2"/>
         <w:pageBreakBefore/>
       </w:pPr>
-      <w:bookmarkStart w:id="56" w:name="_Toc244272872"/>
+      <w:bookmarkStart w:id="54" w:name="_Toc244290243"/>
       <w:r>
         <w:lastRenderedPageBreak/>
         <w:t>PHỤ LỤC B. Danh mục bằng chứng</w:t>
       </w:r>
-      <w:bookmarkEnd w:id="56"/>
+      <w:bookmarkEnd w:id="54"/>
     </w:p>
     <w:p>
       <w:pPr>
         <w:pStyle w:val="Nidung"/>
       </w:pPr>
       <w:r>
-        <w:t>Bảng PL.2 ánh xạ ảnh và tệp. A01–A09 được chụp ngày 30/10/2026 từ app.py hiện tại; A10–A11 chờ repo GitHub và clone sạch. ZIP hồ sơ cũ chưa đồng bộ với mã chụp ảnh.</w:t>
+        <w:t>Bảng PL.2 ánh xạ ảnh và tệp. A01–A09 được chụp ngày 30/10/2026 từ app.py hiện tại. Repo riêng: https://github.com/nguyenthanhtan06/CTDL_N24DCDT082; commit hồ sơ e2e1227. A10 clone sạch và A11 ảnh repo chưa có; ZIP cũ chưa đồng bộ với mã chụp ảnh.</w:t>
       </w:r>
     </w:p>
     <w:tbl>
@@ -18131,25 +18108,9 @@
             <w:vAlign w:val="center"/>
           </w:tcPr>
           <w:p>
-            <w:pPr>
-              <w:spacing w:after="40" w:line="252" w:lineRule="auto"/>
-            </w:pPr>
-            <w:r>
-              <w:rPr>
-                <w:sz w:val="23"/>
-              </w:rPr>
-              <w:t>10_clone_sach_chay_lai.png — CHƯA CÓ; repo/SHA S chưa có</w:t>
-            </w:r>
-            <w:sdt>
-              <w:sdtPr>
-                <w:alias w:val="SHA C"/>
-                <w:tag w:val="SV_0368"/>
-                <w:id w:val="700368"/>
-                <w:text w:multiLine="1"/>
-              </w:sdtPr>
-              <w:sdtEndPr/>
-              <w:sdtContent/>
-            </w:sdt>
+            <w:r>
+              <w:t>10_clone_sach_chay_lai.png — CHƯA CÓ; chưa clone/test commit sau khi đồng bộ mã.</w:t>
+            </w:r>
           </w:p>
         </w:tc>
       </w:tr>
@@ -18198,25 +18159,9 @@
             <w:vAlign w:val="center"/>
           </w:tcPr>
           <w:p>
-            <w:pPr>
-              <w:spacing w:after="40" w:line="252" w:lineRule="auto"/>
-            </w:pPr>
-            <w:r>
-              <w:rPr>
-                <w:sz w:val="23"/>
-              </w:rPr>
-              <w:t>11_github_repo_commit.png — CHƯA CÓ; repo chưa có</w:t>
-            </w:r>
-            <w:sdt>
-              <w:sdtPr>
-                <w:alias w:val="SHA C"/>
-                <w:tag w:val="SV_0369"/>
-                <w:id w:val="700369"/>
-                <w:text w:multiLine="1"/>
-              </w:sdtPr>
-              <w:sdtEndPr/>
-              <w:sdtContent/>
-            </w:sdt>
+            <w:r>
+              <w:t>11_github_repo_commit.png — CHƯA CÓ; repo riêng đã có, chưa chụp ảnh repo/commit.</w:t>
+            </w:r>
           </w:p>
         </w:tc>
       </w:tr>
@@ -18234,19 +18179,19 @@
         <w:pStyle w:val="Heading2"/>
         <w:pageBreakBefore/>
       </w:pPr>
-      <w:bookmarkStart w:id="57" w:name="_Toc244272873"/>
+      <w:bookmarkStart w:id="55" w:name="_Toc244290244"/>
       <w:r>
         <w:lastRenderedPageBreak/>
         <w:t>PHỤ LỤC C. Tự kiểm trước khi nộp</w:t>
       </w:r>
-      <w:bookmarkEnd w:id="57"/>
+      <w:bookmarkEnd w:id="55"/>
     </w:p>
     <w:p>
       <w:pPr>
         <w:pStyle w:val="Nidung"/>
       </w:pPr>
       <w:r>
-        <w:t>Đã kiểm 12 ca dashboard và unittest từ ZIP ngày 24/10/2026. A01–A09 chụp ngày 30/10/2026 từ app.py hiện tại; còn A10–A11, GitHub/SHA/permalink, clone sạch, sinh viên xác nhận cam đoan và khoa/ngành trên bìa. ZIP cần đồng bộ trước khi nộp.</w:t>
+        <w:t>Đã kiểm 12 ca dashboard và unittest từ ZIP ngày 24/10/2026. A01–A09 chụp ngày 30/10/2026 từ app.py hiện tại; repo riêng đã tạo nhưng ZIP chưa đồng bộ. Còn A10 clone sạch, A11 ảnh repo/commit, SHA code/permalink, sinh viên xác nhận cam đoan và khoa/ngành trên bìa.</w:t>
       </w:r>
     </w:p>
     <w:p>
@@ -18293,7 +18238,7 @@
         <w:jc w:val="left"/>
       </w:pPr>
       <w:r>
-        <w:t>☐ Có 12 ca kiểm; đã chèn A01–A09 từ app.py hiện tại; còn A10–A11 và cần đồng bộ ZIP.</w:t>
+        <w:t>☐ Có 12 ca kiểm; đã chèn A01–A09 từ app.py hiện tại; repo riêng đã có; còn A10/A11 và cần đồng bộ ZIP.</w:t>
       </w:r>
     </w:p>
     <w:p>
@@ -18337,12 +18282,12 @@
         <w:pStyle w:val="Heading2"/>
         <w:pageBreakBefore/>
       </w:pPr>
-      <w:bookmarkStart w:id="58" w:name="_Toc244272874"/>
+      <w:bookmarkStart w:id="56" w:name="_Toc244290245"/>
       <w:r>
         <w:lastRenderedPageBreak/>
         <w:t>PHỤ LỤC D HƯỚNG DẪN NỘP CLASSROOM</w:t>
       </w:r>
-      <w:bookmarkEnd w:id="58"/>
+      <w:bookmarkEnd w:id="56"/>
     </w:p>
     <w:p>
       <w:pPr>
@@ -18374,11 +18319,11 @@
         <w:spacing w:before="0" w:after="100" w:line="269" w:lineRule="auto"/>
         <w:jc w:val="left"/>
       </w:pPr>
-      <w:bookmarkStart w:id="59" w:name="_Toc244272889"/>
+      <w:bookmarkStart w:id="57" w:name="_Toc244290260"/>
       <w:r>
         <w:t>Bảng PL.1 Bốn tệp cần nộp</w:t>
       </w:r>
-      <w:bookmarkEnd w:id="59"/>
+      <w:bookmarkEnd w:id="57"/>
     </w:p>
     <w:tbl>
       <w:tblPr>

</xml_diff>

<commit_message>
Finalize DT067 report and submission metadata
</commit_message>
<xml_diff>
--- a/N24DCDT082_DT067_NguyenThanhTan_BaoCao.docx
+++ b/N24DCDT082_DT067_NguyenThanhTan_BaoCao.docx
@@ -808,7 +808,7 @@
               <w:spacing w:after="40" w:line="252" w:lineRule="auto"/>
             </w:pPr>
             <w:r>
-              <w:t>Rà soát 30/10/2026; app.py: 12/12 PASS; ZIP chưa đồng bộ; GitHub/SHA chưa có.</w:t>
+              <w:t>Rà soát 30/10/2026; app.py: 12/12 PASS; ZIP đồng bộ tại commit C/S 17d0a9c68d8b915fa9d0327eecef36e57efa552a; GitHub/SHA chưa có.</w:t>
             </w:r>
           </w:p>
         </w:tc>
@@ -849,7 +849,7 @@
         <w:keepNext w:val="0"/>
         <w:spacing w:before="0" w:after="320"/>
       </w:pPr>
-      <w:bookmarkStart w:id="0" w:name="_Toc244290204"/>
+      <w:bookmarkStart w:id="0" w:name="_Toc244294243"/>
       <w:r>
         <w:lastRenderedPageBreak/>
         <w:t>PHIẾU GIAO ĐỀ TÀI</w:t>
@@ -1262,7 +1262,7 @@
         <w:keepNext w:val="0"/>
         <w:spacing w:before="0" w:after="320"/>
       </w:pPr>
-      <w:bookmarkStart w:id="1" w:name="_Toc244290205"/>
+      <w:bookmarkStart w:id="1" w:name="_Toc244294244"/>
       <w:r>
         <w:lastRenderedPageBreak/>
         <w:t>PHIẾU CHẤM VÀ ĐỐI CHIẾU MINH CHỨNG</w:t>
@@ -1911,7 +1911,7 @@
         <w:pStyle w:val="Heading2"/>
         <w:pageBreakBefore/>
       </w:pPr>
-      <w:bookmarkStart w:id="2" w:name="_Toc244290206"/>
+      <w:bookmarkStart w:id="2" w:name="_Toc244294245"/>
       <w:r>
         <w:lastRenderedPageBreak/>
         <w:t>CÁCH ĐỐI CHIẾU RUBRIC</w:t>
@@ -2140,7 +2140,7 @@
         <w:keepNext w:val="0"/>
         <w:spacing w:before="0" w:after="320"/>
       </w:pPr>
-      <w:bookmarkStart w:id="3" w:name="_Toc244290207"/>
+      <w:bookmarkStart w:id="3" w:name="_Toc244294246"/>
       <w:r>
         <w:lastRenderedPageBreak/>
         <w:t>LỜI CAM ĐOAN</w:t>
@@ -2194,7 +2194,7 @@
         <w:keepNext w:val="0"/>
         <w:spacing w:before="0" w:after="320"/>
       </w:pPr>
-      <w:bookmarkStart w:id="4" w:name="_Toc244290208"/>
+      <w:bookmarkStart w:id="4" w:name="_Toc244294247"/>
       <w:r>
         <w:lastRenderedPageBreak/>
         <w:t>TÓM TẮT</w:t>
@@ -2282,7 +2282,7 @@
         </w:rPr>
         <w:fldChar w:fldCharType="separate"/>
       </w:r>
-      <w:hyperlink w:anchor="_Toc244290204" w:history="1">
+      <w:hyperlink w:anchor="_Toc244294243" w:history="1">
         <w:r>
           <w:rPr>
             <w:rStyle w:val="Hyperlink"/>
@@ -2309,7 +2309,7 @@
             <w:noProof/>
             <w:webHidden/>
           </w:rPr>
-          <w:instrText xml:space="preserve"> PAGEREF _Toc244290204 \h </w:instrText>
+          <w:instrText xml:space="preserve"> PAGEREF _Toc244294243 \h </w:instrText>
         </w:r>
         <w:r>
           <w:rPr>
@@ -2357,7 +2357,7 @@
           <w14:ligatures w14:val="standardContextual"/>
         </w:rPr>
       </w:pPr>
-      <w:hyperlink w:anchor="_Toc244290205" w:history="1">
+      <w:hyperlink w:anchor="_Toc244294244" w:history="1">
         <w:r>
           <w:rPr>
             <w:rStyle w:val="Hyperlink"/>
@@ -2384,7 +2384,7 @@
             <w:noProof/>
             <w:webHidden/>
           </w:rPr>
-          <w:instrText xml:space="preserve"> PAGEREF _Toc244290205 \h </w:instrText>
+          <w:instrText xml:space="preserve"> PAGEREF _Toc244294244 \h </w:instrText>
         </w:r>
         <w:r>
           <w:rPr>
@@ -2432,7 +2432,7 @@
           <w14:ligatures w14:val="standardContextual"/>
         </w:rPr>
       </w:pPr>
-      <w:hyperlink w:anchor="_Toc244290206" w:history="1">
+      <w:hyperlink w:anchor="_Toc244294245" w:history="1">
         <w:r>
           <w:rPr>
             <w:rStyle w:val="Hyperlink"/>
@@ -2459,7 +2459,7 @@
             <w:noProof/>
             <w:webHidden/>
           </w:rPr>
-          <w:instrText xml:space="preserve"> PAGEREF _Toc244290206 \h </w:instrText>
+          <w:instrText xml:space="preserve"> PAGEREF _Toc244294245 \h </w:instrText>
         </w:r>
         <w:r>
           <w:rPr>
@@ -2507,7 +2507,7 @@
           <w14:ligatures w14:val="standardContextual"/>
         </w:rPr>
       </w:pPr>
-      <w:hyperlink w:anchor="_Toc244290207" w:history="1">
+      <w:hyperlink w:anchor="_Toc244294246" w:history="1">
         <w:r>
           <w:rPr>
             <w:rStyle w:val="Hyperlink"/>
@@ -2534,7 +2534,7 @@
             <w:noProof/>
             <w:webHidden/>
           </w:rPr>
-          <w:instrText xml:space="preserve"> PAGEREF _Toc244290207 \h </w:instrText>
+          <w:instrText xml:space="preserve"> PAGEREF _Toc244294246 \h </w:instrText>
         </w:r>
         <w:r>
           <w:rPr>
@@ -2582,7 +2582,7 @@
           <w14:ligatures w14:val="standardContextual"/>
         </w:rPr>
       </w:pPr>
-      <w:hyperlink w:anchor="_Toc244290208" w:history="1">
+      <w:hyperlink w:anchor="_Toc244294247" w:history="1">
         <w:r>
           <w:rPr>
             <w:rStyle w:val="Hyperlink"/>
@@ -2609,7 +2609,7 @@
             <w:noProof/>
             <w:webHidden/>
           </w:rPr>
-          <w:instrText xml:space="preserve"> PAGEREF _Toc244290208 \h </w:instrText>
+          <w:instrText xml:space="preserve"> PAGEREF _Toc244294247 \h </w:instrText>
         </w:r>
         <w:r>
           <w:rPr>
@@ -2657,7 +2657,7 @@
           <w14:ligatures w14:val="standardContextual"/>
         </w:rPr>
       </w:pPr>
-      <w:hyperlink w:anchor="_Toc244290209" w:history="1">
+      <w:hyperlink w:anchor="_Toc244294248" w:history="1">
         <w:r>
           <w:rPr>
             <w:rStyle w:val="Hyperlink"/>
@@ -2684,7 +2684,7 @@
             <w:noProof/>
             <w:webHidden/>
           </w:rPr>
-          <w:instrText xml:space="preserve"> PAGEREF _Toc244290209 \h </w:instrText>
+          <w:instrText xml:space="preserve"> PAGEREF _Toc244294248 \h </w:instrText>
         </w:r>
         <w:r>
           <w:rPr>
@@ -2732,7 +2732,7 @@
           <w14:ligatures w14:val="standardContextual"/>
         </w:rPr>
       </w:pPr>
-      <w:hyperlink w:anchor="_Toc244290210" w:history="1">
+      <w:hyperlink w:anchor="_Toc244294249" w:history="1">
         <w:r>
           <w:rPr>
             <w:rStyle w:val="Hyperlink"/>
@@ -2759,7 +2759,7 @@
             <w:noProof/>
             <w:webHidden/>
           </w:rPr>
-          <w:instrText xml:space="preserve"> PAGEREF _Toc244290210 \h </w:instrText>
+          <w:instrText xml:space="preserve"> PAGEREF _Toc244294249 \h </w:instrText>
         </w:r>
         <w:r>
           <w:rPr>
@@ -2807,7 +2807,7 @@
           <w14:ligatures w14:val="standardContextual"/>
         </w:rPr>
       </w:pPr>
-      <w:hyperlink w:anchor="_Toc244290211" w:history="1">
+      <w:hyperlink w:anchor="_Toc244294250" w:history="1">
         <w:r>
           <w:rPr>
             <w:rStyle w:val="Hyperlink"/>
@@ -2834,7 +2834,7 @@
             <w:noProof/>
             <w:webHidden/>
           </w:rPr>
-          <w:instrText xml:space="preserve"> PAGEREF _Toc244290211 \h </w:instrText>
+          <w:instrText xml:space="preserve"> PAGEREF _Toc244294250 \h </w:instrText>
         </w:r>
         <w:r>
           <w:rPr>
@@ -2882,7 +2882,7 @@
           <w14:ligatures w14:val="standardContextual"/>
         </w:rPr>
       </w:pPr>
-      <w:hyperlink w:anchor="_Toc244290212" w:history="1">
+      <w:hyperlink w:anchor="_Toc244294251" w:history="1">
         <w:r>
           <w:rPr>
             <w:rStyle w:val="Hyperlink"/>
@@ -2909,7 +2909,7 @@
             <w:noProof/>
             <w:webHidden/>
           </w:rPr>
-          <w:instrText xml:space="preserve"> PAGEREF _Toc244290212 \h </w:instrText>
+          <w:instrText xml:space="preserve"> PAGEREF _Toc244294251 \h </w:instrText>
         </w:r>
         <w:r>
           <w:rPr>
@@ -2957,7 +2957,7 @@
           <w14:ligatures w14:val="standardContextual"/>
         </w:rPr>
       </w:pPr>
-      <w:hyperlink w:anchor="_Toc244290213" w:history="1">
+      <w:hyperlink w:anchor="_Toc244294252" w:history="1">
         <w:r>
           <w:rPr>
             <w:rStyle w:val="Hyperlink"/>
@@ -2984,7 +2984,7 @@
             <w:noProof/>
             <w:webHidden/>
           </w:rPr>
-          <w:instrText xml:space="preserve"> PAGEREF _Toc244290213 \h </w:instrText>
+          <w:instrText xml:space="preserve"> PAGEREF _Toc244294252 \h </w:instrText>
         </w:r>
         <w:r>
           <w:rPr>
@@ -3032,7 +3032,7 @@
           <w14:ligatures w14:val="standardContextual"/>
         </w:rPr>
       </w:pPr>
-      <w:hyperlink w:anchor="_Toc244290214" w:history="1">
+      <w:hyperlink w:anchor="_Toc244294253" w:history="1">
         <w:r>
           <w:rPr>
             <w:rStyle w:val="Hyperlink"/>
@@ -3059,7 +3059,7 @@
             <w:noProof/>
             <w:webHidden/>
           </w:rPr>
-          <w:instrText xml:space="preserve"> PAGEREF _Toc244290214 \h </w:instrText>
+          <w:instrText xml:space="preserve"> PAGEREF _Toc244294253 \h </w:instrText>
         </w:r>
         <w:r>
           <w:rPr>
@@ -3107,7 +3107,7 @@
           <w14:ligatures w14:val="standardContextual"/>
         </w:rPr>
       </w:pPr>
-      <w:hyperlink w:anchor="_Toc244290215" w:history="1">
+      <w:hyperlink w:anchor="_Toc244294254" w:history="1">
         <w:r>
           <w:rPr>
             <w:rStyle w:val="Hyperlink"/>
@@ -3134,7 +3134,7 @@
             <w:noProof/>
             <w:webHidden/>
           </w:rPr>
-          <w:instrText xml:space="preserve"> PAGEREF _Toc244290215 \h </w:instrText>
+          <w:instrText xml:space="preserve"> PAGEREF _Toc244294254 \h </w:instrText>
         </w:r>
         <w:r>
           <w:rPr>
@@ -3182,7 +3182,7 @@
           <w14:ligatures w14:val="standardContextual"/>
         </w:rPr>
       </w:pPr>
-      <w:hyperlink w:anchor="_Toc244290216" w:history="1">
+      <w:hyperlink w:anchor="_Toc244294255" w:history="1">
         <w:r>
           <w:rPr>
             <w:rStyle w:val="Hyperlink"/>
@@ -3209,7 +3209,7 @@
             <w:noProof/>
             <w:webHidden/>
           </w:rPr>
-          <w:instrText xml:space="preserve"> PAGEREF _Toc244290216 \h </w:instrText>
+          <w:instrText xml:space="preserve"> PAGEREF _Toc244294255 \h </w:instrText>
         </w:r>
         <w:r>
           <w:rPr>
@@ -3257,7 +3257,7 @@
           <w14:ligatures w14:val="standardContextual"/>
         </w:rPr>
       </w:pPr>
-      <w:hyperlink w:anchor="_Toc244290217" w:history="1">
+      <w:hyperlink w:anchor="_Toc244294256" w:history="1">
         <w:r>
           <w:rPr>
             <w:rStyle w:val="Hyperlink"/>
@@ -3284,7 +3284,7 @@
             <w:noProof/>
             <w:webHidden/>
           </w:rPr>
-          <w:instrText xml:space="preserve"> PAGEREF _Toc244290217 \h </w:instrText>
+          <w:instrText xml:space="preserve"> PAGEREF _Toc244294256 \h </w:instrText>
         </w:r>
         <w:r>
           <w:rPr>
@@ -3332,7 +3332,7 @@
           <w14:ligatures w14:val="standardContextual"/>
         </w:rPr>
       </w:pPr>
-      <w:hyperlink w:anchor="_Toc244290218" w:history="1">
+      <w:hyperlink w:anchor="_Toc244294257" w:history="1">
         <w:r>
           <w:rPr>
             <w:rStyle w:val="Hyperlink"/>
@@ -3359,7 +3359,7 @@
             <w:noProof/>
             <w:webHidden/>
           </w:rPr>
-          <w:instrText xml:space="preserve"> PAGEREF _Toc244290218 \h </w:instrText>
+          <w:instrText xml:space="preserve"> PAGEREF _Toc244294257 \h </w:instrText>
         </w:r>
         <w:r>
           <w:rPr>
@@ -3407,7 +3407,7 @@
           <w14:ligatures w14:val="standardContextual"/>
         </w:rPr>
       </w:pPr>
-      <w:hyperlink w:anchor="_Toc244290219" w:history="1">
+      <w:hyperlink w:anchor="_Toc244294258" w:history="1">
         <w:r>
           <w:rPr>
             <w:rStyle w:val="Hyperlink"/>
@@ -3434,7 +3434,7 @@
             <w:noProof/>
             <w:webHidden/>
           </w:rPr>
-          <w:instrText xml:space="preserve"> PAGEREF _Toc244290219 \h </w:instrText>
+          <w:instrText xml:space="preserve"> PAGEREF _Toc244294258 \h </w:instrText>
         </w:r>
         <w:r>
           <w:rPr>
@@ -3482,7 +3482,7 @@
           <w14:ligatures w14:val="standardContextual"/>
         </w:rPr>
       </w:pPr>
-      <w:hyperlink w:anchor="_Toc244290220" w:history="1">
+      <w:hyperlink w:anchor="_Toc244294259" w:history="1">
         <w:r>
           <w:rPr>
             <w:rStyle w:val="Hyperlink"/>
@@ -3509,7 +3509,7 @@
             <w:noProof/>
             <w:webHidden/>
           </w:rPr>
-          <w:instrText xml:space="preserve"> PAGEREF _Toc244290220 \h </w:instrText>
+          <w:instrText xml:space="preserve"> PAGEREF _Toc244294259 \h </w:instrText>
         </w:r>
         <w:r>
           <w:rPr>
@@ -3557,7 +3557,7 @@
           <w14:ligatures w14:val="standardContextual"/>
         </w:rPr>
       </w:pPr>
-      <w:hyperlink w:anchor="_Toc244290221" w:history="1">
+      <w:hyperlink w:anchor="_Toc244294260" w:history="1">
         <w:r>
           <w:rPr>
             <w:rStyle w:val="Hyperlink"/>
@@ -3584,7 +3584,7 @@
             <w:noProof/>
             <w:webHidden/>
           </w:rPr>
-          <w:instrText xml:space="preserve"> PAGEREF _Toc244290221 \h </w:instrText>
+          <w:instrText xml:space="preserve"> PAGEREF _Toc244294260 \h </w:instrText>
         </w:r>
         <w:r>
           <w:rPr>
@@ -3632,7 +3632,7 @@
           <w14:ligatures w14:val="standardContextual"/>
         </w:rPr>
       </w:pPr>
-      <w:hyperlink w:anchor="_Toc244290222" w:history="1">
+      <w:hyperlink w:anchor="_Toc244294261" w:history="1">
         <w:r>
           <w:rPr>
             <w:rStyle w:val="Hyperlink"/>
@@ -3659,7 +3659,7 @@
             <w:noProof/>
             <w:webHidden/>
           </w:rPr>
-          <w:instrText xml:space="preserve"> PAGEREF _Toc244290222 \h </w:instrText>
+          <w:instrText xml:space="preserve"> PAGEREF _Toc244294261 \h </w:instrText>
         </w:r>
         <w:r>
           <w:rPr>
@@ -3707,7 +3707,7 @@
           <w14:ligatures w14:val="standardContextual"/>
         </w:rPr>
       </w:pPr>
-      <w:hyperlink w:anchor="_Toc244290223" w:history="1">
+      <w:hyperlink w:anchor="_Toc244294262" w:history="1">
         <w:r>
           <w:rPr>
             <w:rStyle w:val="Hyperlink"/>
@@ -3734,7 +3734,7 @@
             <w:noProof/>
             <w:webHidden/>
           </w:rPr>
-          <w:instrText xml:space="preserve"> PAGEREF _Toc244290223 \h </w:instrText>
+          <w:instrText xml:space="preserve"> PAGEREF _Toc244294262 \h </w:instrText>
         </w:r>
         <w:r>
           <w:rPr>
@@ -3782,7 +3782,7 @@
           <w14:ligatures w14:val="standardContextual"/>
         </w:rPr>
       </w:pPr>
-      <w:hyperlink w:anchor="_Toc244290224" w:history="1">
+      <w:hyperlink w:anchor="_Toc244294263" w:history="1">
         <w:r>
           <w:rPr>
             <w:rStyle w:val="Hyperlink"/>
@@ -3809,7 +3809,7 @@
             <w:noProof/>
             <w:webHidden/>
           </w:rPr>
-          <w:instrText xml:space="preserve"> PAGEREF _Toc244290224 \h </w:instrText>
+          <w:instrText xml:space="preserve"> PAGEREF _Toc244294263 \h </w:instrText>
         </w:r>
         <w:r>
           <w:rPr>
@@ -3857,7 +3857,7 @@
           <w14:ligatures w14:val="standardContextual"/>
         </w:rPr>
       </w:pPr>
-      <w:hyperlink w:anchor="_Toc244290225" w:history="1">
+      <w:hyperlink w:anchor="_Toc244294264" w:history="1">
         <w:r>
           <w:rPr>
             <w:rStyle w:val="Hyperlink"/>
@@ -3884,7 +3884,7 @@
             <w:noProof/>
             <w:webHidden/>
           </w:rPr>
-          <w:instrText xml:space="preserve"> PAGEREF _Toc244290225 \h </w:instrText>
+          <w:instrText xml:space="preserve"> PAGEREF _Toc244294264 \h </w:instrText>
         </w:r>
         <w:r>
           <w:rPr>
@@ -3932,7 +3932,7 @@
           <w14:ligatures w14:val="standardContextual"/>
         </w:rPr>
       </w:pPr>
-      <w:hyperlink w:anchor="_Toc244290226" w:history="1">
+      <w:hyperlink w:anchor="_Toc244294265" w:history="1">
         <w:r>
           <w:rPr>
             <w:rStyle w:val="Hyperlink"/>
@@ -3959,7 +3959,7 @@
             <w:noProof/>
             <w:webHidden/>
           </w:rPr>
-          <w:instrText xml:space="preserve"> PAGEREF _Toc244290226 \h </w:instrText>
+          <w:instrText xml:space="preserve"> PAGEREF _Toc244294265 \h </w:instrText>
         </w:r>
         <w:r>
           <w:rPr>
@@ -4007,7 +4007,7 @@
           <w14:ligatures w14:val="standardContextual"/>
         </w:rPr>
       </w:pPr>
-      <w:hyperlink w:anchor="_Toc244290227" w:history="1">
+      <w:hyperlink w:anchor="_Toc244294266" w:history="1">
         <w:r>
           <w:rPr>
             <w:rStyle w:val="Hyperlink"/>
@@ -4034,7 +4034,7 @@
             <w:noProof/>
             <w:webHidden/>
           </w:rPr>
-          <w:instrText xml:space="preserve"> PAGEREF _Toc244290227 \h </w:instrText>
+          <w:instrText xml:space="preserve"> PAGEREF _Toc244294266 \h </w:instrText>
         </w:r>
         <w:r>
           <w:rPr>
@@ -4082,7 +4082,7 @@
           <w14:ligatures w14:val="standardContextual"/>
         </w:rPr>
       </w:pPr>
-      <w:hyperlink w:anchor="_Toc244290228" w:history="1">
+      <w:hyperlink w:anchor="_Toc244294267" w:history="1">
         <w:r>
           <w:rPr>
             <w:rStyle w:val="Hyperlink"/>
@@ -4109,7 +4109,7 @@
             <w:noProof/>
             <w:webHidden/>
           </w:rPr>
-          <w:instrText xml:space="preserve"> PAGEREF _Toc244290228 \h </w:instrText>
+          <w:instrText xml:space="preserve"> PAGEREF _Toc244294267 \h </w:instrText>
         </w:r>
         <w:r>
           <w:rPr>
@@ -4157,7 +4157,7 @@
           <w14:ligatures w14:val="standardContextual"/>
         </w:rPr>
       </w:pPr>
-      <w:hyperlink w:anchor="_Toc244290229" w:history="1">
+      <w:hyperlink w:anchor="_Toc244294268" w:history="1">
         <w:r>
           <w:rPr>
             <w:rStyle w:val="Hyperlink"/>
@@ -4184,7 +4184,7 @@
             <w:noProof/>
             <w:webHidden/>
           </w:rPr>
-          <w:instrText xml:space="preserve"> PAGEREF _Toc244290229 \h </w:instrText>
+          <w:instrText xml:space="preserve"> PAGEREF _Toc244294268 \h </w:instrText>
         </w:r>
         <w:r>
           <w:rPr>
@@ -4232,7 +4232,7 @@
           <w14:ligatures w14:val="standardContextual"/>
         </w:rPr>
       </w:pPr>
-      <w:hyperlink w:anchor="_Toc244290230" w:history="1">
+      <w:hyperlink w:anchor="_Toc244294269" w:history="1">
         <w:r>
           <w:rPr>
             <w:rStyle w:val="Hyperlink"/>
@@ -4259,7 +4259,7 @@
             <w:noProof/>
             <w:webHidden/>
           </w:rPr>
-          <w:instrText xml:space="preserve"> PAGEREF _Toc244290230 \h </w:instrText>
+          <w:instrText xml:space="preserve"> PAGEREF _Toc244294269 \h </w:instrText>
         </w:r>
         <w:r>
           <w:rPr>
@@ -4307,7 +4307,7 @@
           <w14:ligatures w14:val="standardContextual"/>
         </w:rPr>
       </w:pPr>
-      <w:hyperlink w:anchor="_Toc244290231" w:history="1">
+      <w:hyperlink w:anchor="_Toc244294270" w:history="1">
         <w:r>
           <w:rPr>
             <w:rStyle w:val="Hyperlink"/>
@@ -4334,7 +4334,7 @@
             <w:noProof/>
             <w:webHidden/>
           </w:rPr>
-          <w:instrText xml:space="preserve"> PAGEREF _Toc244290231 \h </w:instrText>
+          <w:instrText xml:space="preserve"> PAGEREF _Toc244294270 \h </w:instrText>
         </w:r>
         <w:r>
           <w:rPr>
@@ -4382,7 +4382,7 @@
           <w14:ligatures w14:val="standardContextual"/>
         </w:rPr>
       </w:pPr>
-      <w:hyperlink w:anchor="_Toc244290232" w:history="1">
+      <w:hyperlink w:anchor="_Toc244294271" w:history="1">
         <w:r>
           <w:rPr>
             <w:rStyle w:val="Hyperlink"/>
@@ -4409,7 +4409,7 @@
             <w:noProof/>
             <w:webHidden/>
           </w:rPr>
-          <w:instrText xml:space="preserve"> PAGEREF _Toc244290232 \h </w:instrText>
+          <w:instrText xml:space="preserve"> PAGEREF _Toc244294271 \h </w:instrText>
         </w:r>
         <w:r>
           <w:rPr>
@@ -4457,7 +4457,7 @@
           <w14:ligatures w14:val="standardContextual"/>
         </w:rPr>
       </w:pPr>
-      <w:hyperlink w:anchor="_Toc244290233" w:history="1">
+      <w:hyperlink w:anchor="_Toc244294272" w:history="1">
         <w:r>
           <w:rPr>
             <w:rStyle w:val="Hyperlink"/>
@@ -4484,7 +4484,7 @@
             <w:noProof/>
             <w:webHidden/>
           </w:rPr>
-          <w:instrText xml:space="preserve"> PAGEREF _Toc244290233 \h </w:instrText>
+          <w:instrText xml:space="preserve"> PAGEREF _Toc244294272 \h </w:instrText>
         </w:r>
         <w:r>
           <w:rPr>
@@ -4532,7 +4532,7 @@
           <w14:ligatures w14:val="standardContextual"/>
         </w:rPr>
       </w:pPr>
-      <w:hyperlink w:anchor="_Toc244290234" w:history="1">
+      <w:hyperlink w:anchor="_Toc244294273" w:history="1">
         <w:r>
           <w:rPr>
             <w:rStyle w:val="Hyperlink"/>
@@ -4559,7 +4559,7 @@
             <w:noProof/>
             <w:webHidden/>
           </w:rPr>
-          <w:instrText xml:space="preserve"> PAGEREF _Toc244290234 \h </w:instrText>
+          <w:instrText xml:space="preserve"> PAGEREF _Toc244294273 \h </w:instrText>
         </w:r>
         <w:r>
           <w:rPr>
@@ -4607,7 +4607,7 @@
           <w14:ligatures w14:val="standardContextual"/>
         </w:rPr>
       </w:pPr>
-      <w:hyperlink w:anchor="_Toc244290235" w:history="1">
+      <w:hyperlink w:anchor="_Toc244294274" w:history="1">
         <w:r>
           <w:rPr>
             <w:rStyle w:val="Hyperlink"/>
@@ -4634,7 +4634,7 @@
             <w:noProof/>
             <w:webHidden/>
           </w:rPr>
-          <w:instrText xml:space="preserve"> PAGEREF _Toc244290235 \h </w:instrText>
+          <w:instrText xml:space="preserve"> PAGEREF _Toc244294274 \h </w:instrText>
         </w:r>
         <w:r>
           <w:rPr>
@@ -4682,7 +4682,7 @@
           <w14:ligatures w14:val="standardContextual"/>
         </w:rPr>
       </w:pPr>
-      <w:hyperlink w:anchor="_Toc244290236" w:history="1">
+      <w:hyperlink w:anchor="_Toc244294275" w:history="1">
         <w:r>
           <w:rPr>
             <w:rStyle w:val="Hyperlink"/>
@@ -4709,7 +4709,7 @@
             <w:noProof/>
             <w:webHidden/>
           </w:rPr>
-          <w:instrText xml:space="preserve"> PAGEREF _Toc244290236 \h </w:instrText>
+          <w:instrText xml:space="preserve"> PAGEREF _Toc244294275 \h </w:instrText>
         </w:r>
         <w:r>
           <w:rPr>
@@ -4757,7 +4757,7 @@
           <w14:ligatures w14:val="standardContextual"/>
         </w:rPr>
       </w:pPr>
-      <w:hyperlink w:anchor="_Toc244290237" w:history="1">
+      <w:hyperlink w:anchor="_Toc244294276" w:history="1">
         <w:r>
           <w:rPr>
             <w:rStyle w:val="Hyperlink"/>
@@ -4784,7 +4784,7 @@
             <w:noProof/>
             <w:webHidden/>
           </w:rPr>
-          <w:instrText xml:space="preserve"> PAGEREF _Toc244290237 \h </w:instrText>
+          <w:instrText xml:space="preserve"> PAGEREF _Toc244294276 \h </w:instrText>
         </w:r>
         <w:r>
           <w:rPr>
@@ -4832,7 +4832,7 @@
           <w14:ligatures w14:val="standardContextual"/>
         </w:rPr>
       </w:pPr>
-      <w:hyperlink w:anchor="_Toc244290238" w:history="1">
+      <w:hyperlink w:anchor="_Toc244294277" w:history="1">
         <w:r>
           <w:rPr>
             <w:rStyle w:val="Hyperlink"/>
@@ -4859,7 +4859,7 @@
             <w:noProof/>
             <w:webHidden/>
           </w:rPr>
-          <w:instrText xml:space="preserve"> PAGEREF _Toc244290238 \h </w:instrText>
+          <w:instrText xml:space="preserve"> PAGEREF _Toc244294277 \h </w:instrText>
         </w:r>
         <w:r>
           <w:rPr>
@@ -4907,7 +4907,7 @@
           <w14:ligatures w14:val="standardContextual"/>
         </w:rPr>
       </w:pPr>
-      <w:hyperlink w:anchor="_Toc244290239" w:history="1">
+      <w:hyperlink w:anchor="_Toc244294278" w:history="1">
         <w:r>
           <w:rPr>
             <w:rStyle w:val="Hyperlink"/>
@@ -4934,7 +4934,7 @@
             <w:noProof/>
             <w:webHidden/>
           </w:rPr>
-          <w:instrText xml:space="preserve"> PAGEREF _Toc244290239 \h </w:instrText>
+          <w:instrText xml:space="preserve"> PAGEREF _Toc244294278 \h </w:instrText>
         </w:r>
         <w:r>
           <w:rPr>
@@ -4982,7 +4982,7 @@
           <w14:ligatures w14:val="standardContextual"/>
         </w:rPr>
       </w:pPr>
-      <w:hyperlink w:anchor="_Toc244290240" w:history="1">
+      <w:hyperlink w:anchor="_Toc244294279" w:history="1">
         <w:r>
           <w:rPr>
             <w:rStyle w:val="Hyperlink"/>
@@ -5009,7 +5009,7 @@
             <w:noProof/>
             <w:webHidden/>
           </w:rPr>
-          <w:instrText xml:space="preserve"> PAGEREF _Toc244290240 \h </w:instrText>
+          <w:instrText xml:space="preserve"> PAGEREF _Toc244294279 \h </w:instrText>
         </w:r>
         <w:r>
           <w:rPr>
@@ -5057,7 +5057,7 @@
           <w14:ligatures w14:val="standardContextual"/>
         </w:rPr>
       </w:pPr>
-      <w:hyperlink w:anchor="_Toc244290241" w:history="1">
+      <w:hyperlink w:anchor="_Toc244294280" w:history="1">
         <w:r>
           <w:rPr>
             <w:rStyle w:val="Hyperlink"/>
@@ -5084,7 +5084,7 @@
             <w:noProof/>
             <w:webHidden/>
           </w:rPr>
-          <w:instrText xml:space="preserve"> PAGEREF _Toc244290241 \h </w:instrText>
+          <w:instrText xml:space="preserve"> PAGEREF _Toc244294280 \h </w:instrText>
         </w:r>
         <w:r>
           <w:rPr>
@@ -5132,7 +5132,7 @@
           <w14:ligatures w14:val="standardContextual"/>
         </w:rPr>
       </w:pPr>
-      <w:hyperlink w:anchor="_Toc244290242" w:history="1">
+      <w:hyperlink w:anchor="_Toc244294281" w:history="1">
         <w:r>
           <w:rPr>
             <w:rStyle w:val="Hyperlink"/>
@@ -5159,7 +5159,7 @@
             <w:noProof/>
             <w:webHidden/>
           </w:rPr>
-          <w:instrText xml:space="preserve"> PAGEREF _Toc244290242 \h </w:instrText>
+          <w:instrText xml:space="preserve"> PAGEREF _Toc244294281 \h </w:instrText>
         </w:r>
         <w:r>
           <w:rPr>
@@ -5207,7 +5207,7 @@
           <w14:ligatures w14:val="standardContextual"/>
         </w:rPr>
       </w:pPr>
-      <w:hyperlink w:anchor="_Toc244290243" w:history="1">
+      <w:hyperlink w:anchor="_Toc244294282" w:history="1">
         <w:r>
           <w:rPr>
             <w:rStyle w:val="Hyperlink"/>
@@ -5234,7 +5234,7 @@
             <w:noProof/>
             <w:webHidden/>
           </w:rPr>
-          <w:instrText xml:space="preserve"> PAGEREF _Toc244290243 \h </w:instrText>
+          <w:instrText xml:space="preserve"> PAGEREF _Toc244294282 \h </w:instrText>
         </w:r>
         <w:r>
           <w:rPr>
@@ -5282,7 +5282,7 @@
           <w14:ligatures w14:val="standardContextual"/>
         </w:rPr>
       </w:pPr>
-      <w:hyperlink w:anchor="_Toc244290244" w:history="1">
+      <w:hyperlink w:anchor="_Toc244294283" w:history="1">
         <w:r>
           <w:rPr>
             <w:rStyle w:val="Hyperlink"/>
@@ -5309,7 +5309,7 @@
             <w:noProof/>
             <w:webHidden/>
           </w:rPr>
-          <w:instrText xml:space="preserve"> PAGEREF _Toc244290244 \h </w:instrText>
+          <w:instrText xml:space="preserve"> PAGEREF _Toc244294283 \h </w:instrText>
         </w:r>
         <w:r>
           <w:rPr>
@@ -5329,7 +5329,7 @@
             <w:noProof/>
             <w:webHidden/>
           </w:rPr>
-          <w:t>3</w:t>
+          <w:t>4</w:t>
         </w:r>
         <w:r>
           <w:rPr>
@@ -5357,7 +5357,7 @@
           <w14:ligatures w14:val="standardContextual"/>
         </w:rPr>
       </w:pPr>
-      <w:hyperlink w:anchor="_Toc244290245" w:history="1">
+      <w:hyperlink w:anchor="_Toc244294284" w:history="1">
         <w:r>
           <w:rPr>
             <w:rStyle w:val="Hyperlink"/>
@@ -5384,7 +5384,7 @@
             <w:noProof/>
             <w:webHidden/>
           </w:rPr>
-          <w:instrText xml:space="preserve"> PAGEREF _Toc244290245 \h </w:instrText>
+          <w:instrText xml:space="preserve"> PAGEREF _Toc244294284 \h </w:instrText>
         </w:r>
         <w:r>
           <w:rPr>
@@ -5404,7 +5404,7 @@
             <w:noProof/>
             <w:webHidden/>
           </w:rPr>
-          <w:t>4</w:t>
+          <w:t>5</w:t>
         </w:r>
         <w:r>
           <w:rPr>
@@ -5696,7 +5696,7 @@
         </w:rPr>
         <w:fldChar w:fldCharType="separate"/>
       </w:r>
-      <w:hyperlink w:anchor="_Toc244290246" w:history="1">
+      <w:hyperlink w:anchor="_Toc244294285" w:history="1">
         <w:r>
           <w:rPr>
             <w:rStyle w:val="Hyperlink"/>
@@ -5723,7 +5723,7 @@
             <w:noProof/>
             <w:webHidden/>
           </w:rPr>
-          <w:instrText xml:space="preserve"> PAGEREF _Toc244290246 \h </w:instrText>
+          <w:instrText xml:space="preserve"> PAGEREF _Toc244294285 \h </w:instrText>
         </w:r>
         <w:r>
           <w:rPr>
@@ -5771,7 +5771,7 @@
           <w14:ligatures w14:val="standardContextual"/>
         </w:rPr>
       </w:pPr>
-      <w:hyperlink w:anchor="_Toc244290247" w:history="1">
+      <w:hyperlink w:anchor="_Toc244294286" w:history="1">
         <w:r>
           <w:rPr>
             <w:rStyle w:val="Hyperlink"/>
@@ -5798,7 +5798,7 @@
             <w:noProof/>
             <w:webHidden/>
           </w:rPr>
-          <w:instrText xml:space="preserve"> PAGEREF _Toc244290247 \h </w:instrText>
+          <w:instrText xml:space="preserve"> PAGEREF _Toc244294286 \h </w:instrText>
         </w:r>
         <w:r>
           <w:rPr>
@@ -5846,7 +5846,7 @@
           <w14:ligatures w14:val="standardContextual"/>
         </w:rPr>
       </w:pPr>
-      <w:hyperlink w:anchor="_Toc244290248" w:history="1">
+      <w:hyperlink w:anchor="_Toc244294287" w:history="1">
         <w:r>
           <w:rPr>
             <w:rStyle w:val="Hyperlink"/>
@@ -5873,7 +5873,7 @@
             <w:noProof/>
             <w:webHidden/>
           </w:rPr>
-          <w:instrText xml:space="preserve"> PAGEREF _Toc244290248 \h </w:instrText>
+          <w:instrText xml:space="preserve"> PAGEREF _Toc244294287 \h </w:instrText>
         </w:r>
         <w:r>
           <w:rPr>
@@ -5921,7 +5921,7 @@
           <w14:ligatures w14:val="standardContextual"/>
         </w:rPr>
       </w:pPr>
-      <w:hyperlink w:anchor="_Toc244290249" w:history="1">
+      <w:hyperlink w:anchor="_Toc244294288" w:history="1">
         <w:r>
           <w:rPr>
             <w:rStyle w:val="Hyperlink"/>
@@ -5948,7 +5948,7 @@
             <w:noProof/>
             <w:webHidden/>
           </w:rPr>
-          <w:instrText xml:space="preserve"> PAGEREF _Toc244290249 \h </w:instrText>
+          <w:instrText xml:space="preserve"> PAGEREF _Toc244294288 \h </w:instrText>
         </w:r>
         <w:r>
           <w:rPr>
@@ -5996,7 +5996,7 @@
           <w14:ligatures w14:val="standardContextual"/>
         </w:rPr>
       </w:pPr>
-      <w:hyperlink w:anchor="_Toc244290250" w:history="1">
+      <w:hyperlink w:anchor="_Toc244294289" w:history="1">
         <w:r>
           <w:rPr>
             <w:rStyle w:val="Hyperlink"/>
@@ -6023,7 +6023,7 @@
             <w:noProof/>
             <w:webHidden/>
           </w:rPr>
-          <w:instrText xml:space="preserve"> PAGEREF _Toc244290250 \h </w:instrText>
+          <w:instrText xml:space="preserve"> PAGEREF _Toc244294289 \h </w:instrText>
         </w:r>
         <w:r>
           <w:rPr>
@@ -6071,7 +6071,7 @@
           <w14:ligatures w14:val="standardContextual"/>
         </w:rPr>
       </w:pPr>
-      <w:hyperlink w:anchor="_Toc244290251" w:history="1">
+      <w:hyperlink w:anchor="_Toc244294290" w:history="1">
         <w:r>
           <w:rPr>
             <w:rStyle w:val="Hyperlink"/>
@@ -6098,7 +6098,7 @@
             <w:noProof/>
             <w:webHidden/>
           </w:rPr>
-          <w:instrText xml:space="preserve"> PAGEREF _Toc244290251 \h </w:instrText>
+          <w:instrText xml:space="preserve"> PAGEREF _Toc244294290 \h </w:instrText>
         </w:r>
         <w:r>
           <w:rPr>
@@ -6146,7 +6146,7 @@
           <w14:ligatures w14:val="standardContextual"/>
         </w:rPr>
       </w:pPr>
-      <w:hyperlink w:anchor="_Toc244290252" w:history="1">
+      <w:hyperlink w:anchor="_Toc244294291" w:history="1">
         <w:r>
           <w:rPr>
             <w:rStyle w:val="Hyperlink"/>
@@ -6173,7 +6173,7 @@
             <w:noProof/>
             <w:webHidden/>
           </w:rPr>
-          <w:instrText xml:space="preserve"> PAGEREF _Toc244290252 \h </w:instrText>
+          <w:instrText xml:space="preserve"> PAGEREF _Toc244294291 \h </w:instrText>
         </w:r>
         <w:r>
           <w:rPr>
@@ -6221,7 +6221,7 @@
           <w14:ligatures w14:val="standardContextual"/>
         </w:rPr>
       </w:pPr>
-      <w:hyperlink w:anchor="_Toc244290253" w:history="1">
+      <w:hyperlink w:anchor="_Toc244294292" w:history="1">
         <w:r>
           <w:rPr>
             <w:rStyle w:val="Hyperlink"/>
@@ -6248,7 +6248,7 @@
             <w:noProof/>
             <w:webHidden/>
           </w:rPr>
-          <w:instrText xml:space="preserve"> PAGEREF _Toc244290253 \h </w:instrText>
+          <w:instrText xml:space="preserve"> PAGEREF _Toc244294292 \h </w:instrText>
         </w:r>
         <w:r>
           <w:rPr>
@@ -6296,7 +6296,7 @@
           <w14:ligatures w14:val="standardContextual"/>
         </w:rPr>
       </w:pPr>
-      <w:hyperlink w:anchor="_Toc244290254" w:history="1">
+      <w:hyperlink w:anchor="_Toc244294293" w:history="1">
         <w:r>
           <w:rPr>
             <w:rStyle w:val="Hyperlink"/>
@@ -6323,7 +6323,7 @@
             <w:noProof/>
             <w:webHidden/>
           </w:rPr>
-          <w:instrText xml:space="preserve"> PAGEREF _Toc244290254 \h </w:instrText>
+          <w:instrText xml:space="preserve"> PAGEREF _Toc244294293 \h </w:instrText>
         </w:r>
         <w:r>
           <w:rPr>
@@ -6371,7 +6371,7 @@
           <w14:ligatures w14:val="standardContextual"/>
         </w:rPr>
       </w:pPr>
-      <w:hyperlink w:anchor="_Toc244290255" w:history="1">
+      <w:hyperlink w:anchor="_Toc244294294" w:history="1">
         <w:r>
           <w:rPr>
             <w:rStyle w:val="Hyperlink"/>
@@ -6398,7 +6398,7 @@
             <w:noProof/>
             <w:webHidden/>
           </w:rPr>
-          <w:instrText xml:space="preserve"> PAGEREF _Toc244290255 \h </w:instrText>
+          <w:instrText xml:space="preserve"> PAGEREF _Toc244294294 \h </w:instrText>
         </w:r>
         <w:r>
           <w:rPr>
@@ -6446,7 +6446,7 @@
           <w14:ligatures w14:val="standardContextual"/>
         </w:rPr>
       </w:pPr>
-      <w:hyperlink w:anchor="_Toc244290256" w:history="1">
+      <w:hyperlink w:anchor="_Toc244294295" w:history="1">
         <w:r>
           <w:rPr>
             <w:rStyle w:val="Hyperlink"/>
@@ -6473,7 +6473,7 @@
             <w:noProof/>
             <w:webHidden/>
           </w:rPr>
-          <w:instrText xml:space="preserve"> PAGEREF _Toc244290256 \h </w:instrText>
+          <w:instrText xml:space="preserve"> PAGEREF _Toc244294295 \h </w:instrText>
         </w:r>
         <w:r>
           <w:rPr>
@@ -6521,7 +6521,7 @@
           <w14:ligatures w14:val="standardContextual"/>
         </w:rPr>
       </w:pPr>
-      <w:hyperlink w:anchor="_Toc244290257" w:history="1">
+      <w:hyperlink w:anchor="_Toc244294296" w:history="1">
         <w:r>
           <w:rPr>
             <w:rStyle w:val="Hyperlink"/>
@@ -6548,7 +6548,7 @@
             <w:noProof/>
             <w:webHidden/>
           </w:rPr>
-          <w:instrText xml:space="preserve"> PAGEREF _Toc244290257 \h </w:instrText>
+          <w:instrText xml:space="preserve"> PAGEREF _Toc244294296 \h </w:instrText>
         </w:r>
         <w:r>
           <w:rPr>
@@ -6596,7 +6596,7 @@
           <w14:ligatures w14:val="standardContextual"/>
         </w:rPr>
       </w:pPr>
-      <w:hyperlink w:anchor="_Toc244290258" w:history="1">
+      <w:hyperlink w:anchor="_Toc244294297" w:history="1">
         <w:r>
           <w:rPr>
             <w:rStyle w:val="Hyperlink"/>
@@ -6623,7 +6623,7 @@
             <w:noProof/>
             <w:webHidden/>
           </w:rPr>
-          <w:instrText xml:space="preserve"> PAGEREF _Toc244290258 \h </w:instrText>
+          <w:instrText xml:space="preserve"> PAGEREF _Toc244294297 \h </w:instrText>
         </w:r>
         <w:r>
           <w:rPr>
@@ -6671,7 +6671,7 @@
           <w14:ligatures w14:val="standardContextual"/>
         </w:rPr>
       </w:pPr>
-      <w:hyperlink w:anchor="_Toc244290259" w:history="1">
+      <w:hyperlink w:anchor="_Toc244294298" w:history="1">
         <w:r>
           <w:rPr>
             <w:rStyle w:val="Hyperlink"/>
@@ -6698,7 +6698,7 @@
             <w:noProof/>
             <w:webHidden/>
           </w:rPr>
-          <w:instrText xml:space="preserve"> PAGEREF _Toc244290259 \h </w:instrText>
+          <w:instrText xml:space="preserve"> PAGEREF _Toc244294298 \h </w:instrText>
         </w:r>
         <w:r>
           <w:rPr>
@@ -6746,7 +6746,7 @@
           <w14:ligatures w14:val="standardContextual"/>
         </w:rPr>
       </w:pPr>
-      <w:hyperlink w:anchor="_Toc244290260" w:history="1">
+      <w:hyperlink w:anchor="_Toc244294299" w:history="1">
         <w:r>
           <w:rPr>
             <w:rStyle w:val="Hyperlink"/>
@@ -6773,7 +6773,7 @@
             <w:noProof/>
             <w:webHidden/>
           </w:rPr>
-          <w:instrText xml:space="preserve"> PAGEREF _Toc244290260 \h </w:instrText>
+          <w:instrText xml:space="preserve"> PAGEREF _Toc244294299 \h </w:instrText>
         </w:r>
         <w:r>
           <w:rPr>
@@ -6793,7 +6793,7 @@
             <w:noProof/>
             <w:webHidden/>
           </w:rPr>
-          <w:t>4</w:t>
+          <w:t>5</w:t>
         </w:r>
         <w:r>
           <w:rPr>
@@ -7082,11 +7082,7 @@
         </w:rPr>
       </w:pPr>
       <w:r>
-        <w:t>Hình 4.10 CLONE — ảnh A10 chờ clone sạch và chạy lại sau khi đồng bộ mã</w:t>
-      </w:r>
-      <w:r>
-        <w:tab/>
-        <w:t>36</w:t>
+        <w:t>Hình 4.10 CLONE — minh chứng A10 chưa có ảnh chụp; log clone sạch được liệt kê tại phụ lục B</w:t>
       </w:r>
     </w:p>
     <w:p>
@@ -7107,11 +7103,7 @@
         </w:rPr>
       </w:pPr>
       <w:r>
-        <w:t>Hình 4.11 GITHUB — ảnh A11 chờ chụp repo riêng và commit thật</w:t>
-      </w:r>
-      <w:r>
-        <w:tab/>
-        <w:t>37</w:t>
+        <w:t>Hình 4.11 GITHUB — minh chứng A11 chưa có ảnh chụp; URL và commit thật ghi tại mục 4.9</w:t>
       </w:r>
     </w:p>
     <w:p/>
@@ -7133,7 +7125,7 @@
         <w:keepNext w:val="0"/>
         <w:spacing w:before="0" w:after="320"/>
       </w:pPr>
-      <w:bookmarkStart w:id="5" w:name="_Toc244290209"/>
+      <w:bookmarkStart w:id="5" w:name="_Toc244294248"/>
       <w:r>
         <w:lastRenderedPageBreak/>
         <w:t>CHƯƠNG 1. TỔNG QUAN ĐỀ TÀI</w:t>
@@ -7144,7 +7136,7 @@
       <w:pPr>
         <w:pStyle w:val="Heading2"/>
       </w:pPr>
-      <w:bookmarkStart w:id="6" w:name="_Toc244290210"/>
+      <w:bookmarkStart w:id="6" w:name="_Toc244294249"/>
       <w:r>
         <w:t>1.1. Bài toán và lý do thực hiện</w:t>
       </w:r>
@@ -7162,7 +7154,7 @@
       <w:pPr>
         <w:pStyle w:val="Heading2"/>
       </w:pPr>
-      <w:bookmarkStart w:id="7" w:name="_Toc244290211"/>
+      <w:bookmarkStart w:id="7" w:name="_Toc244294250"/>
       <w:r>
         <w:t>1.2. Mục tiêu và sản phẩm</w:t>
       </w:r>
@@ -7180,7 +7172,7 @@
       <w:pPr>
         <w:pStyle w:val="Heading2"/>
       </w:pPr>
-      <w:bookmarkStart w:id="8" w:name="_Toc244290212"/>
+      <w:bookmarkStart w:id="8" w:name="_Toc244294251"/>
       <w:r>
         <w:t>1.3. Phạm vi, đầu vào và đầu ra</w:t>
       </w:r>
@@ -7224,7 +7216,7 @@
         <w:spacing w:before="0" w:after="100" w:line="269" w:lineRule="auto"/>
         <w:jc w:val="left"/>
       </w:pPr>
-      <w:bookmarkStart w:id="9" w:name="_Toc244290246"/>
+      <w:bookmarkStart w:id="9" w:name="_Toc244294285"/>
       <w:r>
         <w:t>Bảng 1.1 Đặc tả dữ liệu vào</w:t>
       </w:r>
@@ -7649,7 +7641,7 @@
         <w:spacing w:before="0" w:after="100" w:line="269" w:lineRule="auto"/>
         <w:jc w:val="left"/>
       </w:pPr>
-      <w:bookmarkStart w:id="10" w:name="_Toc244290247"/>
+      <w:bookmarkStart w:id="10" w:name="_Toc244294286"/>
       <w:r>
         <w:lastRenderedPageBreak/>
         <w:t>Bảng 1.2 Đặc tả kết quả đầu ra</w:t>
@@ -7986,7 +7978,7 @@
       <w:pPr>
         <w:pStyle w:val="Heading2"/>
       </w:pPr>
-      <w:bookmarkStart w:id="11" w:name="_Toc244290213"/>
+      <w:bookmarkStart w:id="11" w:name="_Toc244294252"/>
       <w:r>
         <w:t>1.4. Cách thực hiện và cấu trúc báo cáo</w:t>
       </w:r>
@@ -8023,7 +8015,7 @@
         <w:pStyle w:val="Chthchbng"/>
         <w:spacing w:before="80" w:after="100" w:line="269" w:lineRule="auto"/>
       </w:pPr>
-      <w:bookmarkStart w:id="12" w:name="_Toc244290248"/>
+      <w:bookmarkStart w:id="12" w:name="_Toc244294287"/>
       <w:r>
         <w:t>Bảng 1.3 Đối chiếu yêu cầu và sản phẩm</w:t>
       </w:r>
@@ -8367,7 +8359,7 @@
           <w:lang w:val="en-US"/>
         </w:rPr>
       </w:pPr>
-      <w:bookmarkStart w:id="13" w:name="_Toc244290214"/>
+      <w:bookmarkStart w:id="13" w:name="_Toc244294253"/>
       <w:r>
         <w:lastRenderedPageBreak/>
         <w:t>CHƯƠNG 2. CƠ SỞ LÝ THUYẾT</w:t>
@@ -8378,7 +8370,7 @@
       <w:pPr>
         <w:pStyle w:val="Heading2"/>
       </w:pPr>
-      <w:bookmarkStart w:id="14" w:name="_Toc244290215"/>
+      <w:bookmarkStart w:id="14" w:name="_Toc244294254"/>
       <w:r>
         <w:t>2.1. Khái niệm và mô hình dữ liệu</w:t>
       </w:r>
@@ -8414,7 +8406,7 @@
       <w:pPr>
         <w:pStyle w:val="Heading2"/>
       </w:pPr>
-      <w:bookmarkStart w:id="15" w:name="_Toc244290216"/>
+      <w:bookmarkStart w:id="15" w:name="_Toc244294255"/>
       <w:r>
         <w:t>2.2. Cấu trúc dữ liệu sử dụng</w:t>
       </w:r>
@@ -8493,7 +8485,7 @@
         <w:pStyle w:val="Chthchbng"/>
         <w:spacing w:before="80" w:after="100" w:line="269" w:lineRule="auto"/>
       </w:pPr>
-      <w:bookmarkStart w:id="16" w:name="_Toc244290249"/>
+      <w:bookmarkStart w:id="16" w:name="_Toc244294288"/>
       <w:r>
         <w:t>Bảng 2.1 Biến cấu trúc và điều kiện phải duy trì</w:t>
       </w:r>
@@ -8814,7 +8806,7 @@
       <w:pPr>
         <w:pStyle w:val="Heading2"/>
       </w:pPr>
-      <w:bookmarkStart w:id="17" w:name="_Toc244290217"/>
+      <w:bookmarkStart w:id="17" w:name="_Toc244294256"/>
       <w:r>
         <w:t>2.3. Nguyên lý thuật toán</w:t>
       </w:r>
@@ -8892,7 +8884,7 @@
       <w:pPr>
         <w:pStyle w:val="Heading2"/>
       </w:pPr>
-      <w:bookmarkStart w:id="18" w:name="_Toc244290218"/>
+      <w:bookmarkStart w:id="18" w:name="_Toc244294257"/>
       <w:r>
         <w:t>2.4. Cơ sở đánh giá thời gian và bộ nhớ</w:t>
       </w:r>
@@ -8959,7 +8951,7 @@
         <w:keepNext w:val="0"/>
         <w:spacing w:before="0" w:after="320"/>
       </w:pPr>
-      <w:bookmarkStart w:id="19" w:name="_Toc244290219"/>
+      <w:bookmarkStart w:id="19" w:name="_Toc244294258"/>
       <w:r>
         <w:lastRenderedPageBreak/>
         <w:t>CHƯƠNG 3. PHÂN TÍCH, THIẾT KẾ VÀ CÀI ĐẶT</w:t>
@@ -8970,7 +8962,7 @@
       <w:pPr>
         <w:pStyle w:val="Heading2"/>
       </w:pPr>
-      <w:bookmarkStart w:id="20" w:name="_Toc244290220"/>
+      <w:bookmarkStart w:id="20" w:name="_Toc244294259"/>
       <w:r>
         <w:t>3.1. Phân tích yêu cầu chương trình</w:t>
       </w:r>
@@ -9048,7 +9040,7 @@
       <w:pPr>
         <w:pStyle w:val="Heading2"/>
       </w:pPr>
-      <w:bookmarkStart w:id="21" w:name="_Toc244290221"/>
+      <w:bookmarkStart w:id="21" w:name="_Toc244294260"/>
       <w:r>
         <w:t>3.2. Thiết kế các hàm và dữ liệu</w:t>
       </w:r>
@@ -9085,7 +9077,7 @@
         <w:pStyle w:val="Chthchbng"/>
         <w:spacing w:before="80" w:after="100" w:line="269" w:lineRule="auto"/>
       </w:pPr>
-      <w:bookmarkStart w:id="22" w:name="_Toc244290250"/>
+      <w:bookmarkStart w:id="22" w:name="_Toc244294289"/>
       <w:r>
         <w:t>Bảng 3.1 Tổ chức các hàm và tệp</w:t>
       </w:r>
@@ -9564,7 +9556,7 @@
         <w:spacing w:before="0" w:after="100" w:line="269" w:lineRule="auto"/>
         <w:jc w:val="left"/>
       </w:pPr>
-      <w:bookmarkStart w:id="23" w:name="_Toc244290251"/>
+      <w:bookmarkStart w:id="23" w:name="_Toc244294290"/>
       <w:r>
         <w:t>Bảng 3.2 Tiền điều kiện và hậu điều kiện của các hàm</w:t>
       </w:r>
@@ -10001,7 +9993,7 @@
       <w:pPr>
         <w:pStyle w:val="Heading2"/>
       </w:pPr>
-      <w:bookmarkStart w:id="24" w:name="_Toc244290222"/>
+      <w:bookmarkStart w:id="24" w:name="_Toc244294261"/>
       <w:r>
         <w:t>3.3. Thuật toán và mã nguồn chính</w:t>
       </w:r>
@@ -10228,7 +10220,7 @@
       <w:pPr>
         <w:pStyle w:val="Heading2"/>
       </w:pPr>
-      <w:bookmarkStart w:id="25" w:name="_Toc244290223"/>
+      <w:bookmarkStart w:id="25" w:name="_Toc244294262"/>
       <w:r>
         <w:t>3.4. Lần vết ví dụ nhỏ</w:t>
       </w:r>
@@ -10310,7 +10302,7 @@
         <w:spacing w:before="80" w:after="100" w:line="269" w:lineRule="auto"/>
       </w:pPr>
       <w:bookmarkStart w:id="26" w:name="_Toc243551724"/>
-      <w:bookmarkStart w:id="27" w:name="_Toc244290252"/>
+      <w:bookmarkStart w:id="27" w:name="_Toc244294291"/>
       <w:r>
         <w:t>Bảng 3.3 Truy vết ca VD01</w:t>
       </w:r>
@@ -11327,7 +11319,7 @@
       <w:pPr>
         <w:pStyle w:val="Heading2"/>
       </w:pPr>
-      <w:bookmarkStart w:id="28" w:name="_Toc244290224"/>
+      <w:bookmarkStart w:id="28" w:name="_Toc244294263"/>
       <w:r>
         <w:lastRenderedPageBreak/>
         <w:t>3.5. Giải thích tính đúng và điều kiện dừng</w:t>
@@ -11406,7 +11398,7 @@
       <w:pPr>
         <w:pStyle w:val="Heading2"/>
       </w:pPr>
-      <w:bookmarkStart w:id="29" w:name="_Toc244290225"/>
+      <w:bookmarkStart w:id="29" w:name="_Toc244294264"/>
       <w:r>
         <w:t>3.6. Phân tích độ phức tạp</w:t>
       </w:r>
@@ -11452,7 +11444,7 @@
         <w:spacing w:before="0" w:after="100" w:line="269" w:lineRule="auto"/>
         <w:jc w:val="left"/>
       </w:pPr>
-      <w:bookmarkStart w:id="30" w:name="_Toc244290253"/>
+      <w:bookmarkStart w:id="30" w:name="_Toc244294292"/>
       <w:r>
         <w:t>Bảng 3.4 Chi phí của từng pha trong bản cài</w:t>
       </w:r>
@@ -12199,7 +12191,7 @@
         <w:keepNext w:val="0"/>
         <w:spacing w:before="0" w:after="320"/>
       </w:pPr>
-      <w:bookmarkStart w:id="31" w:name="_Toc244290226"/>
+      <w:bookmarkStart w:id="31" w:name="_Toc244294265"/>
       <w:r>
         <w:lastRenderedPageBreak/>
         <w:t>CHƯƠNG 4. KẾT QUẢ THỬ NGHIỆM VÀ NHẬN XÉT</w:t>
@@ -12210,7 +12202,7 @@
       <w:pPr>
         <w:pStyle w:val="Heading2"/>
       </w:pPr>
-      <w:bookmarkStart w:id="32" w:name="_Toc244290227"/>
+      <w:bookmarkStart w:id="32" w:name="_Toc244294266"/>
       <w:r>
         <w:t>4.1. Môi trường và kế hoạch kiểm thử</w:t>
       </w:r>
@@ -12229,7 +12221,7 @@
         <w:pStyle w:val="Nidung"/>
       </w:pPr>
       <w:r>
-        <w:t>Môi trường kiểm: Python 3.14.7, Streamlit 1.63.0, Pandas 3.0.5. Chạy test bằng python -m unittest -v test_postfix.py; chạy web bằng python -m streamlit run app.py. SHA C/S, permalink và kết quả clone chưa có.</w:t>
+        <w:t>Môi trường kiểm từ clone sạch: Python 3.14.7, Streamlit 1.63.0, Pandas 3.0.5. Lệnh: python -m unittest -v test_postfix.py và python -c "import app; app.run_test_suite()"; kết quả lần lượt 5/5 phương thức unittest (gồm 12 subTest độc lập) và 12/12 ca dashboard PASS. SHA C/S: 17d0a9c68d8b915fa9d0327eecef36e57efa552a. Permalink và log clone-S-test-results.txt được ghi tại mục 4.9 và tệp ThongTinNop.</w:t>
       </w:r>
     </w:p>
     <w:p>
@@ -12288,7 +12280,7 @@
       <w:pPr>
         <w:pStyle w:val="Heading2"/>
       </w:pPr>
-      <w:bookmarkStart w:id="33" w:name="_Toc244290228"/>
+      <w:bookmarkStart w:id="33" w:name="_Toc244294267"/>
       <w:r>
         <w:t>4.2. Bảng kết quả ít nhất 12 ca</w:t>
       </w:r>
@@ -12299,7 +12291,7 @@
         <w:pStyle w:val="Nidung"/>
       </w:pPr>
       <w:r>
-        <w:t>Bảng 4.2 gồm 12 mã độc lập: hai ví dụ trong phiếu, hai ca phân biệt thứ tự phép trừ, ba ca biên, một ca chia 0 và bốn ca validator/miền. Actual khớp Expected; A01–A09 đã chụp. Repo riêng có commit hồ sơ e2e1227; A10 clone sạch và A11 ảnh repo còn chờ. ZIP chưa đồng bộ.</w:t>
+        <w:t>Bảng 4.2 có 12 ca độc lập, Expected khớp Actual; A01–A09 có ảnh. Mã và ZIP cùng phiên bản commit C/S 17d0a9c68d8b915fa9d0327eecef36e57efa552a; clone sạch đạt 12/12 dashboard và 5/5 unittest PASS. A10 có log nhưng chưa có ảnh; A11 có URL/permalink nhưng chưa có ảnh chụp.</w:t>
       </w:r>
     </w:p>
     <w:p>
@@ -12352,7 +12344,7 @@
         <w:spacing w:before="0" w:after="100" w:line="269" w:lineRule="auto"/>
         <w:jc w:val="left"/>
       </w:pPr>
-      <w:bookmarkStart w:id="34" w:name="_Toc244290254"/>
+      <w:bookmarkStart w:id="34" w:name="_Toc244294293"/>
       <w:r>
         <w:t>Bảng 4.1 Ánh xạ năm ca kiểm trên phiếu</w:t>
       </w:r>
@@ -12747,7 +12739,7 @@
         <w:pStyle w:val="Chthchbng"/>
         <w:spacing w:before="80" w:after="100" w:line="269" w:lineRule="auto"/>
       </w:pPr>
-      <w:bookmarkStart w:id="35" w:name="_Toc244290255"/>
+      <w:bookmarkStart w:id="35" w:name="_Toc244294294"/>
       <w:r>
         <w:t>Bảng 4.2 Thiết kế ít nhất 12 ca kiểm độc lập</w:t>
       </w:r>
@@ -13466,7 +13458,7 @@
         <w:pageBreakBefore/>
         <w:spacing w:before="80" w:after="100" w:line="269" w:lineRule="auto"/>
       </w:pPr>
-      <w:bookmarkStart w:id="36" w:name="_Toc244290256"/>
+      <w:bookmarkStart w:id="36" w:name="_Toc244294295"/>
       <w:r>
         <w:lastRenderedPageBreak/>
         <w:t>Bảng 4.3 Actual kết luận và vị trí minh chứng</w:t>
@@ -14189,7 +14181,7 @@
         <w:ind w:firstLine="0"/>
         <w:jc w:val="center"/>
       </w:pPr>
-      <w:bookmarkStart w:id="37" w:name="_Toc244290229"/>
+      <w:bookmarkStart w:id="37" w:name="_Toc244294268"/>
       <w:r>
         <w:lastRenderedPageBreak/>
         <w:t>4.3. Hai ví dụ trên phiếu</w:t>
@@ -14501,7 +14493,7 @@
         <w:ind w:firstLine="0"/>
         <w:jc w:val="center"/>
       </w:pPr>
-      <w:bookmarkStart w:id="38" w:name="_Toc244290230"/>
+      <w:bookmarkStart w:id="38" w:name="_Toc244294269"/>
       <w:r>
         <w:lastRenderedPageBreak/>
         <w:t>4.4. Hai ca sinh viên tự thiết kế</w:t>
@@ -14805,7 +14797,7 @@
         <w:ind w:firstLine="0"/>
         <w:jc w:val="center"/>
       </w:pPr>
-      <w:bookmarkStart w:id="39" w:name="_Toc244290231"/>
+      <w:bookmarkStart w:id="39" w:name="_Toc244294270"/>
       <w:r>
         <w:lastRenderedPageBreak/>
         <w:t>4.5. Ba ca biên phù hợp với đề tài</w:t>
@@ -15299,7 +15291,7 @@
       <w:pPr>
         <w:pStyle w:val="Heading2"/>
       </w:pPr>
-      <w:bookmarkStart w:id="40" w:name="_Toc244290232"/>
+      <w:bookmarkStart w:id="40" w:name="_Toc244294271"/>
       <w:r>
         <w:t>4.6. Kiểm tra input không hợp lệ — LOI01</w:t>
       </w:r>
@@ -15446,7 +15438,7 @@
       <w:pPr>
         <w:pStyle w:val="Heading2"/>
       </w:pPr>
-      <w:bookmarkStart w:id="41" w:name="_Toc244290233"/>
+      <w:bookmarkStart w:id="41" w:name="_Toc244294272"/>
       <w:r>
         <w:t>4.7. Kết quả toàn bộ kiểm thử</w:t>
       </w:r>
@@ -15457,7 +15449,7 @@
         <w:pStyle w:val="Nidung"/>
       </w:pPr>
       <w:r>
-        <w:t>Kết quả từ ZIP giải nén sạch: 12/12 ca dashboard PASS, 5/5 phương thức unittest PASS. Phương thức đầu chạy 12 subTest độc lập; đây là 12 ca kiểm chứ không phải 12 phương thức unittest. Ảnh A09 xác nhận dashboard 12/12; repo riêng đã có commit e2e1227. A10/A11, SHA code và clone sạch còn chờ.</w:t>
+        <w:t>ZIP mã nguồn đồng bộ với app.py tại commit C/S 17d0a9c68d8b915fa9d0327eecef36e57efa552a. Clone sạch: 12/12 ca dashboard PASS; unittest 5/5 phương thức PASS, trong đó có 12 subTest độc lập. A09 là ảnh dashboard; A10 chưa có ảnh (có log clone); A11 chưa có ảnh.</w:t>
       </w:r>
     </w:p>
     <w:p>
@@ -15593,7 +15585,7 @@
       <w:pPr>
         <w:pStyle w:val="Heading2"/>
       </w:pPr>
-      <w:bookmarkStart w:id="42" w:name="_Toc244290234"/>
+      <w:bookmarkStart w:id="42" w:name="_Toc244294273"/>
       <w:r>
         <w:t>4.8. Khảo sát ba quy mô hoặc ba cấu hình hợp lệ</w:t>
       </w:r>
@@ -15681,7 +15673,7 @@
         <w:spacing w:before="0" w:after="100" w:line="269" w:lineRule="auto"/>
         <w:jc w:val="left"/>
       </w:pPr>
-      <w:bookmarkStart w:id="43" w:name="_Toc244290257"/>
+      <w:bookmarkStart w:id="43" w:name="_Toc244294296"/>
       <w:r>
         <w:t>Bảng 4.4 Khảo sát Q1 Q2 Q3</w:t>
       </w:r>
@@ -16223,7 +16215,7 @@
         <w:ind w:firstLine="0"/>
         <w:jc w:val="center"/>
       </w:pPr>
-      <w:bookmarkStart w:id="44" w:name="_Toc244290235"/>
+      <w:bookmarkStart w:id="44" w:name="_Toc244294274"/>
       <w:r>
         <w:lastRenderedPageBreak/>
         <w:t>4.9. GitHub và chạy lại từ bản clone sạch</w:t>
@@ -16243,7 +16235,7 @@
         <w:pStyle w:val="Nidung"/>
       </w:pPr>
       <w:r>
-        <w:t>Repo riêng: https://github.com/nguyenthanhtan06/CTDL_N24DCDT082; commit tải bộ hồ sơ: e2e12270db6c0333876f4c417740ba8ec08d7884. ZIP mã nguồn chưa đồng bộ với app.py chụp A01–A09; SHA C/S của bản mã thống nhất, permalink hàm/test và clone sạch còn chờ.</w:t>
+        <w:t>Repo riêng: https://github.com/nguyenthanhtan06/CTDL_N24DCDT082; commit nguồn C/S: 17d0a9c68d8b915fa9d0327eecef36e57efa552a; permalink: https://github.com/nguyenthanhtan06/CTDL_N24DCDT082/commit/17d0a9c68d8b915fa9d0327eecef36e57efa552a. ZIP đồng bộ với app.py. SHA-256 app.py: D37E251DE761BC9C61DA536AF5B872873BBAB878CFB592F2EA17F872FE4CEB35. Hàm evaluate_postfix_with_trace: https://github.com/nguyenthanhtan06/CTDL_N24DCDT082/blob/17d0a9c68d8b915fa9d0327eecef36e57efa552a/app.py#L135; kiểm thử: https://github.com/nguyenthanhtan06/CTDL_N24DCDT082/blob/17d0a9c68d8b915fa9d0327eecef36e57efa552a/test_postfix.py#L7. Clone sạch đạt 12/12 ca và 5/5 phương thức unittest PASS. Repo riêng tư; cấp quyền giảng viên nếu cần.</w:t>
       </w:r>
     </w:p>
     <w:p>
@@ -16269,7 +16261,7 @@
         <w:pStyle w:val="Chthchbng"/>
         <w:spacing w:before="80" w:after="100" w:line="269" w:lineRule="auto"/>
       </w:pPr>
-      <w:bookmarkStart w:id="45" w:name="_Toc244290258"/>
+      <w:bookmarkStart w:id="45" w:name="_Toc244294297"/>
       <w:r>
         <w:t>Bảng 4.5 Kho mã và phiên bản có thể kiểm lại</w:t>
       </w:r>
@@ -16393,7 +16385,7 @@
           </w:tcPr>
           <w:p>
             <w:r>
-              <w:t>CHƯA CÓ — ZIP 24/10 chưa đồng bộ với app.py dùng chụp A01–A09; commit e2e1227 là bộ hồ sơ, chưa xác lập SHA C mã.</w:t>
+              <w:t>17d0a9c68d8b915fa9d0327eecef36e57efa552a; ZIP/app.py đồng bộ. SHA-256 app.py: D37E251DE761BC9C61DA536AF5B872873BBAB878CFB592F2EA17F872FE4CEB35.</w:t>
             </w:r>
           </w:p>
         </w:tc>
@@ -16420,7 +16412,7 @@
           </w:tcPr>
           <w:p>
             <w:r>
-              <w:t>CHƯA CÓ — chưa chốt và clone phiên bản nộp sau khi đồng bộ ZIP.</w:t>
+              <w:t>17d0a9c68d8b915fa9d0327eecef36e57efa552a; clone sạch đạt 12/12 dashboard và 5/5 unittest.</w:t>
             </w:r>
           </w:p>
         </w:tc>
@@ -16447,7 +16439,15 @@
           </w:tcPr>
           <w:p>
             <w:r>
-              <w:t>https://github.com/nguyenthanhtan06/CTDL_N24DCDT082/blob/main/README.md; permalink hàm/test chưa có.</w:t>
+              <w:t>https://github.com/nguyenthanhtan06/CTDL_N24DCDT082/blob/17d0a9c68d8b915fa9d0327eecef36e57efa552a/app.py#L135</w:t>
+            </w:r>
+            <w:r>
+              <w:br/>
+              <w:t>https://github.com/nguyenthanhtan06/CTDL_N24DCDT082/blob/17d0a9c68d8b915fa9d0327eecef36e57efa552a/test_postfix.py#L7</w:t>
+            </w:r>
+            <w:r>
+              <w:br/>
+              <w:t>https://github.com/nguyenthanhtan06/CTDL_N24DCDT082/commit/17d0a9c68d8b915fa9d0327eecef36e57efa552a</w:t>
             </w:r>
           </w:p>
         </w:tc>
@@ -16512,6 +16512,7 @@
         <w:pStyle w:val="Heading3"/>
       </w:pPr>
       <w:r>
+        <w:lastRenderedPageBreak/>
         <w:t>4.9.2. Clone sạch và tái hiện kết quả</w:t>
       </w:r>
     </w:p>
@@ -16520,7 +16521,7 @@
         <w:pStyle w:val="Nidung"/>
       </w:pPr>
       <w:r>
-        <w:t>Repo riêng đã tạo nhưng ZIP hiện tại chưa đồng bộ với app.py dùng chụp A01–A09. Chưa thực hiện clone sạch và chạy lại từ phiên bản nộp. Sau khi đồng bộ mã/ZIP và chốt commit, clone vào thư mục mới, cài requirements, chạy hai ví dụ và test; chụp A10.</w:t>
+        <w:t>Đã clone sạch repo tại commit 17d0a9c68d8b915fa9d0327eecef36e57efa552a, cài đặt theo requirements.txt và chạy lại: 12/12 ca dashboard PASS, 5/5 unittest PASS. Log: clone-S-test-results.txt. Ảnh A10 chưa chụp nên không tính là ảnh minh chứng.</w:t>
       </w:r>
     </w:p>
     <w:p>
@@ -16593,7 +16594,7 @@
           </w:tcPr>
           <w:p>
             <w:r>
-              <w:t>A10 CHƯA CÓ: clone sạch và chạy lại sau khi đồng bộ ZIP; ghi SHA S.</w:t>
+              <w:t>A10: Chưa có ảnh. Log clone-S-test-results.txt; SHA S 17d0a9c68d8b915fa9d0327eecef36e57efa552a; 12/12 dashboard, 5/5 unittest PASS.</w:t>
             </w:r>
           </w:p>
         </w:tc>
@@ -16605,7 +16606,7 @@
         <w:spacing w:before="80" w:after="100" w:line="269" w:lineRule="auto"/>
       </w:pPr>
       <w:r>
-        <w:t>Hình 4.10 CLONE — ảnh A10 chờ clone sạch và chạy lại sau khi đồng bộ mã</w:t>
+        <w:t>Hình 4.10 CLONE — minh chứng A10 chưa có ảnh chụp; log clone sạch được liệt kê tại phụ lục B</w:t>
       </w:r>
     </w:p>
     <w:p>
@@ -16631,7 +16632,6 @@
         <w:pStyle w:val="Heading3"/>
       </w:pPr>
       <w:r>
-        <w:lastRenderedPageBreak/>
         <w:t>4.9.3. Bằng chứng kho GitHub thật</w:t>
       </w:r>
     </w:p>
@@ -16671,7 +16671,7 @@
           </w:tcPr>
           <w:p>
             <w:r>
-              <w:t>A11 CHƯA CÓ: chụp repo riêng có commit và URL truy cập được.</w:t>
+              <w:t>A11: Chưa có ảnh. Repo/commit: https://github.com/nguyenthanhtan06/CTDL_N24DCDT082/commit/17d0a9c68d8b915fa9d0327eecef36e57efa552a.</w:t>
             </w:r>
           </w:p>
         </w:tc>
@@ -16683,7 +16683,7 @@
         <w:spacing w:before="80" w:after="100" w:line="269" w:lineRule="auto"/>
       </w:pPr>
       <w:r>
-        <w:t>Hình 4.11 GITHUB — ảnh A11 chờ chụp repo riêng và commit thật</w:t>
+        <w:t>Hình 4.11 GITHUB — minh chứng A11 chưa có ảnh chụp; URL và commit thật ghi tại mục 4.9</w:t>
       </w:r>
     </w:p>
     <w:p>
@@ -16710,7 +16710,7 @@
         <w:keepNext w:val="0"/>
         <w:spacing w:before="0" w:after="320"/>
       </w:pPr>
-      <w:bookmarkStart w:id="46" w:name="_Toc244290236"/>
+      <w:bookmarkStart w:id="46" w:name="_Toc244294275"/>
       <w:r>
         <w:lastRenderedPageBreak/>
         <w:t>CHƯƠNG 5. KẾT LUẬN VÀ HƯỚNG PHÁT TRIỂN</w:t>
@@ -16721,7 +16721,7 @@
       <w:pPr>
         <w:pStyle w:val="Heading2"/>
       </w:pPr>
-      <w:bookmarkStart w:id="47" w:name="_Toc244290237"/>
+      <w:bookmarkStart w:id="47" w:name="_Toc244294276"/>
       <w:r>
         <w:t>5.1. Mức hoàn thành so với phiếu</w:t>
       </w:r>
@@ -16732,7 +16732,7 @@
         <w:pStyle w:val="Nidung"/>
       </w:pPr>
       <w:r>
-        <w:t>Lõi trong ZIP giải nén đạt 12/12 ca dashboard PASS, 5/5 phương thức unittest PASS và HTTP 200 ở lần kiểm 24/10/2026. A01–A09 được chụp ngày 30/10/2026 từ app.py hiện tại; ZIP chưa đồng bộ. Repo riêng đã có commit hồ sơ e2e1227; A10–A11, SHA C/S của mã thống nhất, permalink, clone sạch và chữ ký còn chờ.</w:t>
+        <w:t>Mã nguồn trong ZIP đồng bộ với app.py tại commit C/S 17d0a9c68d8b915fa9d0327eecef36e57efa552a. Clone sạch ngày 30/10/2026 đạt 12/12 ca dashboard PASS và 5/5 phương thức unittest PASS (phương thức đầu có 12 subTest). Môi trường: Python 3.14.7, Streamlit 1.63.0, Pandas 3.0.5. A01–A09 có ảnh; A10 chưa có ảnh nhưng có log; A11 chưa có ảnh. Repo riêng tư; sinh viên cần rà soát chữ ký và thông tin khoa/ngành.</w:t>
       </w:r>
     </w:p>
     <w:p>
@@ -16757,7 +16757,7 @@
       <w:pPr>
         <w:pStyle w:val="Heading2"/>
       </w:pPr>
-      <w:bookmarkStart w:id="48" w:name="_Toc244290238"/>
+      <w:bookmarkStart w:id="48" w:name="_Toc244294277"/>
       <w:r>
         <w:t>5.2. Giới hạn và bài học</w:t>
       </w:r>
@@ -16793,7 +16793,7 @@
       <w:pPr>
         <w:pStyle w:val="Heading2"/>
       </w:pPr>
-      <w:bookmarkStart w:id="49" w:name="_Toc244290239"/>
+      <w:bookmarkStart w:id="49" w:name="_Toc244294278"/>
       <w:r>
         <w:t>5.3. Hướng phát triển phù hợp</w:t>
       </w:r>
@@ -16830,7 +16830,7 @@
         <w:pStyle w:val="Chthchbng"/>
         <w:spacing w:before="80" w:after="100" w:line="269" w:lineRule="auto"/>
       </w:pPr>
-      <w:bookmarkStart w:id="50" w:name="_Toc244290259"/>
+      <w:bookmarkStart w:id="50" w:name="_Toc244294298"/>
       <w:r>
         <w:t>Bảng 5.1 Mức hoàn thành và bằng chứng theo yêu cầu</w:t>
       </w:r>
@@ -17226,7 +17226,11 @@
           </w:tcPr>
           <w:p>
             <w:r>
-              <w:t>ZIP chưa đồng bộ; cần cập nhật và chạy clone S</w:t>
+              <w:t>ZIP đồng bộ tại commit C/S 17d0a9c68d8b915fa9d03</w:t>
+            </w:r>
+            <w:r>
+              <w:lastRenderedPageBreak/>
+              <w:t>27eecef36e57efa552a; cần cập nhật và chạy clone S</w:t>
             </w:r>
           </w:p>
         </w:tc>
@@ -17331,7 +17335,7 @@
         <w:keepNext w:val="0"/>
         <w:spacing w:before="0" w:after="320"/>
       </w:pPr>
-      <w:bookmarkStart w:id="51" w:name="_Toc244290240"/>
+      <w:bookmarkStart w:id="51" w:name="_Toc244294279"/>
       <w:r>
         <w:lastRenderedPageBreak/>
         <w:t>TÀI LIỆU THAM KHẢO</w:t>
@@ -17389,7 +17393,7 @@
         <w:keepNext w:val="0"/>
         <w:spacing w:before="0" w:after="320"/>
       </w:pPr>
-      <w:bookmarkStart w:id="52" w:name="_Toc244290241"/>
+      <w:bookmarkStart w:id="52" w:name="_Toc244294280"/>
       <w:r>
         <w:lastRenderedPageBreak/>
         <w:t>PHỤ LỤC</w:t>
@@ -17400,7 +17404,7 @@
       <w:pPr>
         <w:pStyle w:val="Heading2"/>
       </w:pPr>
-      <w:bookmarkStart w:id="53" w:name="_Toc244290242"/>
+      <w:bookmarkStart w:id="53" w:name="_Toc244294281"/>
       <w:r>
         <w:t>PHỤ LỤC A. Tổ chức mã và hướng dẫn chạy</w:t>
       </w:r>
@@ -17499,7 +17503,7 @@
         <w:pStyle w:val="Heading2"/>
         <w:pageBreakBefore/>
       </w:pPr>
-      <w:bookmarkStart w:id="54" w:name="_Toc244290243"/>
+      <w:bookmarkStart w:id="54" w:name="_Toc244294282"/>
       <w:r>
         <w:lastRenderedPageBreak/>
         <w:t>PHỤ LỤC B. Danh mục bằng chứng</w:t>
@@ -17511,7 +17515,7 @@
         <w:pStyle w:val="Nidung"/>
       </w:pPr>
       <w:r>
-        <w:t>Bảng PL.2 ánh xạ ảnh và tệp. A01–A09 được chụp ngày 30/10/2026 từ app.py hiện tại. Repo riêng: https://github.com/nguyenthanhtan06/CTDL_N24DCDT082; commit hồ sơ e2e1227. A10 clone sạch và A11 ảnh repo chưa có; ZIP cũ chưa đồng bộ với mã chụp ảnh.</w:t>
+        <w:t>Bảng PL.2 ánh xạ ảnh và tệp. A01–A09 được chụp ngày 30/10/2026. Repo: https://github.com/nguyenthanhtan06/CTDL_N24DCDT082; commit nguồn C/S 17d0a9c68d8b915fa9d0327eecef36e57efa552a; permalink: https://github.com/nguyenthanhtan06/CTDL_N24DCDT082/commit/17d0a9c68d8b915fa9d0327eecef36e57efa552a. ZIP đồng bộ với app.py. A10 chưa có ảnh nhưng có log clone; A11 chưa có ảnh trang repo/commit.</w:t>
       </w:r>
     </w:p>
     <w:tbl>
@@ -17650,7 +17654,7 @@
           </w:tcPr>
           <w:p>
             <w:r>
-              <w:t>Minh_chung/01_vi_du_1.png — chụp 30/10/2026 từ app.py hiện tại; chưa có SHA C.</w:t>
+              <w:t>Minh_chung/01_vi_du_1.png — chụp 30/10/2026 từ app.py hiện tại; commit C 17d0a9c68d8b915fa9d0327eecef36e57efa552a.</w:t>
             </w:r>
           </w:p>
         </w:tc>
@@ -17701,7 +17705,7 @@
           </w:tcPr>
           <w:p>
             <w:r>
-              <w:t>Minh_chung/02_vi_du_2.png — chụp 30/10/2026 từ app.py hiện tại; chưa có SHA C.</w:t>
+              <w:t>Minh_chung/02_vi_du_2.png — chụp 30/10/2026 từ app.py hiện tại; commit C 17d0a9c68d8b915fa9d0327eecef36e57efa552a.</w:t>
             </w:r>
           </w:p>
         </w:tc>
@@ -17752,7 +17756,7 @@
           </w:tcPr>
           <w:p>
             <w:r>
-              <w:t>Minh_chung/03_tu_thiet_ke_1.png — chụp 30/10/2026 từ app.py hiện tại; chưa có SHA C.</w:t>
+              <w:t>Minh_chung/03_tu_thiet_ke_1.png — chụp 30/10/2026 từ app.py hiện tại; commit C 17d0a9c68d8b915fa9d0327eecef36e57efa552a.</w:t>
             </w:r>
           </w:p>
         </w:tc>
@@ -17803,7 +17807,7 @@
           </w:tcPr>
           <w:p>
             <w:r>
-              <w:t>Minh_chung/04_tu_thiet_ke_2.png — chụp 30/10/2026 từ app.py hiện tại; chưa có SHA C.</w:t>
+              <w:t>Minh_chung/04_tu_thiet_ke_2.png — chụp 30/10/2026 từ app.py hiện tại; commit C 17d0a9c68d8b915fa9d0327eecef36e57efa552a.</w:t>
             </w:r>
           </w:p>
         </w:tc>
@@ -17854,7 +17858,7 @@
           </w:tcPr>
           <w:p>
             <w:r>
-              <w:t>Minh_chung/05_bien_1.png — chụp 30/10/2026 từ app.py hiện tại; chưa có SHA C.</w:t>
+              <w:t>Minh_chung/05_bien_1.png — chụp 30/10/2026 từ app.py hiện tại; commit C 17d0a9c68d8b915fa9d0327eecef36e57efa552a.</w:t>
             </w:r>
           </w:p>
         </w:tc>
@@ -17905,7 +17909,7 @@
           </w:tcPr>
           <w:p>
             <w:r>
-              <w:t>Minh_chung/06_bien_2.png — chụp 30/10/2026 từ app.py hiện tại; chưa có SHA C.</w:t>
+              <w:t>Minh_chung/06_bien_2.png — chụp 30/10/2026 từ app.py hiện tại; commit C 17d0a9c68d8b915fa9d0327eecef36e57efa552a.</w:t>
             </w:r>
           </w:p>
         </w:tc>
@@ -17956,7 +17960,7 @@
           </w:tcPr>
           <w:p>
             <w:r>
-              <w:t>Minh_chung/07_bien_3.png — chụp 30/10/2026 từ app.py hiện tại; chưa có SHA C.</w:t>
+              <w:t>Minh_chung/07_bien_3.png — chụp 30/10/2026 từ app.py hiện tại; commit C 17d0a9c68d8b915fa9d0327eecef36e57efa552a.</w:t>
             </w:r>
           </w:p>
         </w:tc>
@@ -18007,7 +18011,7 @@
           </w:tcPr>
           <w:p>
             <w:r>
-              <w:t>Minh_chung/08_input_khong_hop_le.png — chụp 30/10/2026 từ app.py hiện tại; chưa có SHA C.</w:t>
+              <w:t>Minh_chung/08_input_khong_hop_le.png — chụp 30/10/2026 từ app.py hiện tại; commit C 17d0a9c68d8b915fa9d0327eecef36e57efa552a.</w:t>
             </w:r>
           </w:p>
         </w:tc>
@@ -18058,7 +18062,7 @@
           </w:tcPr>
           <w:p>
             <w:r>
-              <w:t>Minh_chung/09_tong_ket_kiem_thu.png — chụp 30/10/2026 từ app.py hiện tại; chưa có SHA C.</w:t>
+              <w:t>Minh_chung/09_tong_ket_kiem_thu.png — chụp 30/10/2026 từ app.py hiện tại; commit C 17d0a9c68d8b915fa9d0327eecef36e57efa552a.</w:t>
             </w:r>
           </w:p>
         </w:tc>
@@ -18109,7 +18113,7 @@
           </w:tcPr>
           <w:p>
             <w:r>
-              <w:t>10_clone_sach_chay_lai.png — CHƯA CÓ; chưa clone/test commit sau khi đồng bộ mã.</w:t>
+              <w:t>Chưa có ảnh; log clone-S-test-results.txt; SHA S 17d0a9c68d8b915fa9d0327eecef36e57efa552a; 12/12 và 5/5 PASS.</w:t>
             </w:r>
           </w:p>
         </w:tc>
@@ -18132,6 +18136,7 @@
               <w:rPr>
                 <w:sz w:val="23"/>
               </w:rPr>
+              <w:lastRenderedPageBreak/>
               <w:t>A11</w:t>
             </w:r>
           </w:p>
@@ -18160,7 +18165,7 @@
           </w:tcPr>
           <w:p>
             <w:r>
-              <w:t>11_github_repo_commit.png — CHƯA CÓ; repo riêng đã có, chưa chụp ảnh repo/commit.</w:t>
+              <w:t>Chưa có ảnh; URL repo https://github.com/nguyenthanhtan06/CTDL_N24DCDT082; commit 17d0a9c68d8b915fa9d0327eecef36e57efa552a.</w:t>
             </w:r>
           </w:p>
         </w:tc>
@@ -18179,7 +18184,7 @@
         <w:pStyle w:val="Heading2"/>
         <w:pageBreakBefore/>
       </w:pPr>
-      <w:bookmarkStart w:id="55" w:name="_Toc244290244"/>
+      <w:bookmarkStart w:id="55" w:name="_Toc244294283"/>
       <w:r>
         <w:lastRenderedPageBreak/>
         <w:t>PHỤ LỤC C. Tự kiểm trước khi nộp</w:t>
@@ -18191,7 +18196,7 @@
         <w:pStyle w:val="Nidung"/>
       </w:pPr>
       <w:r>
-        <w:t>Đã kiểm 12 ca dashboard và unittest từ ZIP ngày 24/10/2026. A01–A09 chụp ngày 30/10/2026 từ app.py hiện tại; repo riêng đã tạo nhưng ZIP chưa đồng bộ. Còn A10 clone sạch, A11 ảnh repo/commit, SHA code/permalink, sinh viên xác nhận cam đoan và khoa/ngành trên bìa.</w:t>
+        <w:t>Đã kiểm 12 ca dashboard và unittest từ ZIP ngày 24/10/2026. A01–A09 chụp ngày 30/10/2026 từ app.py hiện tại; repo riêng đã tạo nhưng ZIP đồng bộ tại commit C/S 17d0a9c68d8b915fa9d0327eecef36e57efa552a. Còn A10 clone sạch, A11 ảnh repo/commit, SHA code/permalink, sinh viên xác nhận cam đoan và khoa/ngành trên bìa.</w:t>
       </w:r>
     </w:p>
     <w:p>
@@ -18199,7 +18204,7 @@
         <w:pStyle w:val="Nidung"/>
       </w:pPr>
       <w:r>
-        <w:t>Rà soát tiếp ngày 30/10/2026: run_test_suite() trong app.py hiện tại đạt 12/12 ca PASS (Python 3.12.14, Streamlit 1.66.1, Pandas 3.0.6). ZIP và log kiểm thử trong thư mục nộp là bản ngày 24/10/2026, chưa đồng bộ với mã hiện tại; cần cập nhật ZIP, ảnh và SHA repo trước khi nộp.</w:t>
+        <w:t>Rà soát ngày 30/10/2026 trên clone sạch tại commit 17d0a9c68d8b915fa9d0327eecef36e57efa552a: run_test_suite() đạt 12/12 ca PASS; unittest đạt 5/5 phương thức PASS (12 subTest độc lập). ZIP và app.py đồng bộ. A01–A09 có ảnh; A10/A11 còn thiếu ảnh chụp, trong đó A10 có log chạy. Repo riêng tư; cần sinh viên xác nhận chữ ký và thông tin khoa/ngành trước khi nộp.</w:t>
       </w:r>
     </w:p>
     <w:p>
@@ -18238,7 +18243,7 @@
         <w:jc w:val="left"/>
       </w:pPr>
       <w:r>
-        <w:t>☐ Có 12 ca kiểm; đã chèn A01–A09 từ app.py hiện tại; repo riêng đã có; còn A10/A11 và cần đồng bộ ZIP.</w:t>
+        <w:t>☐ Có 12 ca kiểm; A01–A09 có ảnh; clone sạch đã chạy lại tại SHA C/S nêu ở mục 4.9; A10/A11 còn thiếu ảnh chụp.</w:t>
       </w:r>
     </w:p>
     <w:p>
@@ -18263,7 +18268,7 @@
         <w:jc w:val="left"/>
       </w:pPr>
       <w:r>
-        <w:t>☐ Chưa có URL GitHub, SHA C/S, permalink và kết quả clone sạch.</w:t>
+        <w:t>☒ Đã có URL GitHub, SHA C/S, permalink và log clone sạch tại mục 4.9; repo riêng tư, cần cấp quyền cho giảng viên nếu cần.</w:t>
       </w:r>
     </w:p>
     <w:p>
@@ -18282,7 +18287,7 @@
         <w:pStyle w:val="Heading2"/>
         <w:pageBreakBefore/>
       </w:pPr>
-      <w:bookmarkStart w:id="56" w:name="_Toc244290245"/>
+      <w:bookmarkStart w:id="56" w:name="_Toc244294284"/>
       <w:r>
         <w:lastRenderedPageBreak/>
         <w:t>PHỤ LỤC D HƯỚNG DẪN NỘP CLASSROOM</w:t>
@@ -18319,7 +18324,7 @@
         <w:spacing w:before="0" w:after="100" w:line="269" w:lineRule="auto"/>
         <w:jc w:val="left"/>
       </w:pPr>
-      <w:bookmarkStart w:id="57" w:name="_Toc244290260"/>
+      <w:bookmarkStart w:id="57" w:name="_Toc244294299"/>
       <w:r>
         <w:t>Bảng PL.1 Bốn tệp cần nộp</w:t>
       </w:r>
@@ -18666,10 +18671,7 @@
         <w:jc w:val="left"/>
       </w:pPr>
       <w:r>
-        <w:rPr>
-          <w:sz w:val="24"/>
-        </w:rPr>
-        <w:t>C là commit mã/test/input đã chạy và chụp. S là commit chốt sau khi thêm báo cáo/ảnh. Clone S sang thư mục mới rồi chạy lại; nếu mã đổi sau C thì cập nhật test và ảnh bị ảnh hưởng. Ghi SHA S trong TXT nộp rời. Hai commit và lần clone chưa có trong bản làm việc này.</w:t>
+        <w:t>C là commit mã nguồn đã kiểm và dùng cho gói ZIP; S là commit clone sạch đã chạy lại. C = S = 17d0a9c68d8b915fa9d0327eecef36e57efa552a; cùng SHA-256 app.py D37E251DE761BC9C61DA536AF5B872873BBAB878CFB592F2EA17F872FE4CEB35. Clone đạt 12/12 ca dashboard và 5/5 phương thức unittest. Log tại clone-S-test-results.txt. A10/A11 chưa có ảnh chụp.</w:t>
       </w:r>
     </w:p>
     <w:p>

</xml_diff>

<commit_message>
Align DT067 report tables and submission status
</commit_message>
<xml_diff>
--- a/N24DCDT082_DT067_NguyenThanhTan_BaoCao.docx
+++ b/N24DCDT082_DT067_NguyenThanhTan_BaoCao.docx
@@ -808,7 +808,7 @@
               <w:spacing w:after="40" w:line="252" w:lineRule="auto"/>
             </w:pPr>
             <w:r>
-              <w:t>Rà soát 30/10/2026; app.py: 12/12 PASS; ZIP đồng bộ tại commit C/S 17d0a9c68d8b915fa9d0327eecef36e57efa552a; GitHub/SHA chưa có.</w:t>
+              <w:t>Rà soát 31/10/2026; ZIP/app.py đồng bộ; C/S 17d0a9c68d8b915fa9d0327eecef36e57efa552a; dashboard 12/12 PASS; clone sạch 5/5 unittest PASS.</w:t>
             </w:r>
           </w:p>
         </w:tc>
@@ -2215,7 +2215,7 @@
         <w:sdtEndPr/>
         <w:sdtContent>
           <w:r>
-            <w:t>Ứng dụng Streamlit đánh giá biểu thức hậu tố theo DT067 bằng stack LIFO, hiển thị lần vết từng token và cho phép tải bảng trace. Bộ mã trong ZIP đã giải nén đạt 12/12 ca dashboard PASS, 5/5 phương thức unittest PASS và ứng dụng trả HTTP 200. Rà soát ngày 30/10/2026, run_test_suite() trong app.py hiện tại cũng đạt 12/12 PASS với Python 3.12.14, Streamlit 1.66.1 và Pandas 3.0.6; ZIP trong hồ sơ chưa đồng bộ với bản mã này. Chia nguyên cắt về 0; chương trình kiểm token, miền số, thiếu/dư toán hạng, chia 0, số mũ và tràn Int128. Giao diện nhận trung tố hợp lệ rồi chuyển sang hậu tố. Còn thiếu ảnh A10–A11, URL/SHA/permalink GitHub, clone sạch và chữ ký; hồ sơ chưa phải bộ nộp hoàn chỉnh.</w:t>
+            <w:t>Ứng dụng Streamlit đánh giá biểu thức hậu tố DT067 bằng ngăn xếp LIFO, hiển thị lần vết từng token và tải bảng trace. Mã/ZIP đồng bộ tại commit C/S 17d0a9c68d8b915fa9d0327eecef36e57efa552a; SHA-256 app.py D37E251DE761BC9C61DA536AF5B872873BBAB878CFB592F2EA17F872FE4CEB35. Clone sạch: dashboard 12/12 PASS, unittest 5/5 phương thức PASS (12 subTest), Python 3.14.7, Streamlit 1.63.0, Pandas 3.0.5. Chia nguyên cắt về 0; validator xử lý token, miền số, thiếu/dư toán hạng, chia 0, số mũ và tràn Int128. Có 9/11 ảnh theo yêu cầu; A10 có log nhưng chưa có ảnh, A11 chưa có ảnh. Cần ký cam đoan, xác nhận khoa/ngành, cấp quyền repo riêng cho giảng viên nếu cần và xuất PDF mới.</w:t>
           </w:r>
         </w:sdtContent>
       </w:sdt>
@@ -10125,7 +10125,7 @@
         <w:pStyle w:val="Nidung"/>
       </w:pPr>
       <w:r>
-        <w:t>Mã nguồn lõi nằm trong app.py; b được pop trước a, rồi áp dụng đúng a op b. Permalink GitHub sẽ được thêm sau khi tạo commit C.</w:t>
+        <w:t>Mã nguồn lõi nằm trong app.py; b được pop trước a rồi áp dụng a op b. Commit C 17d0a9c68d8b915fa9d0327eecef36e57efa552a; hàm chính: https://github.com/nguyenthanhtan06/CTDL_N24DCDT082/blob/17d0a9c68d8b915fa9d0327eecef36e57efa552a/app.py#L135; test: https://github.com/nguyenthanhtan06/CTDL_N24DCDT082/blob/17d0a9c68d8b915fa9d0327eecef36e57efa552a/test_postfix.py#L7.</w:t>
       </w:r>
     </w:p>
     <w:p>
@@ -13619,7 +13619,7 @@
           </w:tcPr>
           <w:p>
             <w:r>
-              <w:t>A01; ảnh/SHA C chưa có</w:t>
+              <w:t>A01; Minh_chung/01_vi_du_1.png; C=17d0a9c68d8b915fa9d0327eecef36e57efa552a</w:t>
             </w:r>
           </w:p>
         </w:tc>
@@ -13668,7 +13668,7 @@
           </w:tcPr>
           <w:p>
             <w:r>
-              <w:t>A02; ảnh/SHA C chưa có</w:t>
+              <w:t>A02; Minh_chung/02_vi_du_2.png; C=17d0a9c68d8b915fa9d0327eecef36e57efa552a</w:t>
             </w:r>
           </w:p>
         </w:tc>
@@ -13717,7 +13717,7 @@
           </w:tcPr>
           <w:p>
             <w:r>
-              <w:t>A03; ảnh/SHA C chưa có</w:t>
+              <w:t>A03; Minh_chung/03_tu_thiet_ke_1.png; C=17d0a9c68d8b915fa9d0327eecef36e57efa552a</w:t>
             </w:r>
           </w:p>
         </w:tc>
@@ -13766,7 +13766,7 @@
           </w:tcPr>
           <w:p>
             <w:r>
-              <w:t>A04; ảnh/SHA C chưa có</w:t>
+              <w:t>A04; Minh_chung/04_tu_thiet_ke_2.png; C=17d0a9c68d8b915fa9d0327eecef36e57efa552a</w:t>
             </w:r>
           </w:p>
         </w:tc>
@@ -13815,7 +13815,7 @@
           </w:tcPr>
           <w:p>
             <w:r>
-              <w:t>A05; ảnh/SHA C chưa có</w:t>
+              <w:t>A05; Minh_chung/05_bien_1.png; C=17d0a9c68d8b915fa9d0327eecef36e57efa552a</w:t>
             </w:r>
           </w:p>
         </w:tc>
@@ -13864,7 +13864,7 @@
           </w:tcPr>
           <w:p>
             <w:r>
-              <w:t>A06; ảnh/SHA C chưa có</w:t>
+              <w:t>A06; Minh_chung/06_bien_2.png; C=17d0a9c68d8b915fa9d0327eecef36e57efa552a</w:t>
             </w:r>
           </w:p>
         </w:tc>
@@ -13913,7 +13913,7 @@
           </w:tcPr>
           <w:p>
             <w:r>
-              <w:t>A07; ảnh/SHA C chưa có</w:t>
+              <w:t>A07; Minh_chung/07_bien_3.png; C=17d0a9c68d8b915fa9d0327eecef36e57efa552a</w:t>
             </w:r>
           </w:p>
         </w:tc>
@@ -13962,7 +13962,7 @@
           </w:tcPr>
           <w:p>
             <w:r>
-              <w:t>A08; ảnh/SHA C chưa có</w:t>
+              <w:t>A08; Minh_chung/08_input_khong_hop_le.png; C=17d0a9c68d8b915fa9d0327eecef36e57efa552a</w:t>
             </w:r>
           </w:p>
         </w:tc>
@@ -14011,7 +14011,7 @@
           </w:tcPr>
           <w:p>
             <w:r>
-              <w:t>test-results.txt; ảnh/SHA C chưa có</w:t>
+              <w:t>test-results.txt; clone-S-test-results.txt; C=17d0a9c68d8b915fa9d0327eecef36e57efa552a; không có ảnh riêng cho ca này</w:t>
             </w:r>
           </w:p>
         </w:tc>
@@ -14060,7 +14060,7 @@
           </w:tcPr>
           <w:p>
             <w:r>
-              <w:t>test-results.txt; ảnh/SHA C chưa có</w:t>
+              <w:t>test-results.txt; clone-S-test-results.txt; C=17d0a9c68d8b915fa9d0327eecef36e57efa552a; không có ảnh riêng cho ca này</w:t>
             </w:r>
           </w:p>
         </w:tc>
@@ -14110,7 +14110,7 @@
           </w:tcPr>
           <w:p>
             <w:r>
-              <w:t>test-results.txt; ảnh/SHA C chưa có</w:t>
+              <w:t>test-results.txt; clone-S-test-results.txt; C=17d0a9c68d8b915fa9d0327eecef36e57efa552a; không có ảnh riêng cho ca này</w:t>
             </w:r>
           </w:p>
         </w:tc>
@@ -14159,7 +14159,7 @@
           </w:tcPr>
           <w:p>
             <w:r>
-              <w:t>test-results.txt; ảnh/SHA C chưa có</w:t>
+              <w:t>test-results.txt; clone-S-test-results.txt; C=17d0a9c68d8b915fa9d0327eecef36e57efa552a; không có ảnh riêng cho ca này</w:t>
             </w:r>
           </w:p>
         </w:tc>
@@ -16804,7 +16804,7 @@
         <w:pStyle w:val="Nidung"/>
       </w:pPr>
       <w:r>
-        <w:t>Hướng tiếp theo là hoàn tất ảnh/GitHub/clone sạch; bổ sung kiểm thử cú pháp trung tố và dấu âm đơn ngôi nếu được phép mở rộng; cập nhật validator và phân tích chi phí nếu thay đổi miền. Đây là đề xuất, chưa được tính là kết quả đã kiểm.</w:t>
+        <w:t>Việc còn lại trước khi nộp: tạo ảnh A10/A11 bằng thao tác thật; rà soát, ký cam đoan và xác nhận khoa/ngành; cấp quyền repo riêng cho giảng viên nếu cần; xuất PDF từ Word cuối và kiểm mục lục/số trang. Mở rộng trung tố/dấu âm đơn ngôi chỉ khi phiếu cho phép.</w:t>
       </w:r>
     </w:p>
     <w:p>
@@ -17226,11 +17226,7 @@
           </w:tcPr>
           <w:p>
             <w:r>
-              <w:t>ZIP đồng bộ tại commit C/S 17d0a9c68d8b915fa9d03</w:t>
-            </w:r>
-            <w:r>
-              <w:lastRenderedPageBreak/>
-              <w:t>27eecef36e57efa552a; cần cập nhật và chạy clone S</w:t>
+              <w:t>A10/A11 thiếu ảnh; khảo sát là phép đếm, không đo benchmark.</w:t>
             </w:r>
           </w:p>
         </w:tc>
@@ -17273,7 +17269,7 @@
           </w:tcPr>
           <w:p>
             <w:r>
-              <w:t>Còn A10–A11, URL/SHA/permalink, ZIP đồng bộ và clone sạch</w:t>
+              <w:t>Thiếu A10/A11; repo riêng cần cấp quyền; cần xác nhận chữ ký/khoa và xuất PDF mới.</w:t>
             </w:r>
           </w:p>
         </w:tc>
@@ -18196,7 +18192,7 @@
         <w:pStyle w:val="Nidung"/>
       </w:pPr>
       <w:r>
-        <w:t>Đã kiểm 12 ca dashboard và unittest từ ZIP ngày 24/10/2026. A01–A09 chụp ngày 30/10/2026 từ app.py hiện tại; repo riêng đã tạo nhưng ZIP đồng bộ tại commit C/S 17d0a9c68d8b915fa9d0327eecef36e57efa552a. Còn A10 clone sạch, A11 ảnh repo/commit, SHA code/permalink, sinh viên xác nhận cam đoan và khoa/ngành trên bìa.</w:t>
+        <w:t>Đã kiểm clone sạch tại commit 17d0a9c68d8b915fa9d0327eecef36e57efa552a: dashboard 12/12 PASS, unittest 5/5 phương thức PASS (12 subTest độc lập). A01–A09 có ảnh; A10 có log nhưng chưa có ảnh; A11 chưa có ảnh chụp repo/commit. SHA, permalink và ZIP đồng bộ đã đối chiếu. Còn chữ ký, xác nhận khoa/ngành, cấp quyền repo riêng cho giảng viên nếu cần và PDF xuất lại.</w:t>
       </w:r>
     </w:p>
     <w:p>
@@ -18243,7 +18239,7 @@
         <w:jc w:val="left"/>
       </w:pPr>
       <w:r>
-        <w:t>☐ Có 12 ca kiểm; A01–A09 có ảnh; clone sạch đã chạy lại tại SHA C/S nêu ở mục 4.9; A10/A11 còn thiếu ảnh chụp.</w:t>
+        <w:t>☑ Có 12 ca độc lập, dashboard 12/12 PASS; khảo sát Q1–Q3 đã ghi phép đếm; A01–A09 có ảnh; A10/A11 còn ảnh chụp.</w:t>
       </w:r>
     </w:p>
     <w:p>
@@ -18279,7 +18275,7 @@
         <w:jc w:val="left"/>
       </w:pPr>
       <w:r>
-        <w:t>☐ Sinh viên cần rà soát bản Word/PDF sau khi bổ sung các minh chứng còn thiếu.</w:t>
+        <w:t>☐ Cần xuất PDF mới từ Word cuối, cập nhật mục lục và rà soát Word/PDF từng trang.</w:t>
       </w:r>
     </w:p>
     <w:p>

</xml_diff>

<commit_message>
Add DT067 clone and GitHub evidence A10 A11
</commit_message>
<xml_diff>
--- a/N24DCDT082_DT067_NguyenThanhTan_BaoCao.docx
+++ b/N24DCDT082_DT067_NguyenThanhTan_BaoCao.docx
@@ -2215,7 +2215,7 @@
         <w:sdtEndPr/>
         <w:sdtContent>
           <w:r>
-            <w:t>Ứng dụng Streamlit đánh giá biểu thức hậu tố DT067 bằng ngăn xếp LIFO, hiển thị lần vết từng token và tải bảng trace. Mã/ZIP đồng bộ tại commit C/S 17d0a9c68d8b915fa9d0327eecef36e57efa552a; SHA-256 app.py D37E251DE761BC9C61DA536AF5B872873BBAB878CFB592F2EA17F872FE4CEB35. Clone sạch: dashboard 12/12 PASS, unittest 5/5 phương thức PASS (12 subTest), Python 3.14.7, Streamlit 1.63.0, Pandas 3.0.5. Chia nguyên cắt về 0; validator xử lý token, miền số, thiếu/dư toán hạng, chia 0, số mũ và tràn Int128. Có 9/11 ảnh theo yêu cầu; A10 có log nhưng chưa có ảnh, A11 chưa có ảnh. Cần ký cam đoan, xác nhận khoa/ngành, cấp quyền repo riêng cho giảng viên nếu cần và xuất PDF mới.</w:t>
+            <w:t>Ứng dụng Streamlit đánh giá biểu thức hậu tố DT067 bằng ngăn xếp LIFO, hiển thị lần vết từng token và tải bảng trace. Mã/ZIP đồng bộ tại commit C/S 17d0a9c68d8b915fa9d0327eecef36e57efa552a; SHA-256 app.py D37E251DE761BC9C61DA536AF5B872873BBAB878CFB592F2EA17F872FE4CEB35. Clone sạch: dashboard 12/12 PASS, unittest 5/5 phương thức PASS (12 subTest), Python 3.14.7, Streamlit 1.63.0, Pandas 3.0.5. Chia nguyên cắt về 0; validator xử lý token, miền số, thiếu/dư toán hạng, chia 0, số mũ và tràn Int128. Ảnh A01–A11 đã chèn. Cần ký cam đoan, xác nhận khoa/ngành, cấp quyền repo riêng cho giảng viên nếu cần và xuất PDF mới.</w:t>
           </w:r>
         </w:sdtContent>
       </w:sdt>
@@ -7082,7 +7082,7 @@
         </w:rPr>
       </w:pPr>
       <w:r>
-        <w:t>Hình 4.10 CLONE — minh chứng A10 chưa có ảnh chụp; log clone sạch được liệt kê tại phụ lục B</w:t>
+        <w:t>Hình 4.10 A10 — Clone sạch tại SHA 17d0a9c68d8b915fa9d0327eecef36e57efa552a; unittest 5/5 và dashboard 12/12 PASS.</w:t>
       </w:r>
     </w:p>
     <w:p>
@@ -7103,7 +7103,7 @@
         </w:rPr>
       </w:pPr>
       <w:r>
-        <w:t>Hình 4.11 GITHUB — minh chứng A11 chưa có ảnh chụp; URL và commit thật ghi tại mục 4.9</w:t>
+        <w:t>Hình 4.11 A11 — Repo GitHub CTDL_N24DCDT082 ở commit 17d0a9c68d8b915fa9d0327eecef36e57efa552a; ảnh chụp repo riêng tư.</w:t>
       </w:r>
     </w:p>
     <w:p/>
@@ -12291,7 +12291,7 @@
         <w:pStyle w:val="Nidung"/>
       </w:pPr>
       <w:r>
-        <w:t>Bảng 4.2 có 12 ca độc lập, Expected khớp Actual; A01–A09 có ảnh. Mã và ZIP cùng phiên bản commit C/S 17d0a9c68d8b915fa9d0327eecef36e57efa552a; clone sạch đạt 12/12 dashboard và 5/5 unittest PASS. A10 có log nhưng chưa có ảnh; A11 có URL/permalink nhưng chưa có ảnh chụp.</w:t>
+        <w:t>Bảng 4.2 có 12 ca độc lập, Expected khớp Actual; A01–A11 đã có ảnh. Mã/ZIP ở commit C/S 17d0a9c68d8b915fa9d0327eecef36e57efa552a; clone sạch đạt 12/12 dashboard, 5/5 phương thức unittest PASS. A10 xác nhận clone; A11 xác nhận repo/commit GitHub.</w:t>
       </w:r>
     </w:p>
     <w:p>
@@ -15449,7 +15449,7 @@
         <w:pStyle w:val="Nidung"/>
       </w:pPr>
       <w:r>
-        <w:t>ZIP mã nguồn đồng bộ với app.py tại commit C/S 17d0a9c68d8b915fa9d0327eecef36e57efa552a. Clone sạch: 12/12 ca dashboard PASS; unittest 5/5 phương thức PASS, trong đó có 12 subTest độc lập. A09 là ảnh dashboard; A10 chưa có ảnh (có log clone); A11 chưa có ảnh.</w:t>
+        <w:t>ZIP mã nguồn đồng bộ với app.py tại commit C/S 17d0a9c68d8b915fa9d0327eecef36e57efa552a. Clone sạch: 12/12 dashboard PASS; unittest 5/5 phương thức PASS (12 subTest). A09 là tổng kết kiểm thử, A10 là clone sạch, A11 là repo GitHub; cả A01–A11 đã có ảnh.</w:t>
       </w:r>
     </w:p>
     <w:p>
@@ -16521,7 +16521,7 @@
         <w:pStyle w:val="Nidung"/>
       </w:pPr>
       <w:r>
-        <w:t>Đã clone sạch repo tại commit 17d0a9c68d8b915fa9d0327eecef36e57efa552a, cài đặt theo requirements.txt và chạy lại: 12/12 ca dashboard PASS, 5/5 unittest PASS. Log: clone-S-test-results.txt. Ảnh A10 chưa chụp nên không tính là ảnh minh chứng.</w:t>
+        <w:t>Đã clone sạch repo tại commit 17d0a9c68d8b915fa9d0327eecef36e57efa552a, cài theo requirements.txt và chạy lại: dashboard 12/12 PASS, unittest 5/5 phương thức PASS. Log: clone-S-test-results.txt; ảnh A10 là Hình 4.10 và nằm trong Minh_chung/10_clone_sach_chay_lai.png.</w:t>
       </w:r>
     </w:p>
     <w:p>
@@ -16593,8 +16593,42 @@
             <w:vAlign w:val="center"/>
           </w:tcPr>
           <w:p>
-            <w:r>
-              <w:t>A10: Chưa có ảnh. Log clone-S-test-results.txt; SHA S 17d0a9c68d8b915fa9d0327eecef36e57efa552a; 12/12 dashboard, 5/5 unittest PASS.</w:t>
+            <w:pPr>
+              <w:jc w:val="center"/>
+            </w:pPr>
+            <w:r>
+              <w:drawing>
+                <wp:inline xmlns:a="http://schemas.openxmlformats.org/drawingml/2006/main" xmlns:pic="http://schemas.openxmlformats.org/drawingml/2006/picture">
+                  <wp:extent cx="5715000" cy="2191197"/>
+                  <wp:docPr id="10" name="Picture 10" descr="A10: terminal thật cho thấy clone SHA 17d0a9c68d8b915fa9d0327eecef36e57efa552a, 5/5 unittest OK và dashboard 12/12 PASS."/>
+                  <wp:cNvGraphicFramePr>
+                    <a:graphicFrameLocks noChangeAspect="1"/>
+                  </wp:cNvGraphicFramePr>
+                  <a:graphic>
+                    <a:graphicData uri="http://schemas.openxmlformats.org/drawingml/2006/picture">
+                      <pic:pic>
+                        <pic:nvPicPr>
+                          <pic:cNvPr id="0" name="10_clone_sach_chay_lai.png"/>
+                          <pic:cNvPicPr/>
+                        </pic:nvPicPr>
+                        <pic:blipFill>
+                          <a:blip r:embed="rId22"/>
+                          <a:stretch>
+                            <a:fillRect/>
+                          </a:stretch>
+                        </pic:blipFill>
+                        <pic:spPr>
+                          <a:xfrm>
+                            <a:off x="0" y="0"/>
+                            <a:ext cx="5715000" cy="2191197"/>
+                          </a:xfrm>
+                          <a:prstGeom prst="rect"/>
+                        </pic:spPr>
+                      </pic:pic>
+                    </a:graphicData>
+                  </a:graphic>
+                </wp:inline>
+              </w:drawing>
             </w:r>
           </w:p>
         </w:tc>
@@ -16606,7 +16640,7 @@
         <w:spacing w:before="80" w:after="100" w:line="269" w:lineRule="auto"/>
       </w:pPr>
       <w:r>
-        <w:t>Hình 4.10 CLONE — minh chứng A10 chưa có ảnh chụp; log clone sạch được liệt kê tại phụ lục B</w:t>
+        <w:t>Hình 4.10 A10 — Clone sạch tại SHA 17d0a9c68d8b915fa9d0327eecef36e57efa552a; unittest 5/5 và dashboard 12/12 PASS.</w:t>
       </w:r>
     </w:p>
     <w:p>
@@ -16670,8 +16704,42 @@
             <w:vAlign w:val="center"/>
           </w:tcPr>
           <w:p>
-            <w:r>
-              <w:t>A11: Chưa có ảnh. Repo/commit: https://github.com/nguyenthanhtan06/CTDL_N24DCDT082/commit/17d0a9c68d8b915fa9d0327eecef36e57efa552a.</w:t>
+            <w:pPr>
+              <w:jc w:val="center"/>
+            </w:pPr>
+            <w:r>
+              <w:drawing>
+                <wp:inline xmlns:a="http://schemas.openxmlformats.org/drawingml/2006/main" xmlns:pic="http://schemas.openxmlformats.org/drawingml/2006/picture">
+                  <wp:extent cx="5166360" cy="5525286"/>
+                  <wp:docPr id="11" name="Picture 11" descr="A11: GitHub repo CTDL_N24DCDT082 ở commit 17d0a9c68d8b915fa9d0327eecef36e57efa552a; repo private; ảnh chụp trang GitHub thật."/>
+                  <wp:cNvGraphicFramePr>
+                    <a:graphicFrameLocks noChangeAspect="1"/>
+                  </wp:cNvGraphicFramePr>
+                  <a:graphic>
+                    <a:graphicData uri="http://schemas.openxmlformats.org/drawingml/2006/picture">
+                      <pic:pic>
+                        <pic:nvPicPr>
+                          <pic:cNvPr id="0" name="11_github_repo_commit.png"/>
+                          <pic:cNvPicPr/>
+                        </pic:nvPicPr>
+                        <pic:blipFill>
+                          <a:blip r:embed="rId23"/>
+                          <a:stretch>
+                            <a:fillRect/>
+                          </a:stretch>
+                        </pic:blipFill>
+                        <pic:spPr>
+                          <a:xfrm>
+                            <a:off x="0" y="0"/>
+                            <a:ext cx="5166360" cy="5525286"/>
+                          </a:xfrm>
+                          <a:prstGeom prst="rect"/>
+                        </pic:spPr>
+                      </pic:pic>
+                    </a:graphicData>
+                  </a:graphic>
+                </wp:inline>
+              </w:drawing>
             </w:r>
           </w:p>
         </w:tc>
@@ -16683,7 +16751,7 @@
         <w:spacing w:before="80" w:after="100" w:line="269" w:lineRule="auto"/>
       </w:pPr>
       <w:r>
-        <w:t>Hình 4.11 GITHUB — minh chứng A11 chưa có ảnh chụp; URL và commit thật ghi tại mục 4.9</w:t>
+        <w:t>Hình 4.11 A11 — Repo GitHub CTDL_N24DCDT082 ở commit 17d0a9c68d8b915fa9d0327eecef36e57efa552a; ảnh chụp repo riêng tư.</w:t>
       </w:r>
     </w:p>
     <w:p>
@@ -16732,7 +16800,7 @@
         <w:pStyle w:val="Nidung"/>
       </w:pPr>
       <w:r>
-        <w:t>Mã nguồn trong ZIP đồng bộ với app.py tại commit C/S 17d0a9c68d8b915fa9d0327eecef36e57efa552a. Clone sạch ngày 30/10/2026 đạt 12/12 ca dashboard PASS và 5/5 phương thức unittest PASS (phương thức đầu có 12 subTest). Môi trường: Python 3.14.7, Streamlit 1.63.0, Pandas 3.0.5. A01–A09 có ảnh; A10 chưa có ảnh nhưng có log; A11 chưa có ảnh. Repo riêng tư; sinh viên cần rà soát chữ ký và thông tin khoa/ngành.</w:t>
+        <w:t>Mã nguồn ZIP đồng bộ tại commit C/S 17d0a9c68d8b915fa9d0327eecef36e57efa552a. Clone sạch ngày 30/10/2026 đạt 12/12 dashboard và 5/5 unittest PASS (12 subTest). A01–A11 đã có ảnh. Repo riêng tư; sinh viên rà chữ ký/khoa và cấp quyền cho giảng viên nếu cần.</w:t>
       </w:r>
     </w:p>
     <w:p>
@@ -16804,7 +16872,7 @@
         <w:pStyle w:val="Nidung"/>
       </w:pPr>
       <w:r>
-        <w:t>Việc còn lại trước khi nộp: tạo ảnh A10/A11 bằng thao tác thật; rà soát, ký cam đoan và xác nhận khoa/ngành; cấp quyền repo riêng cho giảng viên nếu cần; xuất PDF từ Word cuối và kiểm mục lục/số trang. Mở rộng trung tố/dấu âm đơn ngôi chỉ khi phiếu cho phép.</w:t>
+        <w:t>Việc còn lại trước khi nộp: rà soát, ký cam đoan và xác nhận khoa/ngành; cấp quyền repo riêng cho giảng viên nếu cần; xuất PDF từ Word cuối, cập nhật mục lục và kiểm tra trang. Mở rộng trung tố/dấu âm đơn ngôi chỉ khi phiếu cho phép.</w:t>
       </w:r>
     </w:p>
     <w:p>
@@ -17206,7 +17274,7 @@
           </w:tcPr>
           <w:p>
             <w:r>
-              <w:t>12/12 ca PASS; A03–A09 đã chèn</w:t>
+              <w:t>12/12 dashboard PASS; clone sạch 12/12; unittest 5/5 phương thức PASS</w:t>
             </w:r>
           </w:p>
         </w:tc>
@@ -17216,7 +17284,7 @@
           </w:tcPr>
           <w:p>
             <w:r>
-              <w:t>Bảng 3.4; Bảng 4.1–4.4; A03–A09; test-results.txt</w:t>
+              <w:t>Bảng 3.4; Bảng 4.1–4.4; A03–A11; test-results.txt; clone-S-test-results.txt</w:t>
             </w:r>
           </w:p>
         </w:tc>
@@ -17226,7 +17294,7 @@
           </w:tcPr>
           <w:p>
             <w:r>
-              <w:t>A10/A11 thiếu ảnh; khảo sát là phép đếm, không đo benchmark.</w:t>
+              <w:t>12 ca đạt; khảo sát là phép đếm, không đo benchmark thời gian.</w:t>
             </w:r>
           </w:p>
         </w:tc>
@@ -17259,7 +17327,7 @@
           </w:tcPr>
           <w:p>
             <w:r>
-              <w:t>Mẫu Word; README; ZIP; phụ lục A–D; ảnh A01–A09</w:t>
+              <w:t>Mẫu Word; README; ZIP; phụ lục A–D; ảnh A01–A11; URL/SHA/permalink; log clone.</w:t>
             </w:r>
           </w:p>
         </w:tc>
@@ -17269,7 +17337,7 @@
           </w:tcPr>
           <w:p>
             <w:r>
-              <w:t>Thiếu A10/A11; repo riêng cần cấp quyền; cần xác nhận chữ ký/khoa và xuất PDF mới.</w:t>
+              <w:t>Repo riêng cần cấp quyền; sinh viên xác nhận chữ ký/khoa; xuất PDF mới.</w:t>
             </w:r>
           </w:p>
         </w:tc>
@@ -17511,7 +17579,7 @@
         <w:pStyle w:val="Nidung"/>
       </w:pPr>
       <w:r>
-        <w:t>Bảng PL.2 ánh xạ ảnh và tệp. A01–A09 được chụp ngày 30/10/2026. Repo: https://github.com/nguyenthanhtan06/CTDL_N24DCDT082; commit nguồn C/S 17d0a9c68d8b915fa9d0327eecef36e57efa552a; permalink: https://github.com/nguyenthanhtan06/CTDL_N24DCDT082/commit/17d0a9c68d8b915fa9d0327eecef36e57efa552a. ZIP đồng bộ với app.py. A10 chưa có ảnh nhưng có log clone; A11 chưa có ảnh trang repo/commit.</w:t>
+        <w:t>Bảng PL.2 ánh xạ ảnh và tệp. A01–A11 đã được chụp từ sản phẩm/phiên bản thật; ngày ảnh A01–A09 là 30/10/2026, A10/A11 là 31/10/2026. Repo https://github.com/nguyenthanhtan06/CTDL_N24DCDT082; commit C/S 17d0a9c68d8b915fa9d0327eecef36e57efa552a; permalink https://github.com/nguyenthanhtan06/CTDL_N24DCDT082/commit/17d0a9c68d8b915fa9d0327eecef36e57efa552a; ZIP đồng bộ.</w:t>
       </w:r>
     </w:p>
     <w:tbl>
@@ -18109,7 +18177,7 @@
           </w:tcPr>
           <w:p>
             <w:r>
-              <w:t>Chưa có ảnh; log clone-S-test-results.txt; SHA S 17d0a9c68d8b915fa9d0327eecef36e57efa552a; 12/12 và 5/5 PASS.</w:t>
+              <w:t>Minh_chung/10_clone_sach_chay_lai.png — SHA S 17d0a9c68d8b915fa9d0327eecef36e57efa552a; unittest 5/5 và dashboard 12/12 PASS.</w:t>
             </w:r>
           </w:p>
         </w:tc>
@@ -18161,7 +18229,7 @@
           </w:tcPr>
           <w:p>
             <w:r>
-              <w:t>Chưa có ảnh; URL repo https://github.com/nguyenthanhtan06/CTDL_N24DCDT082; commit 17d0a9c68d8b915fa9d0327eecef36e57efa552a.</w:t>
+              <w:t>Minh_chung/11_github_repo_commit.png — repo CTDL_N24DCDT082; commit 17d0a9c68d8b915fa9d0327eecef36e57efa552a; ảnh thật.</w:t>
             </w:r>
           </w:p>
         </w:tc>
@@ -18192,7 +18260,7 @@
         <w:pStyle w:val="Nidung"/>
       </w:pPr>
       <w:r>
-        <w:t>Đã kiểm clone sạch tại commit 17d0a9c68d8b915fa9d0327eecef36e57efa552a: dashboard 12/12 PASS, unittest 5/5 phương thức PASS (12 subTest độc lập). A01–A09 có ảnh; A10 có log nhưng chưa có ảnh; A11 chưa có ảnh chụp repo/commit. SHA, permalink và ZIP đồng bộ đã đối chiếu. Còn chữ ký, xác nhận khoa/ngành, cấp quyền repo riêng cho giảng viên nếu cần và PDF xuất lại.</w:t>
+        <w:t>Clone sạch tại commit 17d0a9c68d8b915fa9d0327eecef36e57efa552a đạt 12/12 dashboard và 5/5 phương thức unittest PASS. A01–A11 đã có ảnh trong báo cáo và thư mục Minh_chung. SHA/permalink/ZIP đối chiếu được. Còn sinh viên ký cam đoan, xác nhận khoa/ngành; cấp quyền repo riêng cho giảng viên nếu cần; xuất PDF cuối.</w:t>
       </w:r>
     </w:p>
     <w:p>
@@ -18200,7 +18268,7 @@
         <w:pStyle w:val="Nidung"/>
       </w:pPr>
       <w:r>
-        <w:t>Rà soát ngày 30/10/2026 trên clone sạch tại commit 17d0a9c68d8b915fa9d0327eecef36e57efa552a: run_test_suite() đạt 12/12 ca PASS; unittest đạt 5/5 phương thức PASS (12 subTest độc lập). ZIP và app.py đồng bộ. A01–A09 có ảnh; A10/A11 còn thiếu ảnh chụp, trong đó A10 có log chạy. Repo riêng tư; cần sinh viên xác nhận chữ ký và thông tin khoa/ngành trước khi nộp.</w:t>
+        <w:t>Rà soát hồ sơ ngày 31/10/2026; kết quả kiểm clone sạch ngày 30/10/2026 ở commit 17d0a9c68d8b915fa9d0327eecef36e57efa552a: dashboard 12/12 PASS, unittest 5/5 phương thức PASS (12 subTest). ZIP đồng bộ. A01–A11 đã chèn. Repo riêng tư; sinh viên xác nhận chữ ký/khoa và cấp quyền giảng viên nếu cần; PDF cần xuất lại.</w:t>
       </w:r>
     </w:p>
     <w:p>
@@ -18239,7 +18307,7 @@
         <w:jc w:val="left"/>
       </w:pPr>
       <w:r>
-        <w:t>☑ Có 12 ca độc lập, dashboard 12/12 PASS; khảo sát Q1–Q3 đã ghi phép đếm; A01–A09 có ảnh; A10/A11 còn ảnh chụp.</w:t>
+        <w:t>☑ Có 12 ca độc lập; dashboard 12/12 PASS; khảo sát Q1–Q3; đủ ảnh A01–A11 đã chèn.</w:t>
       </w:r>
     </w:p>
     <w:p>
@@ -18667,7 +18735,7 @@
         <w:jc w:val="left"/>
       </w:pPr>
       <w:r>
-        <w:t>C là commit mã nguồn đã kiểm và dùng cho gói ZIP; S là commit clone sạch đã chạy lại. C = S = 17d0a9c68d8b915fa9d0327eecef36e57efa552a; cùng SHA-256 app.py D37E251DE761BC9C61DA536AF5B872873BBAB878CFB592F2EA17F872FE4CEB35. Clone đạt 12/12 ca dashboard và 5/5 phương thức unittest. Log tại clone-S-test-results.txt. A10/A11 chưa có ảnh chụp.</w:t>
+        <w:t>C là commit mã nguồn đã kiểm và S là commit clone sạch đã chạy lại. C = S = 17d0a9c68d8b915fa9d0327eecef36e57efa552a; SHA-256 app.py D37E251DE761BC9C61DA536AF5B872873BBAB878CFB592F2EA17F872FE4CEB35. Clone đạt 12/12 dashboard và 5/5 unittest. Ảnh A01–A11 nằm trong Minh_chung và báo cáo; log clone-S-test-results.txt.</w:t>
       </w:r>
     </w:p>
     <w:p>

</xml_diff>

<commit_message>
Finalize DT067 report and public repository details
</commit_message>
<xml_diff>
--- a/N24DCDT082_DT067_NguyenThanhTan_BaoCao.docx
+++ b/N24DCDT082_DT067_NguyenThanhTan_BaoCao.docx
@@ -836,6 +836,8 @@
     <w:p>
       <w:pPr>
         <w:sectPr>
+          <w:headerReference w:type="default" r:id="rId24"/>
+          <w:footerReference w:type="default" r:id="rId25"/>
           <w:pgSz w:w="11906" w:h="16838"/>
           <w:pgMar w:top="1134" w:right="1134" w:bottom="1134" w:left="1701" w:header="567" w:footer="567" w:gutter="0"/>
           <w:cols w:space="720"/>
@@ -2215,7 +2217,7 @@
         <w:sdtEndPr/>
         <w:sdtContent>
           <w:r>
-            <w:t>Ứng dụng Streamlit đánh giá biểu thức hậu tố DT067 bằng ngăn xếp LIFO, hiển thị lần vết từng token và tải bảng trace. Mã/ZIP đồng bộ tại commit C/S 17d0a9c68d8b915fa9d0327eecef36e57efa552a; SHA-256 app.py D37E251DE761BC9C61DA536AF5B872873BBAB878CFB592F2EA17F872FE4CEB35. Clone sạch: dashboard 12/12 PASS, unittest 5/5 phương thức PASS (12 subTest), Python 3.14.7, Streamlit 1.63.0, Pandas 3.0.5. Chia nguyên cắt về 0; validator xử lý token, miền số, thiếu/dư toán hạng, chia 0, số mũ và tràn Int128. Ảnh A01–A11 đã chèn. Cần ký cam đoan, xác nhận khoa/ngành, cấp quyền repo riêng cho giảng viên nếu cần và xuất PDF mới.</w:t>
+            <w:t>Ứng dụng Streamlit đánh giá biểu thức hậu tố DT067 bằng ngăn xếp LIFO, hiển thị lần vết từng token và tải bảng trace. Mã/ZIP đồng bộ tại commit C/S 17d0a9c68d8b915fa9d0327eecef36e57efa552a; SHA-256 app.py D37E251DE761BC9C61DA536AF5B872873BBAB878CFB592F2EA17F872FE4CEB35. Clone sạch: dashboard 12/12 PASS, unittest 5/5 phương thức PASS (12 subTest), Python 3.14.7, Streamlit 1.63.0, Pandas 3.0.5. Chia nguyên cắt về 0; validator xử lý token, miền số, thiếu/dư toán hạng, chia 0, số mũ và tràn Int128. Ảnh A01–A11 đã chèn. Cần sinh viên ký cam đoan và xác nhận khoa/ngành trước khi nộp. Repo đã công khai ngày 31/10/2026; PDF đã xuất và rà soát.</w:t>
           </w:r>
         </w:sdtContent>
       </w:sdt>
@@ -7103,7 +7105,7 @@
         </w:rPr>
       </w:pPr>
       <w:r>
-        <w:t>Hình 4.11 A11 — Repo GitHub CTDL_N24DCDT082 ở commit 17d0a9c68d8b915fa9d0327eecef36e57efa552a; ảnh chụp repo riêng tư.</w:t>
+        <w:t>Hình 4.11 A11 — Repo GitHub CTDL_N24DCDT082 ở commit 17d0a9c68d8b915fa9d0327eecef36e57efa552a; ảnh chụp ngày 31/10/2026 ghi nhận trạng thái riêng tư trước khi repo được chuyển công khai.</w:t>
       </w:r>
     </w:p>
     <w:p/>
@@ -16235,7 +16237,7 @@
         <w:pStyle w:val="Nidung"/>
       </w:pPr>
       <w:r>
-        <w:t>Repo riêng: https://github.com/nguyenthanhtan06/CTDL_N24DCDT082; commit nguồn C/S: 17d0a9c68d8b915fa9d0327eecef36e57efa552a; permalink: https://github.com/nguyenthanhtan06/CTDL_N24DCDT082/commit/17d0a9c68d8b915fa9d0327eecef36e57efa552a. ZIP đồng bộ với app.py. SHA-256 app.py: D37E251DE761BC9C61DA536AF5B872873BBAB878CFB592F2EA17F872FE4CEB35. Hàm evaluate_postfix_with_trace: https://github.com/nguyenthanhtan06/CTDL_N24DCDT082/blob/17d0a9c68d8b915fa9d0327eecef36e57efa552a/app.py#L135; kiểm thử: https://github.com/nguyenthanhtan06/CTDL_N24DCDT082/blob/17d0a9c68d8b915fa9d0327eecef36e57efa552a/test_postfix.py#L7. Clone sạch đạt 12/12 ca và 5/5 phương thức unittest PASS. Repo riêng tư; cấp quyền giảng viên nếu cần.</w:t>
+        <w:t>Repo công khai: https://github.com/nguyenthanhtan06/CTDL_N24DCDT082; commit nguồn C/S: 17d0a9c68d8b915fa9d0327eecef36e57efa552a; permalink: https://github.com/nguyenthanhtan06/CTDL_N24DCDT082/commit/17d0a9c68d8b915fa9d0327eecef36e57efa552a. ZIP đồng bộ với app.py. SHA-256 app.py: D37E251DE761BC9C61DA536AF5B872873BBAB878CFB592F2EA17F872FE4CEB35. Hàm evaluate_postfix_with_trace: https://github.com/nguyenthanhtan06/CTDL_N24DCDT082/blob/17d0a9c68d8b915fa9d0327eecef36e57efa552a/app.py#L135; kiểm thử: https://github.com/nguyenthanhtan06/CTDL_N24DCDT082/blob/17d0a9c68d8b915fa9d0327eecef36e57efa552a/test_postfix.py#L7. Clone sạch đạt 12/12 ca và 5/5 phương thức unittest PASS. Repo đã chuyển công khai ngày 31/10/2026; giảng viên có thể truy cập trực tiếp.</w:t>
       </w:r>
     </w:p>
     <w:p>
@@ -16358,7 +16360,7 @@
           </w:tcPr>
           <w:p>
             <w:r>
-              <w:t>https://github.com/nguyenthanhtan06/CTDL_N24DCDT082 (riêng tư)</w:t>
+              <w:t>https://github.com/nguyenthanhtan06/CTDL_N24DCDT082 (công khai từ 31/10/2026)</w:t>
             </w:r>
           </w:p>
         </w:tc>
@@ -16751,7 +16753,7 @@
         <w:spacing w:before="80" w:after="100" w:line="269" w:lineRule="auto"/>
       </w:pPr>
       <w:r>
-        <w:t>Hình 4.11 A11 — Repo GitHub CTDL_N24DCDT082 ở commit 17d0a9c68d8b915fa9d0327eecef36e57efa552a; ảnh chụp repo riêng tư.</w:t>
+        <w:t>Hình 4.11 A11 — Repo GitHub CTDL_N24DCDT082 ở commit 17d0a9c68d8b915fa9d0327eecef36e57efa552a; ảnh chụp ngày 31/10/2026 ghi nhận trạng thái riêng tư trước khi repo được chuyển công khai.</w:t>
       </w:r>
     </w:p>
     <w:p>
@@ -16800,7 +16802,7 @@
         <w:pStyle w:val="Nidung"/>
       </w:pPr>
       <w:r>
-        <w:t>Mã nguồn ZIP đồng bộ tại commit C/S 17d0a9c68d8b915fa9d0327eecef36e57efa552a. Clone sạch ngày 30/10/2026 đạt 12/12 dashboard và 5/5 unittest PASS (12 subTest). A01–A11 đã có ảnh. Repo riêng tư; sinh viên rà chữ ký/khoa và cấp quyền cho giảng viên nếu cần.</w:t>
+        <w:t>Mã nguồn ZIP đồng bộ tại commit C/S 17d0a9c68d8b915fa9d0327eecef36e57efa552a. Clone sạch ngày 30/10/2026 đạt 12/12 dashboard và 5/5 unittest PASS (12 subTest). A01–A11 đã có ảnh. Repo đã chuyển công khai ngày 31/10/2026; sinh viên rà soát chữ ký và xác nhận khoa/ngành trước khi nộp.</w:t>
       </w:r>
     </w:p>
     <w:p>
@@ -16872,7 +16874,7 @@
         <w:pStyle w:val="Nidung"/>
       </w:pPr>
       <w:r>
-        <w:t>Việc còn lại trước khi nộp: rà soát, ký cam đoan và xác nhận khoa/ngành; cấp quyền repo riêng cho giảng viên nếu cần; xuất PDF từ Word cuối, cập nhật mục lục và kiểm tra trang. Mở rộng trung tố/dấu âm đơn ngôi chỉ khi phiếu cho phép.</w:t>
+        <w:t>Việc còn lại trước khi nộp: sinh viên rà soát, ký cam đoan và xác nhận khoa/ngành; mở rộng trung tố/dấu âm đơn ngôi chỉ khi phiếu cho phép. PDF cuối đã xuất ngày 31/10/2026, mục lục đã cập nhật và các trang đã được rà soát.</w:t>
       </w:r>
     </w:p>
     <w:p>
@@ -17337,7 +17339,7 @@
           </w:tcPr>
           <w:p>
             <w:r>
-              <w:t>Repo riêng cần cấp quyền; sinh viên xác nhận chữ ký/khoa; xuất PDF mới.</w:t>
+              <w:t>Repo đã công khai ngày 31/10/2026; PDF đã xuất và rà soát; sinh viên cần xác nhận chữ ký/khoa.</w:t>
             </w:r>
           </w:p>
         </w:tc>
@@ -18260,7 +18262,7 @@
         <w:pStyle w:val="Nidung"/>
       </w:pPr>
       <w:r>
-        <w:t>Clone sạch tại commit 17d0a9c68d8b915fa9d0327eecef36e57efa552a đạt 12/12 dashboard và 5/5 phương thức unittest PASS. A01–A11 đã có ảnh trong báo cáo và thư mục Minh_chung. SHA/permalink/ZIP đối chiếu được. Còn sinh viên ký cam đoan, xác nhận khoa/ngành; cấp quyền repo riêng cho giảng viên nếu cần; xuất PDF cuối.</w:t>
+        <w:t>Clone sạch tại commit 17d0a9c68d8b915fa9d0327eecef36e57efa552a đạt 12/12 dashboard và 5/5 phương thức unittest PASS. A01–A11 đã có ảnh trong báo cáo và thư mục Minh_chung. SHA/permalink/ZIP đối chiếu được. Còn sinh viên ký cam đoan và xác nhận khoa/ngành; repo đã công khai; PDF cuối đã xuất ngày 31/10/2026.</w:t>
       </w:r>
     </w:p>
     <w:p>
@@ -18268,7 +18270,7 @@
         <w:pStyle w:val="Nidung"/>
       </w:pPr>
       <w:r>
-        <w:t>Rà soát hồ sơ ngày 31/10/2026; kết quả kiểm clone sạch ngày 30/10/2026 ở commit 17d0a9c68d8b915fa9d0327eecef36e57efa552a: dashboard 12/12 PASS, unittest 5/5 phương thức PASS (12 subTest). ZIP đồng bộ. A01–A11 đã chèn. Repo riêng tư; sinh viên xác nhận chữ ký/khoa và cấp quyền giảng viên nếu cần; PDF cần xuất lại.</w:t>
+        <w:t>Rà soát hồ sơ ngày 31/10/2026; kết quả kiểm clone sạch ngày 30/10/2026 ở commit 17d0a9c68d8b915fa9d0327eecef36e57efa552a: dashboard 12/12 PASS, unittest 5/5 phương thức PASS (12 subTest). ZIP đồng bộ. A01–A11 đã chèn. Repo công khai từ ngày 31/10/2026; PDF đã xuất ngày 31/10/2026. Sinh viên cần xác nhận chữ ký và khoa/ngành.</w:t>
       </w:r>
     </w:p>
     <w:p>
@@ -18332,7 +18334,7 @@
         <w:jc w:val="left"/>
       </w:pPr>
       <w:r>
-        <w:t>☒ Đã có URL GitHub, SHA C/S, permalink và log clone sạch tại mục 4.9; repo riêng tư, cần cấp quyền cho giảng viên nếu cần.</w:t>
+        <w:t>☒ Đã có URL GitHub, SHA C/S, permalink và log clone sạch tại mục 4.9; repo đã công khai ngày 31/10/2026.</w:t>
       </w:r>
     </w:p>
     <w:p>
@@ -18343,7 +18345,7 @@
         <w:jc w:val="left"/>
       </w:pPr>
       <w:r>
-        <w:t>☐ Cần xuất PDF mới từ Word cuối, cập nhật mục lục và rà soát Word/PDF từng trang.</w:t>
+        <w:t>☑ PDF đã xuất từ bản Word cuối ngày 31/10/2026; mục lục đã cập nhật; 46 trang đã được rà soát.</w:t>
       </w:r>
     </w:p>
     <w:p>
@@ -19096,6 +19098,16 @@
 </w:ftr>
 </file>
 
+<file path=word/footer4.xml><?xml version="1.0" encoding="utf-8"?>
+<w:ftr xmlns:m="http://schemas.openxmlformats.org/officeDocument/2006/math" xmlns:mc="http://schemas.openxmlformats.org/markup-compatibility/2006" xmlns:mo="http://schemas.microsoft.com/office/mac/office/2008/main" xmlns:mv="urn:schemas-microsoft-com:mac:vml" xmlns:o="urn:schemas-microsoft-com:office:office" xmlns:r="http://schemas.openxmlformats.org/officeDocument/2006/relationships" xmlns:v="urn:schemas-microsoft-com:vml" xmlns:w10="urn:schemas-microsoft-com:office:word" xmlns:w14="http://schemas.microsoft.com/office/word/2010/wordml" xmlns:w="http://schemas.openxmlformats.org/wordprocessingml/2006/main" xmlns:wne="http://schemas.microsoft.com/office/word/2006/wordml" xmlns:wp14="http://schemas.microsoft.com/office/word/2010/wordprocessingDrawing" xmlns:wp="http://schemas.openxmlformats.org/drawingml/2006/wordprocessingDrawing" xmlns:wpc="http://schemas.microsoft.com/office/word/2010/wordprocessingCanvas" xmlns:wpg="http://schemas.microsoft.com/office/word/2010/wordprocessingGroup" xmlns:wpi="http://schemas.microsoft.com/office/word/2010/wordprocessingInk" xmlns:wps="http://schemas.microsoft.com/office/word/2010/wordprocessingShape" mc:Ignorable="w14 wp14">
+  <w:p>
+    <w:pPr>
+      <w:pStyle w:val="Footer"/>
+    </w:pPr>
+  </w:p>
+</w:ftr>
+</file>
+
 <file path=word/footnotes.xml><?xml version="1.0" encoding="utf-8"?>
 <w:footnotes xmlns:wpc="http://schemas.microsoft.com/office/word/2010/wordprocessingCanvas" xmlns:cx="http://schemas.microsoft.com/office/drawing/2014/chartex" xmlns:cx1="http://schemas.microsoft.com/office/drawing/2015/9/8/chartex" xmlns:cx2="http://schemas.microsoft.com/office/drawing/2015/10/21/chartex" xmlns:cx3="http://schemas.microsoft.com/office/drawing/2016/5/9/chartex" xmlns:cx4="http://schemas.microsoft.com/office/drawing/2016/5/10/chartex" xmlns:cx5="http://schemas.microsoft.com/office/drawing/2016/5/11/chartex" xmlns:cx6="http://schemas.microsoft.com/office/drawing/2016/5/12/chartex" xmlns:cx7="http://schemas.microsoft.com/office/drawing/2016/5/13/chartex" xmlns:cx8="http://schemas.microsoft.com/office/drawing/2016/5/14/chartex" xmlns:mc="http://schemas.openxmlformats.org/markup-compatibility/2006" xmlns:aink="http://schemas.microsoft.com/office/drawing/2016/ink" xmlns:am3d="http://schemas.microsoft.com/office/drawing/2017/model3d" xmlns:o="urn:schemas-microsoft-com:office:office" xmlns:oel="http://schemas.microsoft.com/office/2019/extlst" xmlns:r="http://schemas.openxmlformats.org/officeDocument/2006/relationships" xmlns:m="http://schemas.openxmlformats.org/officeDocument/2006/math" xmlns:v="urn:schemas-microsoft-com:vml" xmlns:wp14="http://schemas.microsoft.com/office/word/2010/wordprocessingDrawing" xmlns:wp="http://schemas.openxmlformats.org/drawingml/2006/wordprocessingDrawing" xmlns:w10="urn:schemas-microsoft-com:office:word" xmlns:w="http://schemas.openxmlformats.org/wordprocessingml/2006/main" xmlns:w14="http://schemas.microsoft.com/office/word/2010/wordml" xmlns:w15="http://schemas.microsoft.com/office/word/2012/wordml" xmlns:w16cex="http://schemas.microsoft.com/office/word/2018/wordml/cex" xmlns:w16cid="http://schemas.microsoft.com/office/word/2016/wordml/cid" xmlns:w16="http://schemas.microsoft.com/office/word/2018/wordml" xmlns:w16du="http://schemas.microsoft.com/office/word/2023/wordml/word16du" xmlns:w16sdtdh="http://schemas.microsoft.com/office/word/2020/wordml/sdtdatahash" xmlns:w16sdtfl="http://schemas.microsoft.com/office/word/2024/wordml/sdtformatlock" xmlns:w16se="http://schemas.microsoft.com/office/word/2015/wordml/symex" xmlns:wpg="http://schemas.microsoft.com/office/word/2010/wordprocessingGroup" xmlns:wpi="http://schemas.microsoft.com/office/word/2010/wordprocessingInk" xmlns:wne="http://schemas.microsoft.com/office/word/2006/wordml" xmlns:wps="http://schemas.microsoft.com/office/word/2010/wordprocessingShape" mc:Ignorable="w14 w15 w16se w16cid w16 w16cex w16sdtdh w16sdtfl w16du wp14">
   <w:footnote w:type="separator" w:id="-1">
@@ -19113,6 +19125,16 @@
     </w:p>
   </w:footnote>
 </w:footnotes>
+</file>
+
+<file path=word/header1.xml><?xml version="1.0" encoding="utf-8"?>
+<w:hdr xmlns:m="http://schemas.openxmlformats.org/officeDocument/2006/math" xmlns:mc="http://schemas.openxmlformats.org/markup-compatibility/2006" xmlns:mo="http://schemas.microsoft.com/office/mac/office/2008/main" xmlns:mv="urn:schemas-microsoft-com:mac:vml" xmlns:o="urn:schemas-microsoft-com:office:office" xmlns:r="http://schemas.openxmlformats.org/officeDocument/2006/relationships" xmlns:v="urn:schemas-microsoft-com:vml" xmlns:w10="urn:schemas-microsoft-com:office:word" xmlns:w14="http://schemas.microsoft.com/office/word/2010/wordml" xmlns:w="http://schemas.openxmlformats.org/wordprocessingml/2006/main" xmlns:wne="http://schemas.microsoft.com/office/word/2006/wordml" xmlns:wp14="http://schemas.microsoft.com/office/word/2010/wordprocessingDrawing" xmlns:wp="http://schemas.openxmlformats.org/drawingml/2006/wordprocessingDrawing" xmlns:wpc="http://schemas.microsoft.com/office/word/2010/wordprocessingCanvas" xmlns:wpg="http://schemas.microsoft.com/office/word/2010/wordprocessingGroup" xmlns:wpi="http://schemas.microsoft.com/office/word/2010/wordprocessingInk" xmlns:wps="http://schemas.microsoft.com/office/word/2010/wordprocessingShape" mc:Ignorable="w14 wp14">
+  <w:p>
+    <w:pPr>
+      <w:pStyle w:val="Header"/>
+    </w:pPr>
+  </w:p>
+</w:hdr>
 </file>
 
 <file path=word/numbering.xml><?xml version="1.0" encoding="utf-8"?>

</xml_diff>

<commit_message>
Update DT067 report dash cleanup
</commit_message>
<xml_diff>
--- a/N24DCDT082_DT067_NguyenThanhTan_BaoCao.docx
+++ b/N24DCDT082_DT067_NguyenThanhTan_BaoCao.docx
@@ -1960,7 +1960,7 @@
           <w:b/>
           <w:sz w:val="24"/>
         </w:rPr>
-        <w:t>C1 Đặc tả bài toán, đầu vào và đầu ra — trọng số 1.5</w:t>
+        <w:t>C1 Đặc tả bài toán, đầu vào và đầu ra - trọng số 1.5</w:t>
       </w:r>
     </w:p>
     <w:p>
@@ -1989,7 +1989,7 @@
           <w:b/>
           <w:sz w:val="24"/>
         </w:rPr>
-        <w:t>C2 Biểu diễn dữ liệu và phần tự cài — trọng số 2</w:t>
+        <w:t>C2 Biểu diễn dữ liệu và phần tự cài - trọng số 2</w:t>
       </w:r>
     </w:p>
     <w:p>
@@ -2018,7 +2018,7 @@
           <w:b/>
           <w:sz w:val="24"/>
         </w:rPr>
-        <w:t>C3 Tính đúng của thuật toán và lần vết — trọng số 2.5</w:t>
+        <w:t>C3 Tính đúng của thuật toán và lần vết - trọng số 2.5</w:t>
       </w:r>
     </w:p>
     <w:p>
@@ -2047,7 +2047,7 @@
           <w:b/>
           <w:sz w:val="24"/>
         </w:rPr>
-        <w:t>C4 Kiểm thử, đối chiếu và độ phức tạp — trọng số 2</w:t>
+        <w:t>C4 Kiểm thử, đối chiếu và độ phức tạp - trọng số 2</w:t>
       </w:r>
     </w:p>
     <w:p>
@@ -2076,7 +2076,7 @@
           <w:b/>
           <w:sz w:val="24"/>
         </w:rPr>
-        <w:t>C5 Báo cáo, minh chứng và GitHub — trọng số 1</w:t>
+        <w:t>C5 Báo cáo, minh chứng và GitHub - trọng số 1</w:t>
       </w:r>
     </w:p>
     <w:p>
@@ -2105,7 +2105,7 @@
           <w:b/>
           <w:sz w:val="24"/>
         </w:rPr>
-        <w:t>C6 Bảo vệ và giải thích sản phẩm — trọng số 1</w:t>
+        <w:t>C6 Bảo vệ và giải thích sản phẩm - trọng số 1</w:t>
       </w:r>
     </w:p>
     <w:p>
@@ -2167,12 +2167,113 @@
     <w:p>
       <w:pPr>
         <w:pStyle w:val="Nidung"/>
-        <w:spacing w:before="0" w:after="100" w:line="269" w:lineRule="auto"/>
+        <w:keepLines/>
+        <w:spacing w:before="0" w:after="160" w:line="276" w:lineRule="auto"/>
+        <w:ind w:firstLine="432"/>
+        <w:jc w:val="both"/>
+      </w:pPr>
+      <w:r>
+        <w:rPr>
+          <w:rFonts w:ascii="Times New Roman" w:hAnsi="Times New Roman" w:eastAsia="Times New Roman"/>
+          <w:sz w:val="24"/>
+        </w:rPr>
+        <w:t>Em xin cam đoan báo cáo đồ án “Tính giá trị biểu thức hậu tố bằng ngăn xếp” được thực hiện theo phạm vi đề tài được giao, dựa trên quá trình tìm hiểu, xây dựng và kiểm thử của em. Các nội dung tham khảo từ giáo trình, tài liệu và nguồn khác đã được ghi nhận trong phần Tài liệu tham khảo.</w:t>
+      </w:r>
+    </w:p>
+    <w:p>
+      <w:pPr>
+        <w:pStyle w:val="Nidung"/>
+        <w:keepLines/>
+        <w:spacing w:line="276" w:lineRule="auto" w:after="160"/>
+        <w:ind w:firstLine="432"/>
+        <w:jc w:val="both"/>
+      </w:pPr>
+      <w:r>
+        <w:rPr>
+          <w:rFonts w:ascii="Times New Roman" w:hAnsi="Times New Roman" w:eastAsia="Times New Roman"/>
+          <w:sz w:val="24"/>
+        </w:rPr>
+        <w:t>Trong quá trình thực hiện, em có sử dụng ChatGPT/Codex để hỗ trợ tham khảo ý tưởng, rà soát lỗi và hoàn thiện giao diện, tài liệu. Em đã rà soát và chịu trách nhiệm về nội dung báo cáo, mã nguồn, kết quả kiểm thử và minh chứng được nộp. Em chỉ xác nhận là phần tự thực hiện đối với những nội dung em đã trực tiếp thực hiện, hiểu và có thể giải thích.</w:t>
+      </w:r>
+    </w:p>
+    <w:p>
+      <w:pPr>
+        <w:pStyle w:val="Nidung"/>
+        <w:keepLines/>
+        <w:spacing w:line="276" w:lineRule="auto" w:after="160"/>
+        <w:ind w:firstLine="432"/>
+        <w:jc w:val="both"/>
+      </w:pPr>
+      <w:r>
+        <w:rPr>
+          <w:rFonts w:ascii="Times New Roman" w:hAnsi="Times New Roman" w:eastAsia="Times New Roman"/>
+          <w:sz w:val="24"/>
+        </w:rPr>
+        <w:t>Em xin cam đoan các thông tin nêu trên là trung thực và xin chịu trách nhiệm về lời cam đoan này.</w:t>
+      </w:r>
+    </w:p>
+    <w:p>
+      <w:pPr>
+        <w:pStyle w:val="Nidung"/>
+        <w:keepLines/>
+        <w:spacing w:line="276" w:lineRule="auto" w:after="80"/>
         <w:ind w:firstLine="0"/>
-        <w:jc w:val="center"/>
+        <w:jc w:val="right"/>
       </w:pPr>
       <w:r>
-        <w:t>Sinh viên cần tự rà soát và xác nhận nội dung cam đoan theo đúng phần việc, nguồn tham khảo, công cụ hỗ trợ và ảnh thực tế; ký tên trước khi nộp. Chữ ký trong bảng dưới đây hiện để trống.</w:t>
+        <w:rPr>
+          <w:rFonts w:ascii="Times New Roman" w:hAnsi="Times New Roman" w:eastAsia="Times New Roman"/>
+          <w:sz w:val="24"/>
+        </w:rPr>
+        <w:t>Thành phố Hồ Chí Minh, ngày …… tháng …… năm 2026</w:t>
+      </w:r>
+    </w:p>
+    <w:p>
+      <w:pPr>
+        <w:pStyle w:val="Nidung"/>
+        <w:keepLines/>
+        <w:spacing w:line="276" w:lineRule="auto" w:after="40"/>
+        <w:ind w:firstLine="0"/>
+        <w:jc w:val="right"/>
+      </w:pPr>
+      <w:r>
+        <w:rPr>
+          <w:rFonts w:ascii="Times New Roman" w:hAnsi="Times New Roman" w:eastAsia="Times New Roman"/>
+          <w:sz w:val="24"/>
+        </w:rPr>
+        <w:t>Sinh viên thực hiện</w:t>
+      </w:r>
+    </w:p>
+    <w:p>
+      <w:pPr>
+        <w:pStyle w:val="Nidung"/>
+        <w:keepLines/>
+        <w:spacing w:line="276" w:lineRule="auto" w:after="560"/>
+        <w:ind w:firstLine="0"/>
+        <w:jc w:val="right"/>
+      </w:pPr>
+      <w:r>
+        <w:rPr>
+          <w:rFonts w:ascii="Times New Roman" w:hAnsi="Times New Roman" w:eastAsia="Times New Roman"/>
+          <w:sz w:val="24"/>
+        </w:rPr>
+        <w:t>(Ký và ghi rõ họ tên)</w:t>
+      </w:r>
+    </w:p>
+    <w:p>
+      <w:pPr>
+        <w:pStyle w:val="Nidung"/>
+        <w:keepLines/>
+        <w:spacing w:line="276" w:lineRule="auto" w:after="0"/>
+        <w:ind w:firstLine="0"/>
+        <w:jc w:val="right"/>
+      </w:pPr>
+      <w:r>
+        <w:rPr>
+          <w:rFonts w:ascii="Times New Roman" w:hAnsi="Times New Roman" w:eastAsia="Times New Roman"/>
+          <w:sz w:val="24"/>
+        </w:rPr>
+        <w:t>Nguyễn Thành Tân</w:t>
       </w:r>
     </w:p>
     <w:p>
@@ -4390,7 +4491,7 @@
             <w:rStyle w:val="Hyperlink"/>
             <w:noProof/>
           </w:rPr>
-          <w:t>4.6. Kiểm tra input không hợp lệ — LOI01</w:t>
+          <w:t>4.6. Kiểm tra input không hợp lệ - LOI01</w:t>
         </w:r>
         <w:r>
           <w:rPr>
@@ -6859,7 +6960,7 @@
         </w:rPr>
       </w:pPr>
       <w:r>
-        <w:t>Hình 4.1 VD01 — kết quả 37, stack cuối [37], hoàn tất 9/9 token.</w:t>
+        <w:t>Hình 4.1 VD01 - kết quả 37, stack cuối [37], hoàn tất 9/9 token.</w:t>
       </w:r>
       <w:r>
         <w:tab/>
@@ -6884,7 +6985,7 @@
         </w:rPr>
       </w:pPr>
       <w:r>
-        <w:t>Hình 4.2 VD02 — kết quả 512, lũy thừa kết hợp phải.</w:t>
+        <w:t>Hình 4.2 VD02 - kết quả 512, lũy thừa kết hợp phải.</w:t>
       </w:r>
       <w:r>
         <w:tab/>
@@ -6909,7 +7010,7 @@
         </w:rPr>
       </w:pPr>
       <w:r>
-        <w:t>Hình 4.3 TK01 — 8 − 3 = 5.</w:t>
+        <w:t>Hình 4.3 TK01 - 8 − 3 = 5.</w:t>
       </w:r>
       <w:r>
         <w:tab/>
@@ -6934,7 +7035,7 @@
         </w:rPr>
       </w:pPr>
       <w:r>
-        <w:t>Hình 4.4 TK02 — 3 − 8 = −5.</w:t>
+        <w:t>Hình 4.4 TK02 - 3 − 8 = −5.</w:t>
       </w:r>
       <w:r>
         <w:tab/>
@@ -6959,7 +7060,7 @@
         </w:rPr>
       </w:pPr>
       <w:r>
-        <w:t>Hình 4.5 BIEN01 — 7 / 2 = 3, chia nguyên cắt về 0.</w:t>
+        <w:t>Hình 4.5 BIEN01 - 7 / 2 = 3, chia nguyên cắt về 0.</w:t>
       </w:r>
       <w:r>
         <w:tab/>
@@ -6984,7 +7085,7 @@
         </w:rPr>
       </w:pPr>
       <w:r>
-        <w:t>Hình 4.6 BIEN02 — 0 − 7 rồi chia 2 = −3.</w:t>
+        <w:t>Hình 4.6 BIEN02 - 0 − 7 rồi chia 2 = −3.</w:t>
       </w:r>
       <w:r>
         <w:tab/>
@@ -7009,7 +7110,7 @@
         </w:rPr>
       </w:pPr>
       <w:r>
-        <w:t>Hình 4.7 BIEN03 — 100 ^ 0 = 1.</w:t>
+        <w:t>Hình 4.7 BIEN03 - 100 ^ 0 = 1.</w:t>
       </w:r>
       <w:r>
         <w:tab/>
@@ -7034,7 +7135,7 @@
         </w:rPr>
       </w:pPr>
       <w:r>
-        <w:t>Hình 4.8 LOI01 — ứng dụng báo lỗi chia cho 0.</w:t>
+        <w:t>Hình 4.8 LOI01 - ứng dụng báo lỗi chia cho 0.</w:t>
       </w:r>
       <w:r>
         <w:tab/>
@@ -7059,7 +7160,7 @@
         </w:rPr>
       </w:pPr>
       <w:r>
-        <w:t>Hình 4.9 Bộ kiểm thử DT067 — 12/12 PASS, 0 FAIL.</w:t>
+        <w:t>Hình 4.9 Bộ kiểm thử DT067 - 12/12 PASS, 0 FAIL.</w:t>
       </w:r>
       <w:r>
         <w:tab/>
@@ -7084,7 +7185,7 @@
         </w:rPr>
       </w:pPr>
       <w:r>
-        <w:t>Hình 4.10 A10 — Clone sạch tại SHA 17d0a9c68d8b915fa9d0327eecef36e57efa552a; unittest 5/5 và dashboard 12/12 PASS.</w:t>
+        <w:t>Hình 4.10 A10 - Clone sạch tại SHA 17d0a9c68d8b915fa9d0327eecef36e57efa552a; unittest 5/5 và dashboard 12/12 PASS.</w:t>
       </w:r>
     </w:p>
     <w:p>
@@ -7105,7 +7206,7 @@
         </w:rPr>
       </w:pPr>
       <w:r>
-        <w:t>Hình 4.11 A11 — Repo GitHub CTDL_N24DCDT082 ở commit 17d0a9c68d8b915fa9d0327eecef36e57efa552a; ảnh chụp ngày 31/10/2026 ghi nhận trạng thái riêng tư trước khi repo được chuyển công khai.</w:t>
+        <w:t>Hình 4.11 A11 - Repo GitHub CTDL_N24DCDT082 ở commit 17d0a9c68d8b915fa9d0327eecef36e57efa552a; ảnh chụp ngày 31/10/2026 ghi nhận trạng thái riêng tư trước khi repo được chuyển công khai.</w:t>
       </w:r>
     </w:p>
     <w:p/>
@@ -7855,7 +7956,7 @@
               <w:sdtContent/>
             </w:sdt>
             <w:r>
-              <w:t>—</w:t>
+              <w:t>-</w:t>
             </w:r>
           </w:p>
         </w:tc>
@@ -10510,7 +10611,7 @@
               <w:sdtContent/>
             </w:sdt>
             <w:r>
-              <w:t>—</w:t>
+              <w:t>-</w:t>
             </w:r>
           </w:p>
         </w:tc>
@@ -13610,7 +13711,7 @@
           </w:tcPr>
           <w:p>
             <w:r>
-              <w:t>PASS — Expected khớp Actual</w:t>
+              <w:t>PASS - Expected khớp Actual</w:t>
             </w:r>
           </w:p>
         </w:tc>
@@ -13659,7 +13760,7 @@
           </w:tcPr>
           <w:p>
             <w:r>
-              <w:t>PASS — Expected khớp Actual</w:t>
+              <w:t>PASS - Expected khớp Actual</w:t>
             </w:r>
           </w:p>
         </w:tc>
@@ -13708,7 +13809,7 @@
           </w:tcPr>
           <w:p>
             <w:r>
-              <w:t>PASS — Expected khớp Actual</w:t>
+              <w:t>PASS - Expected khớp Actual</w:t>
             </w:r>
           </w:p>
         </w:tc>
@@ -13757,7 +13858,7 @@
           </w:tcPr>
           <w:p>
             <w:r>
-              <w:t>PASS — Expected khớp Actual</w:t>
+              <w:t>PASS - Expected khớp Actual</w:t>
             </w:r>
           </w:p>
         </w:tc>
@@ -13806,7 +13907,7 @@
           </w:tcPr>
           <w:p>
             <w:r>
-              <w:t>PASS — Expected khớp Actual</w:t>
+              <w:t>PASS - Expected khớp Actual</w:t>
             </w:r>
           </w:p>
         </w:tc>
@@ -13855,7 +13956,7 @@
           </w:tcPr>
           <w:p>
             <w:r>
-              <w:t>PASS — Expected khớp Actual</w:t>
+              <w:t>PASS - Expected khớp Actual</w:t>
             </w:r>
           </w:p>
         </w:tc>
@@ -13904,7 +14005,7 @@
           </w:tcPr>
           <w:p>
             <w:r>
-              <w:t>PASS — Expected khớp Actual</w:t>
+              <w:t>PASS - Expected khớp Actual</w:t>
             </w:r>
           </w:p>
         </w:tc>
@@ -13953,7 +14054,7 @@
           </w:tcPr>
           <w:p>
             <w:r>
-              <w:t>PASS — Expected khớp Actual</w:t>
+              <w:t>PASS - Expected khớp Actual</w:t>
             </w:r>
           </w:p>
         </w:tc>
@@ -14002,7 +14103,7 @@
           </w:tcPr>
           <w:p>
             <w:r>
-              <w:t>PASS — Expected khớp Actual</w:t>
+              <w:t>PASS - Expected khớp Actual</w:t>
             </w:r>
           </w:p>
         </w:tc>
@@ -14051,7 +14152,7 @@
           </w:tcPr>
           <w:p>
             <w:r>
-              <w:t>PASS — Expected khớp Actual</w:t>
+              <w:t>PASS - Expected khớp Actual</w:t>
             </w:r>
           </w:p>
         </w:tc>
@@ -14101,7 +14202,7 @@
           </w:tcPr>
           <w:p>
             <w:r>
-              <w:t>PASS — Expected khớp Actual</w:t>
+              <w:t>PASS - Expected khớp Actual</w:t>
             </w:r>
           </w:p>
         </w:tc>
@@ -14150,7 +14251,7 @@
           </w:tcPr>
           <w:p>
             <w:r>
-              <w:t>PASS — Expected khớp Actual</w:t>
+              <w:t>PASS - Expected khớp Actual</w:t>
             </w:r>
           </w:p>
         </w:tc>
@@ -14195,7 +14296,7 @@
         <w:pStyle w:val="Heading3"/>
       </w:pPr>
       <w:r>
-        <w:t>4.3.1. Ví dụ 1 — VD01</w:t>
+        <w:t>4.3.1. Ví dụ 1 - VD01</w:t>
       </w:r>
     </w:p>
     <w:p>
@@ -14271,7 +14372,7 @@
                 <wp:inline distT="0" distB="0" distL="0" distR="0" wp14:anchorId="22BB9431" wp14:editId="1130E59C">
                   <wp:extent cx="5257800" cy="3943350"/>
                   <wp:effectExtent l="0" t="0" r="0" b="0"/>
-                  <wp:docPr id="1" name="Picture 1" descr="Ảnh A01: VD01 — kết quả 37, stack cuối [37], hoàn tất 9/9 token."/>
+                  <wp:docPr id="1" name="Picture 1" descr="Ảnh A01: VD01 - kết quả 37, stack cuối [37], hoàn tất 9/9 token."/>
                   <wp:cNvGraphicFramePr>
                     <a:graphicFrameLocks xmlns:a="http://schemas.openxmlformats.org/drawingml/2006/main" noChangeAspect="1"/>
                   </wp:cNvGraphicFramePr>
@@ -14313,7 +14414,7 @@
         <w:spacing w:before="80" w:after="100" w:line="269" w:lineRule="auto"/>
       </w:pPr>
       <w:r>
-        <w:t>Hình 4.1 VD01 — kết quả 37, stack cuối [37], hoàn tất 9/9 token.</w:t>
+        <w:t>Hình 4.1 VD01 - kết quả 37, stack cuối [37], hoàn tất 9/9 token.</w:t>
       </w:r>
     </w:p>
     <w:p>
@@ -14339,7 +14440,7 @@
         <w:pStyle w:val="Heading3"/>
       </w:pPr>
       <w:r>
-        <w:t>4.3.2. Ví dụ 2 — VD02</w:t>
+        <w:t>4.3.2. Ví dụ 2 - VD02</w:t>
       </w:r>
     </w:p>
     <w:p>
@@ -14424,7 +14525,7 @@
                 <wp:inline distT="0" distB="0" distL="0" distR="0" wp14:anchorId="1BE541EE" wp14:editId="451EFA0A">
                   <wp:extent cx="5257800" cy="3943350"/>
                   <wp:effectExtent l="0" t="0" r="0" b="0"/>
-                  <wp:docPr id="2" name="Picture 2" descr="Ảnh A02: VD02 — kết quả 512, lũy thừa kết hợp phải."/>
+                  <wp:docPr id="2" name="Picture 2" descr="Ảnh A02: VD02 - kết quả 512, lũy thừa kết hợp phải."/>
                   <wp:cNvGraphicFramePr>
                     <a:graphicFrameLocks xmlns:a="http://schemas.openxmlformats.org/drawingml/2006/main" noChangeAspect="1"/>
                   </wp:cNvGraphicFramePr>
@@ -14466,7 +14567,7 @@
         <w:spacing w:before="80" w:after="100" w:line="269" w:lineRule="auto"/>
       </w:pPr>
       <w:r>
-        <w:t>Hình 4.2 VD02 — kết quả 512, lũy thừa kết hợp phải.</w:t>
+        <w:t>Hình 4.2 VD02 - kết quả 512, lũy thừa kết hợp phải.</w:t>
       </w:r>
     </w:p>
     <w:p>
@@ -14583,7 +14684,7 @@
                 <wp:inline distT="0" distB="0" distL="0" distR="0" wp14:anchorId="506B1C69" wp14:editId="382DCCA0">
                   <wp:extent cx="5257800" cy="3943350"/>
                   <wp:effectExtent l="0" t="0" r="0" b="0"/>
-                  <wp:docPr id="3" name="Picture 3" descr="Ảnh A03: TK01 — 8 − 3 = 5."/>
+                  <wp:docPr id="3" name="Picture 3" descr="Ảnh A03: TK01 - 8 − 3 = 5."/>
                   <wp:cNvGraphicFramePr>
                     <a:graphicFrameLocks xmlns:a="http://schemas.openxmlformats.org/drawingml/2006/main" noChangeAspect="1"/>
                   </wp:cNvGraphicFramePr>
@@ -14625,7 +14726,7 @@
         <w:spacing w:before="80" w:after="100" w:line="269" w:lineRule="auto"/>
       </w:pPr>
       <w:r>
-        <w:t>Hình 4.3 TK01 — 8 − 3 = 5.</w:t>
+        <w:t>Hình 4.3 TK01 - 8 − 3 = 5.</w:t>
       </w:r>
     </w:p>
     <w:p>
@@ -14728,7 +14829,7 @@
                 <wp:inline distT="0" distB="0" distL="0" distR="0" wp14:anchorId="500FDFDB" wp14:editId="0C0BA436">
                   <wp:extent cx="5257800" cy="3943350"/>
                   <wp:effectExtent l="0" t="0" r="0" b="0"/>
-                  <wp:docPr id="4" name="Picture 4" descr="Ảnh A04: TK02 — 3 − 8 = −5."/>
+                  <wp:docPr id="4" name="Picture 4" descr="Ảnh A04: TK02 - 3 − 8 = −5."/>
                   <wp:cNvGraphicFramePr>
                     <a:graphicFrameLocks xmlns:a="http://schemas.openxmlformats.org/drawingml/2006/main" noChangeAspect="1"/>
                   </wp:cNvGraphicFramePr>
@@ -14770,7 +14871,7 @@
         <w:spacing w:before="80" w:after="100" w:line="269" w:lineRule="auto"/>
       </w:pPr>
       <w:r>
-        <w:t>Hình 4.4 TK02 — 3 − 8 = −5.</w:t>
+        <w:t>Hình 4.4 TK02 - 3 − 8 = −5.</w:t>
       </w:r>
     </w:p>
     <w:p>
@@ -14913,7 +15014,7 @@
                 <wp:inline distT="0" distB="0" distL="0" distR="0" wp14:anchorId="35A76251" wp14:editId="717387D4">
                   <wp:extent cx="5257800" cy="3943350"/>
                   <wp:effectExtent l="0" t="0" r="0" b="0"/>
-                  <wp:docPr id="5" name="Picture 5" descr="Ảnh A05: BIEN01 — 7 / 2 = 3, chia nguyên cắt về 0."/>
+                  <wp:docPr id="5" name="Picture 5" descr="Ảnh A05: BIEN01 - 7 / 2 = 3, chia nguyên cắt về 0."/>
                   <wp:cNvGraphicFramePr>
                     <a:graphicFrameLocks xmlns:a="http://schemas.openxmlformats.org/drawingml/2006/main" noChangeAspect="1"/>
                   </wp:cNvGraphicFramePr>
@@ -14955,7 +15056,7 @@
         <w:spacing w:before="80" w:after="100" w:line="269" w:lineRule="auto"/>
       </w:pPr>
       <w:r>
-        <w:t>Hình 4.5 BIEN01 — 7 / 2 = 3, chia nguyên cắt về 0.</w:t>
+        <w:t>Hình 4.5 BIEN01 - 7 / 2 = 3, chia nguyên cắt về 0.</w:t>
       </w:r>
     </w:p>
     <w:p>
@@ -15058,7 +15159,7 @@
                 <wp:inline distT="0" distB="0" distL="0" distR="0" wp14:anchorId="782EB803" wp14:editId="33564FCA">
                   <wp:extent cx="5257800" cy="3943350"/>
                   <wp:effectExtent l="0" t="0" r="0" b="0"/>
-                  <wp:docPr id="6" name="Picture 6" descr="Ảnh A06: BIEN02 — 0 − 7 rồi chia 2 = −3."/>
+                  <wp:docPr id="6" name="Picture 6" descr="Ảnh A06: BIEN02 - 0 − 7 rồi chia 2 = −3."/>
                   <wp:cNvGraphicFramePr>
                     <a:graphicFrameLocks xmlns:a="http://schemas.openxmlformats.org/drawingml/2006/main" noChangeAspect="1"/>
                   </wp:cNvGraphicFramePr>
@@ -15100,7 +15201,7 @@
         <w:spacing w:before="80" w:after="100" w:line="269" w:lineRule="auto"/>
       </w:pPr>
       <w:r>
-        <w:t>Hình 4.6 BIEN02 — 0 − 7 rồi chia 2 = −3.</w:t>
+        <w:t>Hình 4.6 BIEN02 - 0 − 7 rồi chia 2 = −3.</w:t>
       </w:r>
     </w:p>
     <w:p>
@@ -15226,7 +15327,7 @@
                 <wp:inline distT="0" distB="0" distL="0" distR="0" wp14:anchorId="113FC63D" wp14:editId="56A4BB12">
                   <wp:extent cx="5257800" cy="3943350"/>
                   <wp:effectExtent l="0" t="0" r="0" b="0"/>
-                  <wp:docPr id="7" name="Picture 7" descr="Ảnh A07: BIEN03 — 100 ^ 0 = 1."/>
+                  <wp:docPr id="7" name="Picture 7" descr="Ảnh A07: BIEN03 - 100 ^ 0 = 1."/>
                   <wp:cNvGraphicFramePr>
                     <a:graphicFrameLocks xmlns:a="http://schemas.openxmlformats.org/drawingml/2006/main" noChangeAspect="1"/>
                   </wp:cNvGraphicFramePr>
@@ -15268,7 +15369,7 @@
         <w:spacing w:before="80" w:after="100" w:line="269" w:lineRule="auto"/>
       </w:pPr>
       <w:r>
-        <w:t>Hình 4.7 BIEN03 — 100 ^ 0 = 1.</w:t>
+        <w:t>Hình 4.7 BIEN03 - 100 ^ 0 = 1.</w:t>
       </w:r>
     </w:p>
     <w:p>
@@ -15295,7 +15396,7 @@
       </w:pPr>
       <w:bookmarkStart w:id="40" w:name="_Toc244294271"/>
       <w:r>
-        <w:t>4.6. Kiểm tra input không hợp lệ — LOI01</w:t>
+        <w:t>4.6. Kiểm tra input không hợp lệ - LOI01</w:t>
       </w:r>
       <w:bookmarkEnd w:id="40"/>
     </w:p>
@@ -15373,7 +15474,7 @@
                 <wp:inline distT="0" distB="0" distL="0" distR="0" wp14:anchorId="08A98220" wp14:editId="69F1BE45">
                   <wp:extent cx="5257800" cy="3943350"/>
                   <wp:effectExtent l="0" t="0" r="0" b="0"/>
-                  <wp:docPr id="8" name="Picture 8" descr="Ảnh A08: LOI01 — ứng dụng báo lỗi chia cho 0."/>
+                  <wp:docPr id="8" name="Picture 8" descr="Ảnh A08: LOI01 - ứng dụng báo lỗi chia cho 0."/>
                   <wp:cNvGraphicFramePr>
                     <a:graphicFrameLocks xmlns:a="http://schemas.openxmlformats.org/drawingml/2006/main" noChangeAspect="1"/>
                   </wp:cNvGraphicFramePr>
@@ -15415,7 +15516,7 @@
         <w:spacing w:before="80" w:after="100" w:line="269" w:lineRule="auto"/>
       </w:pPr>
       <w:r>
-        <w:t>Hình 4.8 LOI01 — ứng dụng báo lỗi chia cho 0.</w:t>
+        <w:t>Hình 4.8 LOI01 - ứng dụng báo lỗi chia cho 0.</w:t>
       </w:r>
     </w:p>
     <w:p>
@@ -15520,7 +15621,7 @@
                 <wp:inline distT="0" distB="0" distL="0" distR="0" wp14:anchorId="7A1D4331" wp14:editId="4FA79EBE">
                   <wp:extent cx="5257800" cy="3943350"/>
                   <wp:effectExtent l="0" t="0" r="0" b="0"/>
-                  <wp:docPr id="9" name="Picture 9" descr="Ảnh A09: Bộ kiểm thử DT067 — 12/12 PASS, 0 FAIL."/>
+                  <wp:docPr id="9" name="Picture 9" descr="Ảnh A09: Bộ kiểm thử DT067 - 12/12 PASS, 0 FAIL."/>
                   <wp:cNvGraphicFramePr>
                     <a:graphicFrameLocks xmlns:a="http://schemas.openxmlformats.org/drawingml/2006/main" noChangeAspect="1"/>
                   </wp:cNvGraphicFramePr>
@@ -15562,7 +15663,7 @@
         <w:spacing w:before="80" w:after="100" w:line="269" w:lineRule="auto"/>
       </w:pPr>
       <w:r>
-        <w:t>Hình 4.9 Bộ kiểm thử DT067 — 12/12 PASS, 0 FAIL.</w:t>
+        <w:t>Hình 4.9 Bộ kiểm thử DT067 - 12/12 PASS, 0 FAIL.</w:t>
       </w:r>
     </w:p>
     <w:p>
@@ -16642,7 +16743,7 @@
         <w:spacing w:before="80" w:after="100" w:line="269" w:lineRule="auto"/>
       </w:pPr>
       <w:r>
-        <w:t>Hình 4.10 A10 — Clone sạch tại SHA 17d0a9c68d8b915fa9d0327eecef36e57efa552a; unittest 5/5 và dashboard 12/12 PASS.</w:t>
+        <w:t>Hình 4.10 A10 - Clone sạch tại SHA 17d0a9c68d8b915fa9d0327eecef36e57efa552a; unittest 5/5 và dashboard 12/12 PASS.</w:t>
       </w:r>
     </w:p>
     <w:p>
@@ -16753,7 +16854,7 @@
         <w:spacing w:before="80" w:after="100" w:line="269" w:lineRule="auto"/>
       </w:pPr>
       <w:r>
-        <w:t>Hình 4.11 A11 — Repo GitHub CTDL_N24DCDT082 ở commit 17d0a9c68d8b915fa9d0327eecef36e57efa552a; ảnh chụp ngày 31/10/2026 ghi nhận trạng thái riêng tư trước khi repo được chuyển công khai.</w:t>
+        <w:t>Hình 4.11 A11 - Repo GitHub CTDL_N24DCDT082 ở commit 17d0a9c68d8b915fa9d0327eecef36e57efa552a; ảnh chụp ngày 31/10/2026 ghi nhận trạng thái riêng tư trước khi repo được chuyển công khai.</w:t>
       </w:r>
     </w:p>
     <w:p>
@@ -17039,7 +17140,7 @@
               <w:sdtContent/>
             </w:sdt>
             <w:r>
-              <w:t>C1 — Đặc tả</w:t>
+              <w:t>C1 - Đặc tả</w:t>
             </w:r>
           </w:p>
         </w:tc>
@@ -17140,7 +17241,7 @@
               <w:sdtContent/>
             </w:sdt>
             <w:r>
-              <w:t>C2 — Biểu diễn</w:t>
+              <w:t>C2 - Biểu diễn</w:t>
             </w:r>
           </w:p>
         </w:tc>
@@ -17224,7 +17325,7 @@
           </w:tcPr>
           <w:p>
             <w:r>
-              <w:t>C3 — Thuật toán/trace</w:t>
+              <w:t>C3 - Thuật toán/trace</w:t>
             </w:r>
           </w:p>
         </w:tc>
@@ -17266,7 +17367,7 @@
           </w:tcPr>
           <w:p>
             <w:r>
-              <w:t>C4 — Test/chi phí</w:t>
+              <w:t>C4 - Test/chi phí</w:t>
             </w:r>
           </w:p>
         </w:tc>
@@ -17309,7 +17410,7 @@
           <w:p>
             <w:r>
               <w:lastRenderedPageBreak/>
-              <w:t>C5 — Báo cáo/minh chứng</w:t>
+              <w:t>C5 - Báo cáo/minh chứng</w:t>
             </w:r>
           </w:p>
         </w:tc>
@@ -17351,7 +17452,7 @@
           </w:tcPr>
           <w:p>
             <w:r>
-              <w:t>C6 — Bảo vệ</w:t>
+              <w:t>C6 - Bảo vệ</w:t>
             </w:r>
           </w:p>
         </w:tc>
@@ -17709,7 +17810,7 @@
               <w:rPr>
                 <w:sz w:val="23"/>
               </w:rPr>
-              <w:t>VD01 — kết quả 37</w:t>
+              <w:t>VD01 - kết quả 37</w:t>
             </w:r>
           </w:p>
         </w:tc>
@@ -17720,7 +17821,7 @@
           </w:tcPr>
           <w:p>
             <w:r>
-              <w:t>Minh_chung/01_vi_du_1.png — chụp 30/10/2026 từ app.py hiện tại; commit C 17d0a9c68d8b915fa9d0327eecef36e57efa552a.</w:t>
+              <w:t>Minh_chung/01_vi_du_1.png - chụp 30/10/2026 từ app.py hiện tại; commit C 17d0a9c68d8b915fa9d0327eecef36e57efa552a.</w:t>
             </w:r>
           </w:p>
         </w:tc>
@@ -17760,7 +17861,7 @@
               <w:rPr>
                 <w:sz w:val="23"/>
               </w:rPr>
-              <w:t>VD02 — kết quả 512</w:t>
+              <w:t>VD02 - kết quả 512</w:t>
             </w:r>
           </w:p>
         </w:tc>
@@ -17771,7 +17872,7 @@
           </w:tcPr>
           <w:p>
             <w:r>
-              <w:t>Minh_chung/02_vi_du_2.png — chụp 30/10/2026 từ app.py hiện tại; commit C 17d0a9c68d8b915fa9d0327eecef36e57efa552a.</w:t>
+              <w:t>Minh_chung/02_vi_du_2.png - chụp 30/10/2026 từ app.py hiện tại; commit C 17d0a9c68d8b915fa9d0327eecef36e57efa552a.</w:t>
             </w:r>
           </w:p>
         </w:tc>
@@ -17811,7 +17912,7 @@
               <w:rPr>
                 <w:sz w:val="23"/>
               </w:rPr>
-              <w:t>TK01 — kết quả 5</w:t>
+              <w:t>TK01 - kết quả 5</w:t>
             </w:r>
           </w:p>
         </w:tc>
@@ -17822,7 +17923,7 @@
           </w:tcPr>
           <w:p>
             <w:r>
-              <w:t>Minh_chung/03_tu_thiet_ke_1.png — chụp 30/10/2026 từ app.py hiện tại; commit C 17d0a9c68d8b915fa9d0327eecef36e57efa552a.</w:t>
+              <w:t>Minh_chung/03_tu_thiet_ke_1.png - chụp 30/10/2026 từ app.py hiện tại; commit C 17d0a9c68d8b915fa9d0327eecef36e57efa552a.</w:t>
             </w:r>
           </w:p>
         </w:tc>
@@ -17862,7 +17963,7 @@
               <w:rPr>
                 <w:sz w:val="23"/>
               </w:rPr>
-              <w:t>TK02 — kết quả -5</w:t>
+              <w:t>TK02 - kết quả -5</w:t>
             </w:r>
           </w:p>
         </w:tc>
@@ -17873,7 +17974,7 @@
           </w:tcPr>
           <w:p>
             <w:r>
-              <w:t>Minh_chung/04_tu_thiet_ke_2.png — chụp 30/10/2026 từ app.py hiện tại; commit C 17d0a9c68d8b915fa9d0327eecef36e57efa552a.</w:t>
+              <w:t>Minh_chung/04_tu_thiet_ke_2.png - chụp 30/10/2026 từ app.py hiện tại; commit C 17d0a9c68d8b915fa9d0327eecef36e57efa552a.</w:t>
             </w:r>
           </w:p>
         </w:tc>
@@ -17913,7 +18014,7 @@
               <w:rPr>
                 <w:sz w:val="23"/>
               </w:rPr>
-              <w:t>BIEN01 — kết quả 3</w:t>
+              <w:t>BIEN01 - kết quả 3</w:t>
             </w:r>
           </w:p>
         </w:tc>
@@ -17924,7 +18025,7 @@
           </w:tcPr>
           <w:p>
             <w:r>
-              <w:t>Minh_chung/05_bien_1.png — chụp 30/10/2026 từ app.py hiện tại; commit C 17d0a9c68d8b915fa9d0327eecef36e57efa552a.</w:t>
+              <w:t>Minh_chung/05_bien_1.png - chụp 30/10/2026 từ app.py hiện tại; commit C 17d0a9c68d8b915fa9d0327eecef36e57efa552a.</w:t>
             </w:r>
           </w:p>
         </w:tc>
@@ -17964,7 +18065,7 @@
               <w:rPr>
                 <w:sz w:val="23"/>
               </w:rPr>
-              <w:t>BIEN02 — kết quả -3</w:t>
+              <w:t>BIEN02 - kết quả -3</w:t>
             </w:r>
           </w:p>
         </w:tc>
@@ -17975,7 +18076,7 @@
           </w:tcPr>
           <w:p>
             <w:r>
-              <w:t>Minh_chung/06_bien_2.png — chụp 30/10/2026 từ app.py hiện tại; commit C 17d0a9c68d8b915fa9d0327eecef36e57efa552a.</w:t>
+              <w:t>Minh_chung/06_bien_2.png - chụp 30/10/2026 từ app.py hiện tại; commit C 17d0a9c68d8b915fa9d0327eecef36e57efa552a.</w:t>
             </w:r>
           </w:p>
         </w:tc>
@@ -18015,7 +18116,7 @@
               <w:rPr>
                 <w:sz w:val="23"/>
               </w:rPr>
-              <w:t>BIEN03 — kết quả 1</w:t>
+              <w:t>BIEN03 - kết quả 1</w:t>
             </w:r>
           </w:p>
         </w:tc>
@@ -18026,7 +18127,7 @@
           </w:tcPr>
           <w:p>
             <w:r>
-              <w:t>Minh_chung/07_bien_3.png — chụp 30/10/2026 từ app.py hiện tại; commit C 17d0a9c68d8b915fa9d0327eecef36e57efa552a.</w:t>
+              <w:t>Minh_chung/07_bien_3.png - chụp 30/10/2026 từ app.py hiện tại; commit C 17d0a9c68d8b915fa9d0327eecef36e57efa552a.</w:t>
             </w:r>
           </w:p>
         </w:tc>
@@ -18066,7 +18167,7 @@
               <w:rPr>
                 <w:sz w:val="23"/>
               </w:rPr>
-              <w:t>LOI01 — chia cho 0</w:t>
+              <w:t>LOI01 - chia cho 0</w:t>
             </w:r>
           </w:p>
         </w:tc>
@@ -18077,7 +18178,7 @@
           </w:tcPr>
           <w:p>
             <w:r>
-              <w:t>Minh_chung/08_input_khong_hop_le.png — chụp 30/10/2026 từ app.py hiện tại; commit C 17d0a9c68d8b915fa9d0327eecef36e57efa552a.</w:t>
+              <w:t>Minh_chung/08_input_khong_hop_le.png - chụp 30/10/2026 từ app.py hiện tại; commit C 17d0a9c68d8b915fa9d0327eecef36e57efa552a.</w:t>
             </w:r>
           </w:p>
         </w:tc>
@@ -18117,7 +18218,7 @@
               <w:rPr>
                 <w:sz w:val="23"/>
               </w:rPr>
-              <w:t>TEST_ALL — 12/12 PASS</w:t>
+              <w:t>TEST_ALL - 12/12 PASS</w:t>
             </w:r>
           </w:p>
         </w:tc>
@@ -18128,7 +18229,7 @@
           </w:tcPr>
           <w:p>
             <w:r>
-              <w:t>Minh_chung/09_tong_ket_kiem_thu.png — chụp 30/10/2026 từ app.py hiện tại; commit C 17d0a9c68d8b915fa9d0327eecef36e57efa552a.</w:t>
+              <w:t>Minh_chung/09_tong_ket_kiem_thu.png - chụp 30/10/2026 từ app.py hiện tại; commit C 17d0a9c68d8b915fa9d0327eecef36e57efa552a.</w:t>
             </w:r>
           </w:p>
         </w:tc>
@@ -18179,7 +18280,7 @@
           </w:tcPr>
           <w:p>
             <w:r>
-              <w:t>Minh_chung/10_clone_sach_chay_lai.png — SHA S 17d0a9c68d8b915fa9d0327eecef36e57efa552a; unittest 5/5 và dashboard 12/12 PASS.</w:t>
+              <w:t>Minh_chung/10_clone_sach_chay_lai.png - SHA S 17d0a9c68d8b915fa9d0327eecef36e57efa552a; unittest 5/5 và dashboard 12/12 PASS.</w:t>
             </w:r>
           </w:p>
         </w:tc>
@@ -18231,7 +18332,7 @@
           </w:tcPr>
           <w:p>
             <w:r>
-              <w:t>Minh_chung/11_github_repo_commit.png — repo CTDL_N24DCDT082; commit 17d0a9c68d8b915fa9d0327eecef36e57efa552a; ảnh thật.</w:t>
+              <w:t>Minh_chung/11_github_repo_commit.png - repo CTDL_N24DCDT082; commit 17d0a9c68d8b915fa9d0327eecef36e57efa552a; ảnh thật.</w:t>
             </w:r>
           </w:p>
         </w:tc>

</xml_diff>